<commit_message>
Edit the file to remove sensitive information
</commit_message>
<xml_diff>
--- a/Project2/Final/RMSC5001 Projectv2.docx
+++ b/Project2/Final/RMSC5001 Projectv2.docx
@@ -1,6 +1,6 @@
 
 <file path=word/document.xml><?xml version="1.0" encoding="utf-8"?>
-<w:document xmlns:wpc="http://schemas.microsoft.com/office/word/2010/wordprocessingCanvas" xmlns:cx="http://schemas.microsoft.com/office/drawing/2014/chartex" xmlns:cx1="http://schemas.microsoft.com/office/drawing/2015/9/8/chartex" xmlns:cx2="http://schemas.microsoft.com/office/drawing/2015/10/21/chartex" xmlns:cx3="http://schemas.microsoft.com/office/drawing/2016/5/9/chartex" xmlns:cx4="http://schemas.microsoft.com/office/drawing/2016/5/10/chartex" xmlns:cx5="http://schemas.microsoft.com/office/drawing/2016/5/11/chartex" xmlns:mc="http://schemas.openxmlformats.org/markup-compatibility/2006" xmlns:o="urn:schemas-microsoft-com:office:office" xmlns:r="http://schemas.openxmlformats.org/officeDocument/2006/relationships" xmlns:m="http://schemas.openxmlformats.org/officeDocument/2006/math" xmlns:v="urn:schemas-microsoft-com:vml" xmlns:wp14="http://schemas.microsoft.com/office/word/2010/wordprocessingDrawing" xmlns:wp="http://schemas.openxmlformats.org/drawingml/2006/wordprocessingDrawing" xmlns:w10="urn:schemas-microsoft-com:office:word" xmlns:w="http://schemas.openxmlformats.org/wordprocessingml/2006/main" xmlns:w14="http://schemas.microsoft.com/office/word/2010/wordml" xmlns:w15="http://schemas.microsoft.com/office/word/2012/wordml" xmlns:w16se="http://schemas.microsoft.com/office/word/2015/wordml/symex" xmlns:wpg="http://schemas.microsoft.com/office/word/2010/wordprocessingGroup" xmlns:wpi="http://schemas.microsoft.com/office/word/2010/wordprocessingInk" xmlns:wne="http://schemas.microsoft.com/office/word/2006/wordml" xmlns:wps="http://schemas.microsoft.com/office/word/2010/wordprocessingShape" mc:Ignorable="w14 w15 w16se wp14">
+<w:document xmlns:wpc="http://schemas.microsoft.com/office/word/2010/wordprocessingCanvas" xmlns:cx="http://schemas.microsoft.com/office/drawing/2014/chartex" xmlns:cx1="http://schemas.microsoft.com/office/drawing/2015/9/8/chartex" xmlns:cx2="http://schemas.microsoft.com/office/drawing/2015/10/21/chartex" xmlns:cx3="http://schemas.microsoft.com/office/drawing/2016/5/9/chartex" xmlns:cx4="http://schemas.microsoft.com/office/drawing/2016/5/10/chartex" xmlns:cx5="http://schemas.microsoft.com/office/drawing/2016/5/11/chartex" xmlns:cx6="http://schemas.microsoft.com/office/drawing/2016/5/12/chartex" xmlns:cx7="http://schemas.microsoft.com/office/drawing/2016/5/13/chartex" xmlns:cx8="http://schemas.microsoft.com/office/drawing/2016/5/14/chartex" xmlns:mc="http://schemas.openxmlformats.org/markup-compatibility/2006" xmlns:aink="http://schemas.microsoft.com/office/drawing/2016/ink" xmlns:am3d="http://schemas.microsoft.com/office/drawing/2017/model3d" xmlns:o="urn:schemas-microsoft-com:office:office" xmlns:oel="http://schemas.microsoft.com/office/2019/extlst" xmlns:r="http://schemas.openxmlformats.org/officeDocument/2006/relationships" xmlns:m="http://schemas.openxmlformats.org/officeDocument/2006/math" xmlns:v="urn:schemas-microsoft-com:vml" xmlns:wp14="http://schemas.microsoft.com/office/word/2010/wordprocessingDrawing" xmlns:wp="http://schemas.openxmlformats.org/drawingml/2006/wordprocessingDrawing" xmlns:w10="urn:schemas-microsoft-com:office:word" xmlns:w="http://schemas.openxmlformats.org/wordprocessingml/2006/main" xmlns:w14="http://schemas.microsoft.com/office/word/2010/wordml" xmlns:w15="http://schemas.microsoft.com/office/word/2012/wordml" xmlns:w16cex="http://schemas.microsoft.com/office/word/2018/wordml/cex" xmlns:w16cid="http://schemas.microsoft.com/office/word/2016/wordml/cid" xmlns:w16="http://schemas.microsoft.com/office/word/2018/wordml" xmlns:w16du="http://schemas.microsoft.com/office/word/2023/wordml/word16du" xmlns:w16sdtdh="http://schemas.microsoft.com/office/word/2020/wordml/sdtdatahash" xmlns:w16sdtfl="http://schemas.microsoft.com/office/word/2024/wordml/sdtformatlock" xmlns:w16se="http://schemas.microsoft.com/office/word/2015/wordml/symex" xmlns:wpg="http://schemas.microsoft.com/office/word/2010/wordprocessingGroup" xmlns:wpi="http://schemas.microsoft.com/office/word/2010/wordprocessingInk" xmlns:wne="http://schemas.microsoft.com/office/word/2006/wordml" xmlns:wps="http://schemas.microsoft.com/office/word/2010/wordprocessingShape" mc:Ignorable="w14 w15 w16se w16cid w16 w16cex w16sdtdh w16sdtfl w16du wp14">
   <w:body>
     <w:p>
       <w:pPr>
@@ -118,7 +118,7 @@
           <w:sz w:val="44"/>
           <w:szCs w:val="56"/>
         </w:rPr>
-        <w:pict>
+        <w:pict w14:anchorId="7DC150EC">
           <v:shapetype id="_x0000_t75" coordsize="21600,21600" o:spt="75" o:preferrelative="t" path="m@4@5l@4@11@9@11@9@5xe" filled="f" stroked="f">
             <v:stroke joinstyle="miter"/>
             <v:formulas>
@@ -138,7 +138,7 @@
             <v:path o:extrusionok="f" gradientshapeok="t" o:connecttype="rect"/>
             <o:lock v:ext="edit" aspectratio="t"/>
           </v:shapetype>
-          <v:shape id="_x0000_i1025" type="#_x0000_t75" style="width:452pt;height:299.5pt">
+          <v:shape id="_x0000_i1025" type="#_x0000_t75" style="width:451.7pt;height:299.55pt">
             <v:imagedata r:id="rId8" o:title="cover"/>
           </v:shape>
         </w:pict>
@@ -187,25 +187,23 @@
           <w:sz w:val="28"/>
           <w:szCs w:val="20"/>
         </w:rPr>
-        <w:t xml:space="preserve">Ho Kam </w:t>
-      </w:r>
-      <w:proofErr w:type="spellStart"/>
+        <w:t>Ho Kam Chuen</w:t>
+      </w:r>
       <w:r>
         <w:rPr>
           <w:rFonts w:ascii="Arial" w:hAnsi="Arial" w:cs="Arial"/>
           <w:sz w:val="28"/>
           <w:szCs w:val="20"/>
         </w:rPr>
-        <w:t>Chuen</w:t>
-      </w:r>
-      <w:proofErr w:type="spellEnd"/>
+        <w:t xml:space="preserve"> Billy</w:t>
+      </w:r>
       <w:r>
         <w:rPr>
           <w:rFonts w:ascii="Arial" w:hAnsi="Arial" w:cs="Arial"/>
           <w:sz w:val="28"/>
           <w:szCs w:val="20"/>
         </w:rPr>
-        <w:t xml:space="preserve"> Billy</w:t>
+        <w:tab/>
       </w:r>
       <w:r>
         <w:rPr>
@@ -214,15 +212,50 @@
           <w:szCs w:val="20"/>
         </w:rPr>
         <w:tab/>
-      </w:r>
-      <w:r>
+        <w:t>(25%)</w:t>
+      </w:r>
+    </w:p>
+    <w:p>
+      <w:pPr>
+        <w:widowControl/>
         <w:rPr>
           <w:rFonts w:ascii="Arial" w:hAnsi="Arial" w:cs="Arial"/>
           <w:sz w:val="28"/>
           <w:szCs w:val="20"/>
         </w:rPr>
+      </w:pPr>
+      <w:r>
+        <w:rPr>
+          <w:rFonts w:ascii="Arial" w:hAnsi="Arial" w:cs="Arial"/>
+          <w:sz w:val="28"/>
+          <w:szCs w:val="20"/>
+        </w:rPr>
+        <w:t>Ng Man Hin</w:t>
+      </w:r>
+      <w:r>
+        <w:rPr>
+          <w:rFonts w:ascii="Arial" w:hAnsi="Arial" w:cs="Arial"/>
+          <w:sz w:val="28"/>
+          <w:szCs w:val="20"/>
+        </w:rPr>
+        <w:t xml:space="preserve"> Manning</w:t>
+      </w:r>
+      <w:r>
+        <w:rPr>
+          <w:rFonts w:ascii="Arial" w:hAnsi="Arial" w:cs="Arial"/>
+          <w:sz w:val="28"/>
+          <w:szCs w:val="20"/>
+        </w:rPr>
         <w:tab/>
-        <w:t>1155073968 (25%)</w:t>
+      </w:r>
+      <w:r>
+        <w:rPr>
+          <w:rFonts w:ascii="Arial" w:hAnsi="Arial" w:cs="Arial"/>
+          <w:sz w:val="28"/>
+          <w:szCs w:val="20"/>
+        </w:rPr>
+        <w:tab/>
+        <w:t>(25%)</w:t>
       </w:r>
     </w:p>
     <w:p>
@@ -240,7 +273,7 @@
           <w:sz w:val="28"/>
           <w:szCs w:val="20"/>
         </w:rPr>
-        <w:t>Ng Man Hin</w:t>
+        <w:t>Ng Tsz Ho</w:t>
       </w:r>
       <w:r>
         <w:rPr>
@@ -248,7 +281,7 @@
           <w:sz w:val="28"/>
           <w:szCs w:val="20"/>
         </w:rPr>
-        <w:t xml:space="preserve"> Manning</w:t>
+        <w:t xml:space="preserve"> Jeff</w:t>
       </w:r>
       <w:r>
         <w:rPr>
@@ -272,7 +305,7 @@
           <w:sz w:val="28"/>
           <w:szCs w:val="20"/>
         </w:rPr>
-        <w:t>1155074020</w:t>
+        <w:tab/>
       </w:r>
       <w:r>
         <w:rPr>
@@ -280,7 +313,8 @@
           <w:sz w:val="28"/>
           <w:szCs w:val="20"/>
         </w:rPr>
-        <w:t xml:space="preserve"> (25%)</w:t>
+        <w:tab/>
+        <w:t>(25%)</w:t>
       </w:r>
     </w:p>
     <w:p>
@@ -298,25 +332,23 @@
           <w:sz w:val="28"/>
           <w:szCs w:val="20"/>
         </w:rPr>
-        <w:t xml:space="preserve">Ng </w:t>
-      </w:r>
-      <w:proofErr w:type="spellStart"/>
+        <w:t>Yu Ka Yan</w:t>
+      </w:r>
       <w:r>
         <w:rPr>
           <w:rFonts w:ascii="Arial" w:hAnsi="Arial" w:cs="Arial"/>
           <w:sz w:val="28"/>
           <w:szCs w:val="20"/>
         </w:rPr>
-        <w:t>Tsz</w:t>
-      </w:r>
-      <w:proofErr w:type="spellEnd"/>
+        <w:t xml:space="preserve"> Melody</w:t>
+      </w:r>
       <w:r>
         <w:rPr>
           <w:rFonts w:ascii="Arial" w:hAnsi="Arial" w:cs="Arial"/>
           <w:sz w:val="28"/>
           <w:szCs w:val="20"/>
         </w:rPr>
-        <w:t xml:space="preserve"> Ho</w:t>
+        <w:t xml:space="preserve"> </w:t>
       </w:r>
       <w:r>
         <w:rPr>
@@ -324,7 +356,7 @@
           <w:sz w:val="28"/>
           <w:szCs w:val="20"/>
         </w:rPr>
-        <w:t xml:space="preserve"> Jeff</w:t>
+        <w:tab/>
       </w:r>
       <w:r>
         <w:rPr>
@@ -333,112 +365,7 @@
           <w:szCs w:val="20"/>
         </w:rPr>
         <w:tab/>
-      </w:r>
-      <w:r>
-        <w:rPr>
-          <w:rFonts w:ascii="Arial" w:hAnsi="Arial" w:cs="Arial"/>
-          <w:sz w:val="28"/>
-          <w:szCs w:val="20"/>
-        </w:rPr>
-        <w:tab/>
-      </w:r>
-      <w:r>
-        <w:rPr>
-          <w:rFonts w:ascii="Arial" w:hAnsi="Arial" w:cs="Arial"/>
-          <w:sz w:val="28"/>
-          <w:szCs w:val="20"/>
-        </w:rPr>
-        <w:tab/>
-      </w:r>
-      <w:r>
-        <w:rPr>
-          <w:rFonts w:ascii="Arial" w:hAnsi="Arial" w:cs="Arial"/>
-          <w:sz w:val="28"/>
-          <w:szCs w:val="20"/>
-        </w:rPr>
-        <w:tab/>
-      </w:r>
-      <w:r>
-        <w:rPr>
-          <w:rFonts w:ascii="Arial" w:hAnsi="Arial" w:cs="Arial"/>
-          <w:sz w:val="28"/>
-          <w:szCs w:val="20"/>
-        </w:rPr>
-        <w:t>1155071533</w:t>
-      </w:r>
-      <w:r>
-        <w:rPr>
-          <w:rFonts w:ascii="Arial" w:hAnsi="Arial" w:cs="Arial"/>
-          <w:sz w:val="28"/>
-          <w:szCs w:val="20"/>
-        </w:rPr>
-        <w:t xml:space="preserve"> (25%)</w:t>
-      </w:r>
-    </w:p>
-    <w:p>
-      <w:pPr>
-        <w:widowControl/>
-        <w:rPr>
-          <w:rFonts w:ascii="Arial" w:hAnsi="Arial" w:cs="Arial"/>
-          <w:sz w:val="28"/>
-          <w:szCs w:val="20"/>
-        </w:rPr>
-      </w:pPr>
-      <w:r>
-        <w:rPr>
-          <w:rFonts w:ascii="Arial" w:hAnsi="Arial" w:cs="Arial"/>
-          <w:sz w:val="28"/>
-          <w:szCs w:val="20"/>
-        </w:rPr>
-        <w:t>Yu Ka Yan</w:t>
-      </w:r>
-      <w:r>
-        <w:rPr>
-          <w:rFonts w:ascii="Arial" w:hAnsi="Arial" w:cs="Arial"/>
-          <w:sz w:val="28"/>
-          <w:szCs w:val="20"/>
-        </w:rPr>
-        <w:t xml:space="preserve"> Melody</w:t>
-      </w:r>
-      <w:r>
-        <w:rPr>
-          <w:rFonts w:ascii="Arial" w:hAnsi="Arial" w:cs="Arial"/>
-          <w:sz w:val="28"/>
-          <w:szCs w:val="20"/>
-        </w:rPr>
-        <w:t xml:space="preserve"> </w:t>
-      </w:r>
-      <w:r>
-        <w:rPr>
-          <w:rFonts w:ascii="Arial" w:hAnsi="Arial" w:cs="Arial"/>
-          <w:sz w:val="28"/>
-          <w:szCs w:val="20"/>
-        </w:rPr>
-        <w:tab/>
-      </w:r>
-      <w:r>
-        <w:rPr>
-          <w:rFonts w:ascii="Arial" w:hAnsi="Arial" w:cs="Arial"/>
-          <w:sz w:val="28"/>
-          <w:szCs w:val="20"/>
-        </w:rPr>
-        <w:tab/>
-      </w:r>
-      <w:r>
-        <w:rPr>
-          <w:rFonts w:ascii="Arial" w:hAnsi="Arial" w:cs="Arial"/>
-          <w:sz w:val="28"/>
-          <w:szCs w:val="20"/>
-        </w:rPr>
-        <w:t>1155074011</w:t>
-      </w:r>
-      <w:r>
-        <w:rPr>
-          <w:rFonts w:ascii="Arial" w:hAnsi="Arial" w:cs="Arial"/>
-          <w:sz w:val="28"/>
-          <w:szCs w:val="20"/>
-        </w:rPr>
-        <w:t xml:space="preserve"> (25%)</w:t>
+        <w:t>(25%)</w:t>
       </w:r>
     </w:p>
     <w:sdt>
@@ -2277,25 +2204,7 @@
           <w:sz w:val="22"/>
           <w:szCs w:val="24"/>
         </w:rPr>
-        <w:t xml:space="preserve"> and the resources (e.g. </w:t>
-      </w:r>
-      <w:proofErr w:type="spellStart"/>
-      <w:r>
-        <w:rPr>
-          <w:rFonts w:ascii="Arial" w:hAnsi="Arial" w:cs="Arial"/>
-          <w:sz w:val="22"/>
-          <w:szCs w:val="24"/>
-        </w:rPr>
-        <w:t>labour</w:t>
-      </w:r>
-      <w:proofErr w:type="spellEnd"/>
-      <w:r>
-        <w:rPr>
-          <w:rFonts w:ascii="Arial" w:hAnsi="Arial" w:cs="Arial"/>
-          <w:sz w:val="22"/>
-          <w:szCs w:val="24"/>
-        </w:rPr>
-        <w:t>/ customer database) for those banks are limited</w:t>
+        <w:t xml:space="preserve"> and the resources (e.g. labour/ customer database) for those banks are limited</w:t>
       </w:r>
       <w:r>
         <w:rPr>
@@ -2884,7 +2793,6 @@
               <w:bottom w:val="single" w:sz="4" w:space="0" w:color="auto"/>
               <w:right w:val="single" w:sz="4" w:space="0" w:color="auto"/>
             </w:tcBorders>
-            <w:shd w:val="clear" w:color="auto" w:fill="auto"/>
             <w:vAlign w:val="center"/>
             <w:hideMark/>
           </w:tcPr>
@@ -2893,7 +2801,7 @@
               <w:widowControl/>
               <w:jc w:val="center"/>
               <w:rPr>
-                <w:rFonts w:ascii="Arial" w:eastAsia="新細明體" w:hAnsi="Arial" w:cs="Arial"/>
+                <w:rFonts w:ascii="Arial" w:eastAsia="PMingLiU" w:hAnsi="Arial" w:cs="Arial"/>
                 <w:b/>
                 <w:bCs/>
                 <w:kern w:val="0"/>
@@ -2903,7 +2811,7 @@
             </w:pPr>
             <w:r>
               <w:rPr>
-                <w:rFonts w:ascii="Arial" w:eastAsia="新細明體" w:hAnsi="Arial" w:cs="Arial"/>
+                <w:rFonts w:ascii="Arial" w:eastAsia="PMingLiU" w:hAnsi="Arial" w:cs="Arial"/>
                 <w:b/>
                 <w:bCs/>
                 <w:kern w:val="0"/>
@@ -2923,7 +2831,6 @@
               <w:bottom w:val="single" w:sz="4" w:space="0" w:color="auto"/>
               <w:right w:val="single" w:sz="4" w:space="0" w:color="auto"/>
             </w:tcBorders>
-            <w:shd w:val="clear" w:color="auto" w:fill="auto"/>
             <w:vAlign w:val="center"/>
             <w:hideMark/>
           </w:tcPr>
@@ -2932,7 +2839,7 @@
               <w:widowControl/>
               <w:jc w:val="center"/>
               <w:rPr>
-                <w:rFonts w:ascii="Arial" w:eastAsia="新細明體" w:hAnsi="Arial" w:cs="Arial"/>
+                <w:rFonts w:ascii="Arial" w:eastAsia="PMingLiU" w:hAnsi="Arial" w:cs="Arial"/>
                 <w:b/>
                 <w:bCs/>
                 <w:kern w:val="0"/>
@@ -2942,7 +2849,7 @@
             </w:pPr>
             <w:r>
               <w:rPr>
-                <w:rFonts w:ascii="Arial" w:eastAsia="新細明體" w:hAnsi="Arial" w:cs="Arial"/>
+                <w:rFonts w:ascii="Arial" w:eastAsia="PMingLiU" w:hAnsi="Arial" w:cs="Arial"/>
                 <w:b/>
                 <w:bCs/>
                 <w:kern w:val="0"/>
@@ -2962,7 +2869,6 @@
               <w:bottom w:val="single" w:sz="4" w:space="0" w:color="auto"/>
               <w:right w:val="single" w:sz="4" w:space="0" w:color="auto"/>
             </w:tcBorders>
-            <w:shd w:val="clear" w:color="auto" w:fill="auto"/>
             <w:vAlign w:val="center"/>
             <w:hideMark/>
           </w:tcPr>
@@ -2971,7 +2877,7 @@
               <w:widowControl/>
               <w:jc w:val="center"/>
               <w:rPr>
-                <w:rFonts w:ascii="Arial" w:eastAsia="新細明體" w:hAnsi="Arial" w:cs="Arial"/>
+                <w:rFonts w:ascii="Arial" w:eastAsia="PMingLiU" w:hAnsi="Arial" w:cs="Arial"/>
                 <w:b/>
                 <w:bCs/>
                 <w:kern w:val="0"/>
@@ -2981,7 +2887,7 @@
             </w:pPr>
             <w:r>
               <w:rPr>
-                <w:rFonts w:ascii="Arial" w:eastAsia="新細明體" w:hAnsi="Arial" w:cs="Arial"/>
+                <w:rFonts w:ascii="Arial" w:eastAsia="PMingLiU" w:hAnsi="Arial" w:cs="Arial"/>
                 <w:b/>
                 <w:bCs/>
                 <w:kern w:val="0"/>
@@ -3006,7 +2912,6 @@
               <w:bottom w:val="single" w:sz="4" w:space="0" w:color="auto"/>
               <w:right w:val="single" w:sz="4" w:space="0" w:color="auto"/>
             </w:tcBorders>
-            <w:shd w:val="clear" w:color="auto" w:fill="auto"/>
             <w:vAlign w:val="center"/>
             <w:hideMark/>
           </w:tcPr>
@@ -3015,7 +2920,7 @@
               <w:widowControl/>
               <w:jc w:val="center"/>
               <w:rPr>
-                <w:rFonts w:ascii="Arial" w:eastAsia="新細明體" w:hAnsi="Arial" w:cs="Arial"/>
+                <w:rFonts w:ascii="Arial" w:eastAsia="PMingLiU" w:hAnsi="Arial" w:cs="Arial"/>
                 <w:kern w:val="0"/>
                 <w:sz w:val="22"/>
                 <w:szCs w:val="24"/>
@@ -3023,7 +2928,7 @@
             </w:pPr>
             <w:r>
               <w:rPr>
-                <w:rFonts w:ascii="Arial" w:eastAsia="新細明體" w:hAnsi="Arial" w:cs="Arial"/>
+                <w:rFonts w:ascii="Arial" w:eastAsia="PMingLiU" w:hAnsi="Arial" w:cs="Arial"/>
                 <w:kern w:val="0"/>
                 <w:sz w:val="22"/>
                 <w:szCs w:val="24"/>
@@ -3041,7 +2946,6 @@
               <w:bottom w:val="single" w:sz="4" w:space="0" w:color="auto"/>
               <w:right w:val="single" w:sz="4" w:space="0" w:color="auto"/>
             </w:tcBorders>
-            <w:shd w:val="clear" w:color="auto" w:fill="auto"/>
             <w:vAlign w:val="center"/>
             <w:hideMark/>
           </w:tcPr>
@@ -3050,7 +2954,7 @@
               <w:widowControl/>
               <w:jc w:val="center"/>
               <w:rPr>
-                <w:rFonts w:ascii="Arial" w:eastAsia="新細明體" w:hAnsi="Arial" w:cs="Arial"/>
+                <w:rFonts w:ascii="Arial" w:eastAsia="PMingLiU" w:hAnsi="Arial" w:cs="Arial"/>
                 <w:kern w:val="0"/>
                 <w:sz w:val="22"/>
                 <w:szCs w:val="24"/>
@@ -3058,7 +2962,7 @@
             </w:pPr>
             <w:r>
               <w:rPr>
-                <w:rFonts w:ascii="Arial" w:eastAsia="新細明體" w:hAnsi="Arial" w:cs="Arial"/>
+                <w:rFonts w:ascii="Arial" w:eastAsia="PMingLiU" w:hAnsi="Arial" w:cs="Arial"/>
                 <w:kern w:val="0"/>
                 <w:sz w:val="22"/>
                 <w:szCs w:val="24"/>
@@ -3076,7 +2980,6 @@
               <w:bottom w:val="single" w:sz="4" w:space="0" w:color="auto"/>
               <w:right w:val="single" w:sz="4" w:space="0" w:color="auto"/>
             </w:tcBorders>
-            <w:shd w:val="clear" w:color="auto" w:fill="auto"/>
             <w:vAlign w:val="center"/>
             <w:hideMark/>
           </w:tcPr>
@@ -3084,7 +2987,7 @@
             <w:pPr>
               <w:widowControl/>
               <w:rPr>
-                <w:rFonts w:ascii="Arial" w:eastAsia="新細明體" w:hAnsi="Arial" w:cs="Arial"/>
+                <w:rFonts w:ascii="Arial" w:eastAsia="PMingLiU" w:hAnsi="Arial" w:cs="Arial"/>
                 <w:kern w:val="0"/>
                 <w:sz w:val="22"/>
                 <w:szCs w:val="24"/>
@@ -3092,7 +2995,7 @@
             </w:pPr>
             <w:r>
               <w:rPr>
-                <w:rFonts w:ascii="Arial" w:eastAsia="新細明體" w:hAnsi="Arial" w:cs="Arial"/>
+                <w:rFonts w:ascii="Arial" w:eastAsia="PMingLiU" w:hAnsi="Arial" w:cs="Arial"/>
                 <w:kern w:val="0"/>
                 <w:sz w:val="22"/>
                 <w:szCs w:val="24"/>
@@ -3115,7 +3018,6 @@
               <w:bottom w:val="single" w:sz="4" w:space="0" w:color="auto"/>
               <w:right w:val="single" w:sz="4" w:space="0" w:color="auto"/>
             </w:tcBorders>
-            <w:shd w:val="clear" w:color="auto" w:fill="auto"/>
             <w:vAlign w:val="center"/>
             <w:hideMark/>
           </w:tcPr>
@@ -3124,7 +3026,7 @@
               <w:widowControl/>
               <w:jc w:val="center"/>
               <w:rPr>
-                <w:rFonts w:ascii="Arial" w:eastAsia="新細明體" w:hAnsi="Arial" w:cs="Arial"/>
+                <w:rFonts w:ascii="Arial" w:eastAsia="PMingLiU" w:hAnsi="Arial" w:cs="Arial"/>
                 <w:kern w:val="0"/>
                 <w:sz w:val="22"/>
                 <w:szCs w:val="24"/>
@@ -3132,7 +3034,7 @@
             </w:pPr>
             <w:r>
               <w:rPr>
-                <w:rFonts w:ascii="Arial" w:eastAsia="新細明體" w:hAnsi="Arial" w:cs="Arial"/>
+                <w:rFonts w:ascii="Arial" w:eastAsia="PMingLiU" w:hAnsi="Arial" w:cs="Arial"/>
                 <w:kern w:val="0"/>
                 <w:sz w:val="22"/>
                 <w:szCs w:val="24"/>
@@ -3150,7 +3052,6 @@
               <w:bottom w:val="single" w:sz="4" w:space="0" w:color="auto"/>
               <w:right w:val="single" w:sz="4" w:space="0" w:color="auto"/>
             </w:tcBorders>
-            <w:shd w:val="clear" w:color="auto" w:fill="auto"/>
             <w:vAlign w:val="center"/>
             <w:hideMark/>
           </w:tcPr>
@@ -3159,7 +3060,7 @@
               <w:widowControl/>
               <w:jc w:val="center"/>
               <w:rPr>
-                <w:rFonts w:ascii="Arial" w:eastAsia="新細明體" w:hAnsi="Arial" w:cs="Arial"/>
+                <w:rFonts w:ascii="Arial" w:eastAsia="PMingLiU" w:hAnsi="Arial" w:cs="Arial"/>
                 <w:kern w:val="0"/>
                 <w:sz w:val="22"/>
                 <w:szCs w:val="24"/>
@@ -3167,7 +3068,7 @@
             </w:pPr>
             <w:r>
               <w:rPr>
-                <w:rFonts w:ascii="Arial" w:eastAsia="新細明體" w:hAnsi="Arial" w:cs="Arial"/>
+                <w:rFonts w:ascii="Arial" w:eastAsia="PMingLiU" w:hAnsi="Arial" w:cs="Arial"/>
                 <w:kern w:val="0"/>
                 <w:sz w:val="22"/>
                 <w:szCs w:val="24"/>
@@ -3185,7 +3086,6 @@
               <w:bottom w:val="single" w:sz="4" w:space="0" w:color="auto"/>
               <w:right w:val="single" w:sz="4" w:space="0" w:color="auto"/>
             </w:tcBorders>
-            <w:shd w:val="clear" w:color="auto" w:fill="auto"/>
             <w:vAlign w:val="center"/>
             <w:hideMark/>
           </w:tcPr>
@@ -3193,7 +3093,7 @@
             <w:pPr>
               <w:widowControl/>
               <w:rPr>
-                <w:rFonts w:ascii="Arial" w:eastAsia="新細明體" w:hAnsi="Arial" w:cs="Arial"/>
+                <w:rFonts w:ascii="Arial" w:eastAsia="PMingLiU" w:hAnsi="Arial" w:cs="Arial"/>
                 <w:kern w:val="0"/>
                 <w:sz w:val="22"/>
                 <w:szCs w:val="24"/>
@@ -3201,7 +3101,7 @@
             </w:pPr>
             <w:r>
               <w:rPr>
-                <w:rFonts w:ascii="Arial" w:eastAsia="新細明體" w:hAnsi="Arial" w:cs="Arial"/>
+                <w:rFonts w:ascii="Arial" w:eastAsia="PMingLiU" w:hAnsi="Arial" w:cs="Arial"/>
                 <w:kern w:val="0"/>
                 <w:sz w:val="22"/>
                 <w:szCs w:val="24"/>
@@ -3210,7 +3110,7 @@
             </w:r>
             <w:r>
               <w:rPr>
-                <w:rFonts w:ascii="Arial" w:eastAsia="新細明體" w:hAnsi="Arial" w:cs="Arial"/>
+                <w:rFonts w:ascii="Arial" w:eastAsia="PMingLiU" w:hAnsi="Arial" w:cs="Arial"/>
                 <w:kern w:val="0"/>
                 <w:sz w:val="22"/>
                 <w:szCs w:val="24"/>
@@ -3219,7 +3119,7 @@
             </w:r>
             <w:r>
               <w:rPr>
-                <w:rFonts w:ascii="Arial" w:eastAsia="新細明體" w:hAnsi="Arial" w:cs="Arial"/>
+                <w:rFonts w:ascii="Arial" w:eastAsia="PMingLiU" w:hAnsi="Arial" w:cs="Arial"/>
                 <w:kern w:val="0"/>
                 <w:sz w:val="22"/>
                 <w:szCs w:val="24"/>
@@ -3228,7 +3128,7 @@
             </w:r>
             <w:r>
               <w:rPr>
-                <w:rFonts w:ascii="Arial" w:eastAsia="新細明體" w:hAnsi="Arial" w:cs="Arial"/>
+                <w:rFonts w:ascii="Arial" w:eastAsia="PMingLiU" w:hAnsi="Arial" w:cs="Arial"/>
                 <w:kern w:val="0"/>
                 <w:sz w:val="22"/>
                 <w:szCs w:val="24"/>
@@ -3251,7 +3151,6 @@
               <w:bottom w:val="single" w:sz="4" w:space="0" w:color="auto"/>
               <w:right w:val="single" w:sz="4" w:space="0" w:color="auto"/>
             </w:tcBorders>
-            <w:shd w:val="clear" w:color="auto" w:fill="auto"/>
             <w:vAlign w:val="center"/>
             <w:hideMark/>
           </w:tcPr>
@@ -3260,7 +3159,7 @@
               <w:widowControl/>
               <w:jc w:val="center"/>
               <w:rPr>
-                <w:rFonts w:ascii="Arial" w:eastAsia="新細明體" w:hAnsi="Arial" w:cs="Arial"/>
+                <w:rFonts w:ascii="Arial" w:eastAsia="PMingLiU" w:hAnsi="Arial" w:cs="Arial"/>
                 <w:kern w:val="0"/>
                 <w:sz w:val="22"/>
                 <w:szCs w:val="24"/>
@@ -3268,7 +3167,7 @@
             </w:pPr>
             <w:r>
               <w:rPr>
-                <w:rFonts w:ascii="Arial" w:eastAsia="新細明體" w:hAnsi="Arial" w:cs="Arial"/>
+                <w:rFonts w:ascii="Arial" w:eastAsia="PMingLiU" w:hAnsi="Arial" w:cs="Arial"/>
                 <w:kern w:val="0"/>
                 <w:sz w:val="22"/>
                 <w:szCs w:val="24"/>
@@ -3286,7 +3185,6 @@
               <w:bottom w:val="single" w:sz="4" w:space="0" w:color="auto"/>
               <w:right w:val="single" w:sz="4" w:space="0" w:color="auto"/>
             </w:tcBorders>
-            <w:shd w:val="clear" w:color="auto" w:fill="auto"/>
             <w:vAlign w:val="center"/>
             <w:hideMark/>
           </w:tcPr>
@@ -3295,7 +3193,7 @@
               <w:widowControl/>
               <w:jc w:val="center"/>
               <w:rPr>
-                <w:rFonts w:ascii="Arial" w:eastAsia="新細明體" w:hAnsi="Arial" w:cs="Arial"/>
+                <w:rFonts w:ascii="Arial" w:eastAsia="PMingLiU" w:hAnsi="Arial" w:cs="Arial"/>
                 <w:kern w:val="0"/>
                 <w:sz w:val="22"/>
                 <w:szCs w:val="24"/>
@@ -3303,7 +3201,7 @@
             </w:pPr>
             <w:r>
               <w:rPr>
-                <w:rFonts w:ascii="Arial" w:eastAsia="新細明體" w:hAnsi="Arial" w:cs="Arial"/>
+                <w:rFonts w:ascii="Arial" w:eastAsia="PMingLiU" w:hAnsi="Arial" w:cs="Arial"/>
                 <w:kern w:val="0"/>
                 <w:sz w:val="22"/>
                 <w:szCs w:val="24"/>
@@ -3321,7 +3219,6 @@
               <w:bottom w:val="single" w:sz="4" w:space="0" w:color="auto"/>
               <w:right w:val="single" w:sz="4" w:space="0" w:color="auto"/>
             </w:tcBorders>
-            <w:shd w:val="clear" w:color="auto" w:fill="auto"/>
             <w:vAlign w:val="center"/>
             <w:hideMark/>
           </w:tcPr>
@@ -3329,7 +3226,7 @@
             <w:pPr>
               <w:widowControl/>
               <w:rPr>
-                <w:rFonts w:ascii="Arial" w:eastAsia="新細明體" w:hAnsi="Arial" w:cs="Arial"/>
+                <w:rFonts w:ascii="Arial" w:eastAsia="PMingLiU" w:hAnsi="Arial" w:cs="Arial"/>
                 <w:kern w:val="0"/>
                 <w:sz w:val="22"/>
                 <w:szCs w:val="24"/>
@@ -3337,7 +3234,7 @@
             </w:pPr>
             <w:r>
               <w:rPr>
-                <w:rFonts w:ascii="Arial" w:eastAsia="新細明體" w:hAnsi="Arial" w:cs="Arial"/>
+                <w:rFonts w:ascii="Arial" w:eastAsia="PMingLiU" w:hAnsi="Arial" w:cs="Arial"/>
                 <w:kern w:val="0"/>
                 <w:sz w:val="22"/>
                 <w:szCs w:val="24"/>
@@ -3346,7 +3243,7 @@
             </w:r>
             <w:r>
               <w:rPr>
-                <w:rFonts w:ascii="Arial" w:eastAsia="新細明體" w:hAnsi="Arial" w:cs="Arial"/>
+                <w:rFonts w:ascii="Arial" w:eastAsia="PMingLiU" w:hAnsi="Arial" w:cs="Arial"/>
                 <w:kern w:val="0"/>
                 <w:sz w:val="22"/>
                 <w:szCs w:val="24"/>
@@ -3369,7 +3266,6 @@
               <w:bottom w:val="single" w:sz="4" w:space="0" w:color="auto"/>
               <w:right w:val="single" w:sz="4" w:space="0" w:color="auto"/>
             </w:tcBorders>
-            <w:shd w:val="clear" w:color="auto" w:fill="auto"/>
             <w:vAlign w:val="center"/>
             <w:hideMark/>
           </w:tcPr>
@@ -3378,7 +3274,7 @@
               <w:widowControl/>
               <w:jc w:val="center"/>
               <w:rPr>
-                <w:rFonts w:ascii="Arial" w:eastAsia="新細明體" w:hAnsi="Arial" w:cs="Arial"/>
+                <w:rFonts w:ascii="Arial" w:eastAsia="PMingLiU" w:hAnsi="Arial" w:cs="Arial"/>
                 <w:kern w:val="0"/>
                 <w:sz w:val="22"/>
                 <w:szCs w:val="24"/>
@@ -3386,7 +3282,7 @@
             </w:pPr>
             <w:r>
               <w:rPr>
-                <w:rFonts w:ascii="Arial" w:eastAsia="新細明體" w:hAnsi="Arial" w:cs="Arial"/>
+                <w:rFonts w:ascii="Arial" w:eastAsia="PMingLiU" w:hAnsi="Arial" w:cs="Arial"/>
                 <w:kern w:val="0"/>
                 <w:sz w:val="22"/>
                 <w:szCs w:val="24"/>
@@ -3404,7 +3300,6 @@
               <w:bottom w:val="single" w:sz="4" w:space="0" w:color="auto"/>
               <w:right w:val="single" w:sz="4" w:space="0" w:color="auto"/>
             </w:tcBorders>
-            <w:shd w:val="clear" w:color="auto" w:fill="auto"/>
             <w:vAlign w:val="center"/>
             <w:hideMark/>
           </w:tcPr>
@@ -3413,7 +3308,7 @@
               <w:widowControl/>
               <w:jc w:val="center"/>
               <w:rPr>
-                <w:rFonts w:ascii="Arial" w:eastAsia="新細明體" w:hAnsi="Arial" w:cs="Arial"/>
+                <w:rFonts w:ascii="Arial" w:eastAsia="PMingLiU" w:hAnsi="Arial" w:cs="Arial"/>
                 <w:kern w:val="0"/>
                 <w:sz w:val="22"/>
                 <w:szCs w:val="24"/>
@@ -3421,7 +3316,7 @@
             </w:pPr>
             <w:r>
               <w:rPr>
-                <w:rFonts w:ascii="Arial" w:eastAsia="新細明體" w:hAnsi="Arial" w:cs="Arial"/>
+                <w:rFonts w:ascii="Arial" w:eastAsia="PMingLiU" w:hAnsi="Arial" w:cs="Arial"/>
                 <w:kern w:val="0"/>
                 <w:sz w:val="22"/>
                 <w:szCs w:val="24"/>
@@ -3439,7 +3334,6 @@
               <w:bottom w:val="single" w:sz="4" w:space="0" w:color="auto"/>
               <w:right w:val="single" w:sz="4" w:space="0" w:color="auto"/>
             </w:tcBorders>
-            <w:shd w:val="clear" w:color="auto" w:fill="auto"/>
             <w:vAlign w:val="center"/>
             <w:hideMark/>
           </w:tcPr>
@@ -3447,7 +3341,7 @@
             <w:pPr>
               <w:widowControl/>
               <w:rPr>
-                <w:rFonts w:ascii="Arial" w:eastAsia="新細明體" w:hAnsi="Arial" w:cs="Arial"/>
+                <w:rFonts w:ascii="Arial" w:eastAsia="PMingLiU" w:hAnsi="Arial" w:cs="Arial"/>
                 <w:kern w:val="0"/>
                 <w:sz w:val="22"/>
                 <w:szCs w:val="24"/>
@@ -3455,7 +3349,7 @@
             </w:pPr>
             <w:r>
               <w:rPr>
-                <w:rFonts w:ascii="Arial" w:eastAsia="新細明體" w:hAnsi="Arial" w:cs="Arial"/>
+                <w:rFonts w:ascii="Arial" w:eastAsia="PMingLiU" w:hAnsi="Arial" w:cs="Arial"/>
                 <w:kern w:val="0"/>
                 <w:sz w:val="22"/>
                 <w:szCs w:val="24"/>
@@ -3478,7 +3372,6 @@
               <w:bottom w:val="single" w:sz="4" w:space="0" w:color="auto"/>
               <w:right w:val="single" w:sz="4" w:space="0" w:color="auto"/>
             </w:tcBorders>
-            <w:shd w:val="clear" w:color="auto" w:fill="auto"/>
             <w:vAlign w:val="center"/>
             <w:hideMark/>
           </w:tcPr>
@@ -3487,7 +3380,7 @@
               <w:widowControl/>
               <w:jc w:val="center"/>
               <w:rPr>
-                <w:rFonts w:ascii="Arial" w:eastAsia="新細明體" w:hAnsi="Arial" w:cs="Arial"/>
+                <w:rFonts w:ascii="Arial" w:eastAsia="PMingLiU" w:hAnsi="Arial" w:cs="Arial"/>
                 <w:kern w:val="0"/>
                 <w:sz w:val="22"/>
                 <w:szCs w:val="24"/>
@@ -3495,7 +3388,7 @@
             </w:pPr>
             <w:r>
               <w:rPr>
-                <w:rFonts w:ascii="Arial" w:eastAsia="新細明體" w:hAnsi="Arial" w:cs="Arial"/>
+                <w:rFonts w:ascii="Arial" w:eastAsia="PMingLiU" w:hAnsi="Arial" w:cs="Arial"/>
                 <w:kern w:val="0"/>
                 <w:sz w:val="22"/>
                 <w:szCs w:val="24"/>
@@ -3513,7 +3406,6 @@
               <w:bottom w:val="single" w:sz="4" w:space="0" w:color="auto"/>
               <w:right w:val="single" w:sz="4" w:space="0" w:color="auto"/>
             </w:tcBorders>
-            <w:shd w:val="clear" w:color="auto" w:fill="auto"/>
             <w:vAlign w:val="center"/>
             <w:hideMark/>
           </w:tcPr>
@@ -3522,7 +3414,7 @@
               <w:widowControl/>
               <w:jc w:val="center"/>
               <w:rPr>
-                <w:rFonts w:ascii="Arial" w:eastAsia="新細明體" w:hAnsi="Arial" w:cs="Arial"/>
+                <w:rFonts w:ascii="Arial" w:eastAsia="PMingLiU" w:hAnsi="Arial" w:cs="Arial"/>
                 <w:kern w:val="0"/>
                 <w:sz w:val="22"/>
                 <w:szCs w:val="24"/>
@@ -3530,7 +3422,7 @@
             </w:pPr>
             <w:r>
               <w:rPr>
-                <w:rFonts w:ascii="Arial" w:eastAsia="新細明體" w:hAnsi="Arial" w:cs="Arial"/>
+                <w:rFonts w:ascii="Arial" w:eastAsia="PMingLiU" w:hAnsi="Arial" w:cs="Arial"/>
                 <w:kern w:val="0"/>
                 <w:sz w:val="22"/>
                 <w:szCs w:val="24"/>
@@ -3548,7 +3440,6 @@
               <w:bottom w:val="single" w:sz="4" w:space="0" w:color="auto"/>
               <w:right w:val="single" w:sz="4" w:space="0" w:color="auto"/>
             </w:tcBorders>
-            <w:shd w:val="clear" w:color="auto" w:fill="auto"/>
             <w:vAlign w:val="center"/>
             <w:hideMark/>
           </w:tcPr>
@@ -3556,7 +3447,7 @@
             <w:pPr>
               <w:widowControl/>
               <w:rPr>
-                <w:rFonts w:ascii="Arial" w:eastAsia="新細明體" w:hAnsi="Arial" w:cs="Arial"/>
+                <w:rFonts w:ascii="Arial" w:eastAsia="PMingLiU" w:hAnsi="Arial" w:cs="Arial"/>
                 <w:kern w:val="0"/>
                 <w:sz w:val="22"/>
                 <w:szCs w:val="24"/>
@@ -3564,7 +3455,7 @@
             </w:pPr>
             <w:r>
               <w:rPr>
-                <w:rFonts w:ascii="Arial" w:eastAsia="新細明體" w:hAnsi="Arial" w:cs="Arial"/>
+                <w:rFonts w:ascii="Arial" w:eastAsia="PMingLiU" w:hAnsi="Arial" w:cs="Arial"/>
                 <w:kern w:val="0"/>
                 <w:sz w:val="22"/>
                 <w:szCs w:val="24"/>
@@ -3587,7 +3478,6 @@
               <w:bottom w:val="single" w:sz="4" w:space="0" w:color="auto"/>
               <w:right w:val="single" w:sz="4" w:space="0" w:color="auto"/>
             </w:tcBorders>
-            <w:shd w:val="clear" w:color="auto" w:fill="auto"/>
             <w:vAlign w:val="center"/>
             <w:hideMark/>
           </w:tcPr>
@@ -3596,7 +3486,7 @@
               <w:widowControl/>
               <w:jc w:val="center"/>
               <w:rPr>
-                <w:rFonts w:ascii="Arial" w:eastAsia="新細明體" w:hAnsi="Arial" w:cs="Arial"/>
+                <w:rFonts w:ascii="Arial" w:eastAsia="PMingLiU" w:hAnsi="Arial" w:cs="Arial"/>
                 <w:kern w:val="0"/>
                 <w:sz w:val="22"/>
                 <w:szCs w:val="24"/>
@@ -3604,7 +3494,7 @@
             </w:pPr>
             <w:r>
               <w:rPr>
-                <w:rFonts w:ascii="Arial" w:eastAsia="新細明體" w:hAnsi="Arial" w:cs="Arial"/>
+                <w:rFonts w:ascii="Arial" w:eastAsia="PMingLiU" w:hAnsi="Arial" w:cs="Arial"/>
                 <w:kern w:val="0"/>
                 <w:sz w:val="22"/>
                 <w:szCs w:val="24"/>
@@ -3622,7 +3512,6 @@
               <w:bottom w:val="single" w:sz="4" w:space="0" w:color="auto"/>
               <w:right w:val="single" w:sz="4" w:space="0" w:color="auto"/>
             </w:tcBorders>
-            <w:shd w:val="clear" w:color="auto" w:fill="auto"/>
             <w:vAlign w:val="center"/>
             <w:hideMark/>
           </w:tcPr>
@@ -3631,7 +3520,7 @@
               <w:widowControl/>
               <w:jc w:val="center"/>
               <w:rPr>
-                <w:rFonts w:ascii="Arial" w:eastAsia="新細明體" w:hAnsi="Arial" w:cs="Arial"/>
+                <w:rFonts w:ascii="Arial" w:eastAsia="PMingLiU" w:hAnsi="Arial" w:cs="Arial"/>
                 <w:kern w:val="0"/>
                 <w:sz w:val="22"/>
                 <w:szCs w:val="24"/>
@@ -3639,7 +3528,7 @@
             </w:pPr>
             <w:r>
               <w:rPr>
-                <w:rFonts w:ascii="Arial" w:eastAsia="新細明體" w:hAnsi="Arial" w:cs="Arial"/>
+                <w:rFonts w:ascii="Arial" w:eastAsia="PMingLiU" w:hAnsi="Arial" w:cs="Arial"/>
                 <w:kern w:val="0"/>
                 <w:sz w:val="22"/>
                 <w:szCs w:val="24"/>
@@ -3657,7 +3546,6 @@
               <w:bottom w:val="single" w:sz="4" w:space="0" w:color="auto"/>
               <w:right w:val="single" w:sz="4" w:space="0" w:color="auto"/>
             </w:tcBorders>
-            <w:shd w:val="clear" w:color="auto" w:fill="auto"/>
             <w:vAlign w:val="center"/>
             <w:hideMark/>
           </w:tcPr>
@@ -3665,7 +3553,7 @@
             <w:pPr>
               <w:widowControl/>
               <w:rPr>
-                <w:rFonts w:ascii="Arial" w:eastAsia="新細明體" w:hAnsi="Arial" w:cs="Arial"/>
+                <w:rFonts w:ascii="Arial" w:eastAsia="PMingLiU" w:hAnsi="Arial" w:cs="Arial"/>
                 <w:kern w:val="0"/>
                 <w:sz w:val="22"/>
                 <w:szCs w:val="24"/>
@@ -3673,7 +3561,7 @@
             </w:pPr>
             <w:r>
               <w:rPr>
-                <w:rFonts w:ascii="Arial" w:eastAsia="新細明體" w:hAnsi="Arial" w:cs="Arial"/>
+                <w:rFonts w:ascii="Arial" w:eastAsia="PMingLiU" w:hAnsi="Arial" w:cs="Arial"/>
                 <w:kern w:val="0"/>
                 <w:sz w:val="22"/>
                 <w:szCs w:val="24"/>
@@ -3696,7 +3584,6 @@
               <w:bottom w:val="single" w:sz="4" w:space="0" w:color="auto"/>
               <w:right w:val="single" w:sz="4" w:space="0" w:color="auto"/>
             </w:tcBorders>
-            <w:shd w:val="clear" w:color="auto" w:fill="auto"/>
             <w:vAlign w:val="center"/>
             <w:hideMark/>
           </w:tcPr>
@@ -3705,7 +3592,7 @@
               <w:widowControl/>
               <w:jc w:val="center"/>
               <w:rPr>
-                <w:rFonts w:ascii="Arial" w:eastAsia="新細明體" w:hAnsi="Arial" w:cs="Arial"/>
+                <w:rFonts w:ascii="Arial" w:eastAsia="PMingLiU" w:hAnsi="Arial" w:cs="Arial"/>
                 <w:kern w:val="0"/>
                 <w:sz w:val="22"/>
                 <w:szCs w:val="24"/>
@@ -3713,7 +3600,7 @@
             </w:pPr>
             <w:r>
               <w:rPr>
-                <w:rFonts w:ascii="Arial" w:eastAsia="新細明體" w:hAnsi="Arial" w:cs="Arial"/>
+                <w:rFonts w:ascii="Arial" w:eastAsia="PMingLiU" w:hAnsi="Arial" w:cs="Arial"/>
                 <w:kern w:val="0"/>
                 <w:sz w:val="22"/>
                 <w:szCs w:val="24"/>
@@ -3731,7 +3618,6 @@
               <w:bottom w:val="single" w:sz="4" w:space="0" w:color="auto"/>
               <w:right w:val="single" w:sz="4" w:space="0" w:color="auto"/>
             </w:tcBorders>
-            <w:shd w:val="clear" w:color="auto" w:fill="auto"/>
             <w:vAlign w:val="center"/>
             <w:hideMark/>
           </w:tcPr>
@@ -3740,7 +3626,7 @@
               <w:widowControl/>
               <w:jc w:val="center"/>
               <w:rPr>
-                <w:rFonts w:ascii="Arial" w:eastAsia="新細明體" w:hAnsi="Arial" w:cs="Arial"/>
+                <w:rFonts w:ascii="Arial" w:eastAsia="PMingLiU" w:hAnsi="Arial" w:cs="Arial"/>
                 <w:kern w:val="0"/>
                 <w:sz w:val="22"/>
                 <w:szCs w:val="24"/>
@@ -3748,7 +3634,7 @@
             </w:pPr>
             <w:r>
               <w:rPr>
-                <w:rFonts w:ascii="Arial" w:eastAsia="新細明體" w:hAnsi="Arial" w:cs="Arial"/>
+                <w:rFonts w:ascii="Arial" w:eastAsia="PMingLiU" w:hAnsi="Arial" w:cs="Arial"/>
                 <w:kern w:val="0"/>
                 <w:sz w:val="22"/>
                 <w:szCs w:val="24"/>
@@ -3766,7 +3652,6 @@
               <w:bottom w:val="single" w:sz="4" w:space="0" w:color="auto"/>
               <w:right w:val="single" w:sz="4" w:space="0" w:color="auto"/>
             </w:tcBorders>
-            <w:shd w:val="clear" w:color="auto" w:fill="auto"/>
             <w:vAlign w:val="center"/>
             <w:hideMark/>
           </w:tcPr>
@@ -3774,7 +3659,7 @@
             <w:pPr>
               <w:widowControl/>
               <w:rPr>
-                <w:rFonts w:ascii="Arial" w:eastAsia="新細明體" w:hAnsi="Arial" w:cs="Arial"/>
+                <w:rFonts w:ascii="Arial" w:eastAsia="PMingLiU" w:hAnsi="Arial" w:cs="Arial"/>
                 <w:kern w:val="0"/>
                 <w:sz w:val="22"/>
                 <w:szCs w:val="24"/>
@@ -3782,7 +3667,7 @@
             </w:pPr>
             <w:r>
               <w:rPr>
-                <w:rFonts w:ascii="Arial" w:eastAsia="新細明體" w:hAnsi="Arial" w:cs="Arial"/>
+                <w:rFonts w:ascii="Arial" w:eastAsia="PMingLiU" w:hAnsi="Arial" w:cs="Arial"/>
                 <w:kern w:val="0"/>
                 <w:sz w:val="22"/>
                 <w:szCs w:val="24"/>
@@ -3805,7 +3690,6 @@
               <w:bottom w:val="single" w:sz="4" w:space="0" w:color="auto"/>
               <w:right w:val="single" w:sz="4" w:space="0" w:color="auto"/>
             </w:tcBorders>
-            <w:shd w:val="clear" w:color="auto" w:fill="auto"/>
             <w:vAlign w:val="center"/>
             <w:hideMark/>
           </w:tcPr>
@@ -3814,7 +3698,7 @@
               <w:widowControl/>
               <w:jc w:val="center"/>
               <w:rPr>
-                <w:rFonts w:ascii="Arial" w:eastAsia="新細明體" w:hAnsi="Arial" w:cs="Arial"/>
+                <w:rFonts w:ascii="Arial" w:eastAsia="PMingLiU" w:hAnsi="Arial" w:cs="Arial"/>
                 <w:kern w:val="0"/>
                 <w:sz w:val="22"/>
                 <w:szCs w:val="24"/>
@@ -3822,7 +3706,7 @@
             </w:pPr>
             <w:r>
               <w:rPr>
-                <w:rFonts w:ascii="Arial" w:eastAsia="新細明體" w:hAnsi="Arial" w:cs="Arial"/>
+                <w:rFonts w:ascii="Arial" w:eastAsia="PMingLiU" w:hAnsi="Arial" w:cs="Arial"/>
                 <w:kern w:val="0"/>
                 <w:sz w:val="22"/>
                 <w:szCs w:val="24"/>
@@ -3840,7 +3724,6 @@
               <w:bottom w:val="single" w:sz="4" w:space="0" w:color="auto"/>
               <w:right w:val="single" w:sz="4" w:space="0" w:color="auto"/>
             </w:tcBorders>
-            <w:shd w:val="clear" w:color="auto" w:fill="auto"/>
             <w:vAlign w:val="center"/>
             <w:hideMark/>
           </w:tcPr>
@@ -3849,7 +3732,7 @@
               <w:widowControl/>
               <w:jc w:val="center"/>
               <w:rPr>
-                <w:rFonts w:ascii="Arial" w:eastAsia="新細明體" w:hAnsi="Arial" w:cs="Arial"/>
+                <w:rFonts w:ascii="Arial" w:eastAsia="PMingLiU" w:hAnsi="Arial" w:cs="Arial"/>
                 <w:kern w:val="0"/>
                 <w:sz w:val="22"/>
                 <w:szCs w:val="24"/>
@@ -3857,7 +3740,7 @@
             </w:pPr>
             <w:r>
               <w:rPr>
-                <w:rFonts w:ascii="Arial" w:eastAsia="新細明體" w:hAnsi="Arial" w:cs="Arial"/>
+                <w:rFonts w:ascii="Arial" w:eastAsia="PMingLiU" w:hAnsi="Arial" w:cs="Arial"/>
                 <w:kern w:val="0"/>
                 <w:sz w:val="22"/>
                 <w:szCs w:val="24"/>
@@ -3875,7 +3758,6 @@
               <w:bottom w:val="single" w:sz="4" w:space="0" w:color="auto"/>
               <w:right w:val="single" w:sz="4" w:space="0" w:color="auto"/>
             </w:tcBorders>
-            <w:shd w:val="clear" w:color="auto" w:fill="auto"/>
             <w:vAlign w:val="center"/>
             <w:hideMark/>
           </w:tcPr>
@@ -3883,7 +3765,7 @@
             <w:pPr>
               <w:widowControl/>
               <w:rPr>
-                <w:rFonts w:ascii="Arial" w:eastAsia="新細明體" w:hAnsi="Arial" w:cs="Arial"/>
+                <w:rFonts w:ascii="Arial" w:eastAsia="PMingLiU" w:hAnsi="Arial" w:cs="Arial"/>
                 <w:kern w:val="0"/>
                 <w:sz w:val="22"/>
                 <w:szCs w:val="24"/>
@@ -3891,7 +3773,7 @@
             </w:pPr>
             <w:r>
               <w:rPr>
-                <w:rFonts w:ascii="Arial" w:eastAsia="新細明體" w:hAnsi="Arial" w:cs="Arial"/>
+                <w:rFonts w:ascii="Arial" w:eastAsia="PMingLiU" w:hAnsi="Arial" w:cs="Arial"/>
                 <w:kern w:val="0"/>
                 <w:sz w:val="22"/>
                 <w:szCs w:val="24"/>
@@ -3914,7 +3796,6 @@
               <w:bottom w:val="single" w:sz="4" w:space="0" w:color="auto"/>
               <w:right w:val="single" w:sz="4" w:space="0" w:color="auto"/>
             </w:tcBorders>
-            <w:shd w:val="clear" w:color="auto" w:fill="auto"/>
             <w:vAlign w:val="center"/>
             <w:hideMark/>
           </w:tcPr>
@@ -3923,7 +3804,7 @@
               <w:widowControl/>
               <w:jc w:val="center"/>
               <w:rPr>
-                <w:rFonts w:ascii="Arial" w:eastAsia="新細明體" w:hAnsi="Arial" w:cs="Arial"/>
+                <w:rFonts w:ascii="Arial" w:eastAsia="PMingLiU" w:hAnsi="Arial" w:cs="Arial"/>
                 <w:kern w:val="0"/>
                 <w:sz w:val="22"/>
                 <w:szCs w:val="24"/>
@@ -3931,7 +3812,7 @@
             </w:pPr>
             <w:r>
               <w:rPr>
-                <w:rFonts w:ascii="Arial" w:eastAsia="新細明體" w:hAnsi="Arial" w:cs="Arial"/>
+                <w:rFonts w:ascii="Arial" w:eastAsia="PMingLiU" w:hAnsi="Arial" w:cs="Arial"/>
                 <w:kern w:val="0"/>
                 <w:sz w:val="22"/>
                 <w:szCs w:val="24"/>
@@ -3949,7 +3830,6 @@
               <w:bottom w:val="single" w:sz="4" w:space="0" w:color="auto"/>
               <w:right w:val="single" w:sz="4" w:space="0" w:color="auto"/>
             </w:tcBorders>
-            <w:shd w:val="clear" w:color="auto" w:fill="auto"/>
             <w:vAlign w:val="center"/>
             <w:hideMark/>
           </w:tcPr>
@@ -3958,7 +3838,7 @@
               <w:widowControl/>
               <w:jc w:val="center"/>
               <w:rPr>
-                <w:rFonts w:ascii="Arial" w:eastAsia="新細明體" w:hAnsi="Arial" w:cs="Arial"/>
+                <w:rFonts w:ascii="Arial" w:eastAsia="PMingLiU" w:hAnsi="Arial" w:cs="Arial"/>
                 <w:kern w:val="0"/>
                 <w:sz w:val="22"/>
                 <w:szCs w:val="24"/>
@@ -3966,7 +3846,7 @@
             </w:pPr>
             <w:r>
               <w:rPr>
-                <w:rFonts w:ascii="Arial" w:eastAsia="新細明體" w:hAnsi="Arial" w:cs="Arial"/>
+                <w:rFonts w:ascii="Arial" w:eastAsia="PMingLiU" w:hAnsi="Arial" w:cs="Arial"/>
                 <w:kern w:val="0"/>
                 <w:sz w:val="22"/>
                 <w:szCs w:val="24"/>
@@ -3975,7 +3855,7 @@
             </w:r>
             <w:r>
               <w:rPr>
-                <w:rFonts w:ascii="Arial" w:eastAsia="新細明體" w:hAnsi="Arial" w:cs="Arial"/>
+                <w:rFonts w:ascii="Arial" w:eastAsia="PMingLiU" w:hAnsi="Arial" w:cs="Arial"/>
                 <w:kern w:val="0"/>
                 <w:sz w:val="22"/>
                 <w:szCs w:val="24"/>
@@ -3993,7 +3873,6 @@
               <w:bottom w:val="single" w:sz="4" w:space="0" w:color="auto"/>
               <w:right w:val="single" w:sz="4" w:space="0" w:color="auto"/>
             </w:tcBorders>
-            <w:shd w:val="clear" w:color="auto" w:fill="auto"/>
             <w:vAlign w:val="center"/>
             <w:hideMark/>
           </w:tcPr>
@@ -4001,7 +3880,7 @@
             <w:pPr>
               <w:widowControl/>
               <w:rPr>
-                <w:rFonts w:ascii="Arial" w:eastAsia="新細明體" w:hAnsi="Arial" w:cs="Arial"/>
+                <w:rFonts w:ascii="Arial" w:eastAsia="PMingLiU" w:hAnsi="Arial" w:cs="Arial"/>
                 <w:kern w:val="0"/>
                 <w:sz w:val="22"/>
                 <w:szCs w:val="24"/>
@@ -4009,7 +3888,7 @@
             </w:pPr>
             <w:r>
               <w:rPr>
-                <w:rFonts w:ascii="Arial" w:eastAsia="新細明體" w:hAnsi="Arial" w:cs="Arial"/>
+                <w:rFonts w:ascii="Arial" w:eastAsia="PMingLiU" w:hAnsi="Arial" w:cs="Arial"/>
                 <w:kern w:val="0"/>
                 <w:sz w:val="22"/>
                 <w:szCs w:val="24"/>
@@ -4032,7 +3911,6 @@
               <w:bottom w:val="single" w:sz="4" w:space="0" w:color="auto"/>
               <w:right w:val="single" w:sz="4" w:space="0" w:color="auto"/>
             </w:tcBorders>
-            <w:shd w:val="clear" w:color="auto" w:fill="auto"/>
             <w:vAlign w:val="center"/>
             <w:hideMark/>
           </w:tcPr>
@@ -4041,7 +3919,7 @@
               <w:widowControl/>
               <w:jc w:val="center"/>
               <w:rPr>
-                <w:rFonts w:ascii="Arial" w:eastAsia="新細明體" w:hAnsi="Arial" w:cs="Arial"/>
+                <w:rFonts w:ascii="Arial" w:eastAsia="PMingLiU" w:hAnsi="Arial" w:cs="Arial"/>
                 <w:kern w:val="0"/>
                 <w:sz w:val="22"/>
                 <w:szCs w:val="24"/>
@@ -4049,7 +3927,7 @@
             </w:pPr>
             <w:r>
               <w:rPr>
-                <w:rFonts w:ascii="Arial" w:eastAsia="新細明體" w:hAnsi="Arial" w:cs="Arial"/>
+                <w:rFonts w:ascii="Arial" w:eastAsia="PMingLiU" w:hAnsi="Arial" w:cs="Arial"/>
                 <w:kern w:val="0"/>
                 <w:sz w:val="22"/>
                 <w:szCs w:val="24"/>
@@ -4067,7 +3945,6 @@
               <w:bottom w:val="single" w:sz="4" w:space="0" w:color="auto"/>
               <w:right w:val="single" w:sz="4" w:space="0" w:color="auto"/>
             </w:tcBorders>
-            <w:shd w:val="clear" w:color="auto" w:fill="auto"/>
             <w:vAlign w:val="center"/>
             <w:hideMark/>
           </w:tcPr>
@@ -4076,23 +3953,21 @@
               <w:widowControl/>
               <w:jc w:val="center"/>
               <w:rPr>
-                <w:rFonts w:ascii="Arial" w:eastAsia="新細明體" w:hAnsi="Arial" w:cs="Arial"/>
+                <w:rFonts w:ascii="Arial" w:eastAsia="PMingLiU" w:hAnsi="Arial" w:cs="Arial"/>
                 <w:kern w:val="0"/>
                 <w:sz w:val="22"/>
                 <w:szCs w:val="24"/>
               </w:rPr>
             </w:pPr>
-            <w:proofErr w:type="spellStart"/>
-            <w:r>
-              <w:rPr>
-                <w:rFonts w:ascii="Arial" w:eastAsia="新細明體" w:hAnsi="Arial" w:cs="Arial"/>
+            <w:r>
+              <w:rPr>
+                <w:rFonts w:ascii="Arial" w:eastAsia="PMingLiU" w:hAnsi="Arial" w:cs="Arial"/>
                 <w:kern w:val="0"/>
                 <w:sz w:val="22"/>
                 <w:szCs w:val="24"/>
               </w:rPr>
               <w:t>day_of_week</w:t>
             </w:r>
-            <w:proofErr w:type="spellEnd"/>
           </w:p>
         </w:tc>
         <w:tc>
@@ -4104,7 +3979,6 @@
               <w:bottom w:val="single" w:sz="4" w:space="0" w:color="auto"/>
               <w:right w:val="single" w:sz="4" w:space="0" w:color="auto"/>
             </w:tcBorders>
-            <w:shd w:val="clear" w:color="auto" w:fill="auto"/>
             <w:vAlign w:val="center"/>
             <w:hideMark/>
           </w:tcPr>
@@ -4112,7 +3986,7 @@
             <w:pPr>
               <w:widowControl/>
               <w:rPr>
-                <w:rFonts w:ascii="Arial" w:eastAsia="新細明體" w:hAnsi="Arial" w:cs="Arial"/>
+                <w:rFonts w:ascii="Arial" w:eastAsia="PMingLiU" w:hAnsi="Arial" w:cs="Arial"/>
                 <w:kern w:val="0"/>
                 <w:sz w:val="22"/>
                 <w:szCs w:val="24"/>
@@ -4120,7 +3994,7 @@
             </w:pPr>
             <w:r>
               <w:rPr>
-                <w:rFonts w:ascii="Arial" w:eastAsia="新細明體" w:hAnsi="Arial" w:cs="Arial"/>
+                <w:rFonts w:ascii="Arial" w:eastAsia="PMingLiU" w:hAnsi="Arial" w:cs="Arial"/>
                 <w:kern w:val="0"/>
                 <w:sz w:val="22"/>
                 <w:szCs w:val="24"/>
@@ -4143,7 +4017,6 @@
               <w:bottom w:val="single" w:sz="4" w:space="0" w:color="auto"/>
               <w:right w:val="single" w:sz="4" w:space="0" w:color="auto"/>
             </w:tcBorders>
-            <w:shd w:val="clear" w:color="auto" w:fill="auto"/>
             <w:vAlign w:val="center"/>
             <w:hideMark/>
           </w:tcPr>
@@ -4152,7 +4025,7 @@
               <w:widowControl/>
               <w:jc w:val="center"/>
               <w:rPr>
-                <w:rFonts w:ascii="Arial" w:eastAsia="新細明體" w:hAnsi="Arial" w:cs="Arial"/>
+                <w:rFonts w:ascii="Arial" w:eastAsia="PMingLiU" w:hAnsi="Arial" w:cs="Arial"/>
                 <w:kern w:val="0"/>
                 <w:sz w:val="22"/>
                 <w:szCs w:val="24"/>
@@ -4160,7 +4033,7 @@
             </w:pPr>
             <w:r>
               <w:rPr>
-                <w:rFonts w:ascii="Arial" w:eastAsia="新細明體" w:hAnsi="Arial" w:cs="Arial"/>
+                <w:rFonts w:ascii="Arial" w:eastAsia="PMingLiU" w:hAnsi="Arial" w:cs="Arial"/>
                 <w:kern w:val="0"/>
                 <w:sz w:val="22"/>
                 <w:szCs w:val="24"/>
@@ -4178,7 +4051,6 @@
               <w:bottom w:val="single" w:sz="4" w:space="0" w:color="auto"/>
               <w:right w:val="single" w:sz="4" w:space="0" w:color="auto"/>
             </w:tcBorders>
-            <w:shd w:val="clear" w:color="auto" w:fill="auto"/>
             <w:vAlign w:val="center"/>
             <w:hideMark/>
           </w:tcPr>
@@ -4187,7 +4059,7 @@
               <w:widowControl/>
               <w:jc w:val="center"/>
               <w:rPr>
-                <w:rFonts w:ascii="Arial" w:eastAsia="新細明體" w:hAnsi="Arial" w:cs="Arial"/>
+                <w:rFonts w:ascii="Arial" w:eastAsia="PMingLiU" w:hAnsi="Arial" w:cs="Arial"/>
                 <w:kern w:val="0"/>
                 <w:sz w:val="22"/>
                 <w:szCs w:val="24"/>
@@ -4195,7 +4067,7 @@
             </w:pPr>
             <w:r>
               <w:rPr>
-                <w:rFonts w:ascii="Arial" w:eastAsia="新細明體" w:hAnsi="Arial" w:cs="Arial"/>
+                <w:rFonts w:ascii="Arial" w:eastAsia="PMingLiU" w:hAnsi="Arial" w:cs="Arial"/>
                 <w:kern w:val="0"/>
                 <w:sz w:val="22"/>
                 <w:szCs w:val="24"/>
@@ -4204,7 +4076,7 @@
             </w:r>
             <w:r>
               <w:rPr>
-                <w:rFonts w:ascii="Arial" w:eastAsia="新細明體" w:hAnsi="Arial" w:cs="Arial"/>
+                <w:rFonts w:ascii="Arial" w:eastAsia="PMingLiU" w:hAnsi="Arial" w:cs="Arial"/>
                 <w:kern w:val="0"/>
                 <w:sz w:val="22"/>
                 <w:szCs w:val="24"/>
@@ -4213,7 +4085,7 @@
             </w:r>
             <w:r>
               <w:rPr>
-                <w:rFonts w:ascii="Arial" w:eastAsia="新細明體" w:hAnsi="Arial" w:cs="Arial"/>
+                <w:rFonts w:ascii="Arial" w:eastAsia="PMingLiU" w:hAnsi="Arial" w:cs="Arial"/>
                 <w:kern w:val="0"/>
                 <w:sz w:val="22"/>
                 <w:szCs w:val="24"/>
@@ -4231,7 +4103,6 @@
               <w:bottom w:val="single" w:sz="4" w:space="0" w:color="auto"/>
               <w:right w:val="single" w:sz="4" w:space="0" w:color="auto"/>
             </w:tcBorders>
-            <w:shd w:val="clear" w:color="auto" w:fill="auto"/>
             <w:vAlign w:val="center"/>
             <w:hideMark/>
           </w:tcPr>
@@ -4239,7 +4110,7 @@
             <w:pPr>
               <w:widowControl/>
               <w:rPr>
-                <w:rFonts w:ascii="Arial" w:eastAsia="新細明體" w:hAnsi="Arial" w:cs="Arial"/>
+                <w:rFonts w:ascii="Arial" w:eastAsia="PMingLiU" w:hAnsi="Arial" w:cs="Arial"/>
                 <w:kern w:val="0"/>
                 <w:sz w:val="22"/>
                 <w:szCs w:val="24"/>
@@ -4247,7 +4118,7 @@
             </w:pPr>
             <w:r>
               <w:rPr>
-                <w:rFonts w:ascii="Arial" w:eastAsia="新細明體" w:hAnsi="Arial" w:cs="Arial"/>
+                <w:rFonts w:ascii="Arial" w:eastAsia="PMingLiU" w:hAnsi="Arial" w:cs="Arial"/>
                 <w:kern w:val="0"/>
                 <w:sz w:val="22"/>
                 <w:szCs w:val="24"/>
@@ -4270,7 +4141,6 @@
               <w:bottom w:val="single" w:sz="4" w:space="0" w:color="auto"/>
               <w:right w:val="single" w:sz="4" w:space="0" w:color="auto"/>
             </w:tcBorders>
-            <w:shd w:val="clear" w:color="auto" w:fill="auto"/>
             <w:vAlign w:val="center"/>
             <w:hideMark/>
           </w:tcPr>
@@ -4279,7 +4149,7 @@
               <w:widowControl/>
               <w:jc w:val="center"/>
               <w:rPr>
-                <w:rFonts w:ascii="Arial" w:eastAsia="新細明體" w:hAnsi="Arial" w:cs="Arial"/>
+                <w:rFonts w:ascii="Arial" w:eastAsia="PMingLiU" w:hAnsi="Arial" w:cs="Arial"/>
                 <w:kern w:val="0"/>
                 <w:sz w:val="22"/>
                 <w:szCs w:val="24"/>
@@ -4287,7 +4157,7 @@
             </w:pPr>
             <w:r>
               <w:rPr>
-                <w:rFonts w:ascii="Arial" w:eastAsia="新細明體" w:hAnsi="Arial" w:cs="Arial"/>
+                <w:rFonts w:ascii="Arial" w:eastAsia="PMingLiU" w:hAnsi="Arial" w:cs="Arial"/>
                 <w:kern w:val="0"/>
                 <w:sz w:val="22"/>
                 <w:szCs w:val="24"/>
@@ -4305,7 +4175,6 @@
               <w:bottom w:val="single" w:sz="4" w:space="0" w:color="auto"/>
               <w:right w:val="single" w:sz="4" w:space="0" w:color="auto"/>
             </w:tcBorders>
-            <w:shd w:val="clear" w:color="auto" w:fill="auto"/>
             <w:vAlign w:val="center"/>
             <w:hideMark/>
           </w:tcPr>
@@ -4314,7 +4183,7 @@
               <w:widowControl/>
               <w:jc w:val="center"/>
               <w:rPr>
-                <w:rFonts w:ascii="Arial" w:eastAsia="新細明體" w:hAnsi="Arial" w:cs="Arial"/>
+                <w:rFonts w:ascii="Arial" w:eastAsia="PMingLiU" w:hAnsi="Arial" w:cs="Arial"/>
                 <w:kern w:val="0"/>
                 <w:sz w:val="22"/>
                 <w:szCs w:val="24"/>
@@ -4322,7 +4191,7 @@
             </w:pPr>
             <w:r>
               <w:rPr>
-                <w:rFonts w:ascii="Arial" w:eastAsia="新細明體" w:hAnsi="Arial" w:cs="Arial"/>
+                <w:rFonts w:ascii="Arial" w:eastAsia="PMingLiU" w:hAnsi="Arial" w:cs="Arial"/>
                 <w:kern w:val="0"/>
                 <w:sz w:val="22"/>
                 <w:szCs w:val="24"/>
@@ -4340,7 +4209,6 @@
               <w:bottom w:val="single" w:sz="4" w:space="0" w:color="auto"/>
               <w:right w:val="single" w:sz="4" w:space="0" w:color="auto"/>
             </w:tcBorders>
-            <w:shd w:val="clear" w:color="auto" w:fill="auto"/>
             <w:vAlign w:val="center"/>
             <w:hideMark/>
           </w:tcPr>
@@ -4348,7 +4216,7 @@
             <w:pPr>
               <w:widowControl/>
               <w:rPr>
-                <w:rFonts w:ascii="Arial" w:eastAsia="新細明體" w:hAnsi="Arial" w:cs="Arial"/>
+                <w:rFonts w:ascii="Arial" w:eastAsia="PMingLiU" w:hAnsi="Arial" w:cs="Arial"/>
                 <w:kern w:val="0"/>
                 <w:sz w:val="22"/>
                 <w:szCs w:val="24"/>
@@ -4356,7 +4224,7 @@
             </w:pPr>
             <w:r>
               <w:rPr>
-                <w:rFonts w:ascii="Arial" w:eastAsia="新細明體" w:hAnsi="Arial" w:cs="Arial"/>
+                <w:rFonts w:ascii="Arial" w:eastAsia="PMingLiU" w:hAnsi="Arial" w:cs="Arial"/>
                 <w:kern w:val="0"/>
                 <w:sz w:val="22"/>
                 <w:szCs w:val="24"/>
@@ -4365,7 +4233,7 @@
             </w:r>
             <w:r>
               <w:rPr>
-                <w:rFonts w:ascii="Arial" w:eastAsia="新細明體" w:hAnsi="Arial" w:cs="Arial"/>
+                <w:rFonts w:ascii="Arial" w:eastAsia="PMingLiU" w:hAnsi="Arial" w:cs="Arial"/>
                 <w:kern w:val="0"/>
                 <w:sz w:val="22"/>
                 <w:szCs w:val="24"/>
@@ -4388,7 +4256,6 @@
               <w:bottom w:val="single" w:sz="4" w:space="0" w:color="auto"/>
               <w:right w:val="single" w:sz="4" w:space="0" w:color="auto"/>
             </w:tcBorders>
-            <w:shd w:val="clear" w:color="auto" w:fill="auto"/>
             <w:vAlign w:val="center"/>
             <w:hideMark/>
           </w:tcPr>
@@ -4397,7 +4264,7 @@
               <w:widowControl/>
               <w:jc w:val="center"/>
               <w:rPr>
-                <w:rFonts w:ascii="Arial" w:eastAsia="新細明體" w:hAnsi="Arial" w:cs="Arial"/>
+                <w:rFonts w:ascii="Arial" w:eastAsia="PMingLiU" w:hAnsi="Arial" w:cs="Arial"/>
                 <w:kern w:val="0"/>
                 <w:sz w:val="22"/>
                 <w:szCs w:val="24"/>
@@ -4405,7 +4272,7 @@
             </w:pPr>
             <w:r>
               <w:rPr>
-                <w:rFonts w:ascii="Arial" w:eastAsia="新細明體" w:hAnsi="Arial" w:cs="Arial"/>
+                <w:rFonts w:ascii="Arial" w:eastAsia="PMingLiU" w:hAnsi="Arial" w:cs="Arial"/>
                 <w:kern w:val="0"/>
                 <w:sz w:val="22"/>
                 <w:szCs w:val="24"/>
@@ -4423,7 +4290,6 @@
               <w:bottom w:val="single" w:sz="4" w:space="0" w:color="auto"/>
               <w:right w:val="single" w:sz="4" w:space="0" w:color="auto"/>
             </w:tcBorders>
-            <w:shd w:val="clear" w:color="auto" w:fill="auto"/>
             <w:vAlign w:val="center"/>
             <w:hideMark/>
           </w:tcPr>
@@ -4432,23 +4298,21 @@
               <w:widowControl/>
               <w:jc w:val="center"/>
               <w:rPr>
-                <w:rFonts w:ascii="Arial" w:eastAsia="新細明體" w:hAnsi="Arial" w:cs="Arial"/>
+                <w:rFonts w:ascii="Arial" w:eastAsia="PMingLiU" w:hAnsi="Arial" w:cs="Arial"/>
                 <w:kern w:val="0"/>
                 <w:sz w:val="22"/>
                 <w:szCs w:val="24"/>
               </w:rPr>
             </w:pPr>
-            <w:proofErr w:type="spellStart"/>
-            <w:r>
-              <w:rPr>
-                <w:rFonts w:ascii="Arial" w:eastAsia="新細明體" w:hAnsi="Arial" w:cs="Arial"/>
+            <w:r>
+              <w:rPr>
+                <w:rFonts w:ascii="Arial" w:eastAsia="PMingLiU" w:hAnsi="Arial" w:cs="Arial"/>
                 <w:kern w:val="0"/>
                 <w:sz w:val="22"/>
                 <w:szCs w:val="24"/>
               </w:rPr>
               <w:t>pdays</w:t>
             </w:r>
-            <w:proofErr w:type="spellEnd"/>
           </w:p>
         </w:tc>
         <w:tc>
@@ -4460,7 +4324,6 @@
               <w:bottom w:val="single" w:sz="4" w:space="0" w:color="auto"/>
               <w:right w:val="single" w:sz="4" w:space="0" w:color="auto"/>
             </w:tcBorders>
-            <w:shd w:val="clear" w:color="auto" w:fill="auto"/>
             <w:vAlign w:val="center"/>
             <w:hideMark/>
           </w:tcPr>
@@ -4468,7 +4331,7 @@
             <w:pPr>
               <w:widowControl/>
               <w:rPr>
-                <w:rFonts w:ascii="Arial" w:eastAsia="新細明體" w:hAnsi="Arial" w:cs="Arial"/>
+                <w:rFonts w:ascii="Arial" w:eastAsia="PMingLiU" w:hAnsi="Arial" w:cs="Arial"/>
                 <w:kern w:val="0"/>
                 <w:sz w:val="22"/>
                 <w:szCs w:val="24"/>
@@ -4476,7 +4339,7 @@
             </w:pPr>
             <w:r>
               <w:rPr>
-                <w:rFonts w:ascii="Arial" w:eastAsia="新細明體" w:hAnsi="Arial" w:cs="Arial"/>
+                <w:rFonts w:ascii="Arial" w:eastAsia="PMingLiU" w:hAnsi="Arial" w:cs="Arial"/>
                 <w:kern w:val="0"/>
                 <w:sz w:val="22"/>
                 <w:szCs w:val="24"/>
@@ -4485,7 +4348,7 @@
             </w:r>
             <w:r>
               <w:rPr>
-                <w:rFonts w:ascii="Arial" w:eastAsia="新細明體" w:hAnsi="Arial" w:cs="Arial"/>
+                <w:rFonts w:ascii="Arial" w:eastAsia="PMingLiU" w:hAnsi="Arial" w:cs="Arial"/>
                 <w:kern w:val="0"/>
                 <w:sz w:val="22"/>
                 <w:szCs w:val="24"/>
@@ -4494,7 +4357,7 @@
             </w:r>
             <w:r>
               <w:rPr>
-                <w:rFonts w:ascii="Arial" w:eastAsia="新細明體" w:hAnsi="Arial" w:cs="Arial"/>
+                <w:rFonts w:ascii="Arial" w:eastAsia="PMingLiU" w:hAnsi="Arial" w:cs="Arial"/>
                 <w:kern w:val="0"/>
                 <w:sz w:val="22"/>
                 <w:szCs w:val="24"/>
@@ -4517,7 +4380,6 @@
               <w:bottom w:val="single" w:sz="4" w:space="0" w:color="auto"/>
               <w:right w:val="single" w:sz="4" w:space="0" w:color="auto"/>
             </w:tcBorders>
-            <w:shd w:val="clear" w:color="auto" w:fill="auto"/>
             <w:vAlign w:val="center"/>
             <w:hideMark/>
           </w:tcPr>
@@ -4526,7 +4388,7 @@
               <w:widowControl/>
               <w:jc w:val="center"/>
               <w:rPr>
-                <w:rFonts w:ascii="Arial" w:eastAsia="新細明體" w:hAnsi="Arial" w:cs="Arial"/>
+                <w:rFonts w:ascii="Arial" w:eastAsia="PMingLiU" w:hAnsi="Arial" w:cs="Arial"/>
                 <w:kern w:val="0"/>
                 <w:sz w:val="22"/>
                 <w:szCs w:val="24"/>
@@ -4534,7 +4396,7 @@
             </w:pPr>
             <w:r>
               <w:rPr>
-                <w:rFonts w:ascii="Arial" w:eastAsia="新細明體" w:hAnsi="Arial" w:cs="Arial"/>
+                <w:rFonts w:ascii="Arial" w:eastAsia="PMingLiU" w:hAnsi="Arial" w:cs="Arial"/>
                 <w:kern w:val="0"/>
                 <w:sz w:val="22"/>
                 <w:szCs w:val="24"/>
@@ -4552,7 +4414,6 @@
               <w:bottom w:val="single" w:sz="4" w:space="0" w:color="auto"/>
               <w:right w:val="single" w:sz="4" w:space="0" w:color="auto"/>
             </w:tcBorders>
-            <w:shd w:val="clear" w:color="auto" w:fill="auto"/>
             <w:vAlign w:val="center"/>
             <w:hideMark/>
           </w:tcPr>
@@ -4561,7 +4422,7 @@
               <w:widowControl/>
               <w:jc w:val="center"/>
               <w:rPr>
-                <w:rFonts w:ascii="Arial" w:eastAsia="新細明體" w:hAnsi="Arial" w:cs="Arial"/>
+                <w:rFonts w:ascii="Arial" w:eastAsia="PMingLiU" w:hAnsi="Arial" w:cs="Arial"/>
                 <w:kern w:val="0"/>
                 <w:sz w:val="22"/>
                 <w:szCs w:val="24"/>
@@ -4569,7 +4430,7 @@
             </w:pPr>
             <w:r>
               <w:rPr>
-                <w:rFonts w:ascii="Arial" w:eastAsia="新細明體" w:hAnsi="Arial" w:cs="Arial"/>
+                <w:rFonts w:ascii="Arial" w:eastAsia="PMingLiU" w:hAnsi="Arial" w:cs="Arial"/>
                 <w:kern w:val="0"/>
                 <w:sz w:val="22"/>
                 <w:szCs w:val="24"/>
@@ -4587,7 +4448,6 @@
               <w:bottom w:val="single" w:sz="4" w:space="0" w:color="auto"/>
               <w:right w:val="single" w:sz="4" w:space="0" w:color="auto"/>
             </w:tcBorders>
-            <w:shd w:val="clear" w:color="auto" w:fill="auto"/>
             <w:vAlign w:val="center"/>
             <w:hideMark/>
           </w:tcPr>
@@ -4595,7 +4455,7 @@
             <w:pPr>
               <w:widowControl/>
               <w:rPr>
-                <w:rFonts w:ascii="Arial" w:eastAsia="新細明體" w:hAnsi="Arial" w:cs="Arial"/>
+                <w:rFonts w:ascii="Arial" w:eastAsia="PMingLiU" w:hAnsi="Arial" w:cs="Arial"/>
                 <w:kern w:val="0"/>
                 <w:sz w:val="22"/>
                 <w:szCs w:val="24"/>
@@ -4603,7 +4463,7 @@
             </w:pPr>
             <w:r>
               <w:rPr>
-                <w:rFonts w:ascii="Arial" w:eastAsia="新細明體" w:hAnsi="Arial" w:cs="Arial"/>
+                <w:rFonts w:ascii="Arial" w:eastAsia="PMingLiU" w:hAnsi="Arial" w:cs="Arial"/>
                 <w:kern w:val="0"/>
                 <w:sz w:val="22"/>
                 <w:szCs w:val="24"/>
@@ -4626,7 +4486,6 @@
               <w:bottom w:val="single" w:sz="4" w:space="0" w:color="auto"/>
               <w:right w:val="single" w:sz="4" w:space="0" w:color="auto"/>
             </w:tcBorders>
-            <w:shd w:val="clear" w:color="auto" w:fill="auto"/>
             <w:vAlign w:val="center"/>
             <w:hideMark/>
           </w:tcPr>
@@ -4635,7 +4494,7 @@
               <w:widowControl/>
               <w:jc w:val="center"/>
               <w:rPr>
-                <w:rFonts w:ascii="Arial" w:eastAsia="新細明體" w:hAnsi="Arial" w:cs="Arial"/>
+                <w:rFonts w:ascii="Arial" w:eastAsia="PMingLiU" w:hAnsi="Arial" w:cs="Arial"/>
                 <w:kern w:val="0"/>
                 <w:sz w:val="22"/>
                 <w:szCs w:val="24"/>
@@ -4643,7 +4502,7 @@
             </w:pPr>
             <w:r>
               <w:rPr>
-                <w:rFonts w:ascii="Arial" w:eastAsia="新細明體" w:hAnsi="Arial" w:cs="Arial"/>
+                <w:rFonts w:ascii="Arial" w:eastAsia="PMingLiU" w:hAnsi="Arial" w:cs="Arial"/>
                 <w:kern w:val="0"/>
                 <w:sz w:val="22"/>
                 <w:szCs w:val="24"/>
@@ -4661,7 +4520,6 @@
               <w:bottom w:val="single" w:sz="4" w:space="0" w:color="auto"/>
               <w:right w:val="single" w:sz="4" w:space="0" w:color="auto"/>
             </w:tcBorders>
-            <w:shd w:val="clear" w:color="auto" w:fill="auto"/>
             <w:vAlign w:val="center"/>
             <w:hideMark/>
           </w:tcPr>
@@ -4670,23 +4528,21 @@
               <w:widowControl/>
               <w:jc w:val="center"/>
               <w:rPr>
-                <w:rFonts w:ascii="Arial" w:eastAsia="新細明體" w:hAnsi="Arial" w:cs="Arial"/>
+                <w:rFonts w:ascii="Arial" w:eastAsia="PMingLiU" w:hAnsi="Arial" w:cs="Arial"/>
                 <w:kern w:val="0"/>
                 <w:sz w:val="22"/>
                 <w:szCs w:val="24"/>
               </w:rPr>
             </w:pPr>
-            <w:proofErr w:type="spellStart"/>
-            <w:r>
-              <w:rPr>
-                <w:rFonts w:ascii="Arial" w:eastAsia="新細明體" w:hAnsi="Arial" w:cs="Arial"/>
+            <w:r>
+              <w:rPr>
+                <w:rFonts w:ascii="Arial" w:eastAsia="PMingLiU" w:hAnsi="Arial" w:cs="Arial"/>
                 <w:kern w:val="0"/>
                 <w:sz w:val="22"/>
                 <w:szCs w:val="24"/>
               </w:rPr>
               <w:t>poutcome</w:t>
             </w:r>
-            <w:proofErr w:type="spellEnd"/>
           </w:p>
         </w:tc>
         <w:tc>
@@ -4698,7 +4554,6 @@
               <w:bottom w:val="single" w:sz="4" w:space="0" w:color="auto"/>
               <w:right w:val="single" w:sz="4" w:space="0" w:color="auto"/>
             </w:tcBorders>
-            <w:shd w:val="clear" w:color="auto" w:fill="auto"/>
             <w:vAlign w:val="center"/>
             <w:hideMark/>
           </w:tcPr>
@@ -4706,7 +4561,7 @@
             <w:pPr>
               <w:widowControl/>
               <w:rPr>
-                <w:rFonts w:ascii="Arial" w:eastAsia="新細明體" w:hAnsi="Arial" w:cs="Arial"/>
+                <w:rFonts w:ascii="Arial" w:eastAsia="PMingLiU" w:hAnsi="Arial" w:cs="Arial"/>
                 <w:kern w:val="0"/>
                 <w:sz w:val="22"/>
                 <w:szCs w:val="24"/>
@@ -4714,7 +4569,7 @@
             </w:pPr>
             <w:r>
               <w:rPr>
-                <w:rFonts w:ascii="Arial" w:eastAsia="新細明體" w:hAnsi="Arial" w:cs="Arial"/>
+                <w:rFonts w:ascii="Arial" w:eastAsia="PMingLiU" w:hAnsi="Arial" w:cs="Arial"/>
                 <w:kern w:val="0"/>
                 <w:sz w:val="22"/>
                 <w:szCs w:val="24"/>
@@ -4737,7 +4592,6 @@
               <w:bottom w:val="single" w:sz="4" w:space="0" w:color="auto"/>
               <w:right w:val="single" w:sz="4" w:space="0" w:color="auto"/>
             </w:tcBorders>
-            <w:shd w:val="clear" w:color="auto" w:fill="auto"/>
             <w:vAlign w:val="center"/>
             <w:hideMark/>
           </w:tcPr>
@@ -4746,7 +4600,7 @@
               <w:widowControl/>
               <w:jc w:val="center"/>
               <w:rPr>
-                <w:rFonts w:ascii="Arial" w:eastAsia="新細明體" w:hAnsi="Arial" w:cs="Arial"/>
+                <w:rFonts w:ascii="Arial" w:eastAsia="PMingLiU" w:hAnsi="Arial" w:cs="Arial"/>
                 <w:kern w:val="0"/>
                 <w:sz w:val="22"/>
                 <w:szCs w:val="24"/>
@@ -4754,7 +4608,7 @@
             </w:pPr>
             <w:r>
               <w:rPr>
-                <w:rFonts w:ascii="Arial" w:eastAsia="新細明體" w:hAnsi="Arial" w:cs="Arial"/>
+                <w:rFonts w:ascii="Arial" w:eastAsia="PMingLiU" w:hAnsi="Arial" w:cs="Arial"/>
                 <w:kern w:val="0"/>
                 <w:sz w:val="22"/>
                 <w:szCs w:val="24"/>
@@ -4772,7 +4626,6 @@
               <w:bottom w:val="single" w:sz="4" w:space="0" w:color="auto"/>
               <w:right w:val="single" w:sz="4" w:space="0" w:color="auto"/>
             </w:tcBorders>
-            <w:shd w:val="clear" w:color="auto" w:fill="auto"/>
             <w:vAlign w:val="center"/>
             <w:hideMark/>
           </w:tcPr>
@@ -4781,23 +4634,21 @@
               <w:widowControl/>
               <w:jc w:val="center"/>
               <w:rPr>
-                <w:rFonts w:ascii="Arial" w:eastAsia="新細明體" w:hAnsi="Arial" w:cs="Arial"/>
+                <w:rFonts w:ascii="Arial" w:eastAsia="PMingLiU" w:hAnsi="Arial" w:cs="Arial"/>
                 <w:kern w:val="0"/>
                 <w:sz w:val="22"/>
                 <w:szCs w:val="24"/>
               </w:rPr>
             </w:pPr>
-            <w:proofErr w:type="spellStart"/>
-            <w:r>
-              <w:rPr>
-                <w:rFonts w:ascii="Arial" w:eastAsia="新細明體" w:hAnsi="Arial" w:cs="Arial"/>
+            <w:r>
+              <w:rPr>
+                <w:rFonts w:ascii="Arial" w:eastAsia="PMingLiU" w:hAnsi="Arial" w:cs="Arial"/>
                 <w:kern w:val="0"/>
                 <w:sz w:val="22"/>
                 <w:szCs w:val="24"/>
               </w:rPr>
               <w:t>emp.var.rate</w:t>
             </w:r>
-            <w:proofErr w:type="spellEnd"/>
           </w:p>
         </w:tc>
         <w:tc>
@@ -4809,7 +4660,6 @@
               <w:bottom w:val="single" w:sz="4" w:space="0" w:color="auto"/>
               <w:right w:val="single" w:sz="4" w:space="0" w:color="auto"/>
             </w:tcBorders>
-            <w:shd w:val="clear" w:color="auto" w:fill="auto"/>
             <w:vAlign w:val="center"/>
             <w:hideMark/>
           </w:tcPr>
@@ -4817,7 +4667,7 @@
             <w:pPr>
               <w:widowControl/>
               <w:rPr>
-                <w:rFonts w:ascii="Arial" w:eastAsia="新細明體" w:hAnsi="Arial" w:cs="Arial"/>
+                <w:rFonts w:ascii="Arial" w:eastAsia="PMingLiU" w:hAnsi="Arial" w:cs="Arial"/>
                 <w:kern w:val="0"/>
                 <w:sz w:val="22"/>
                 <w:szCs w:val="24"/>
@@ -4825,7 +4675,7 @@
             </w:pPr>
             <w:r>
               <w:rPr>
-                <w:rFonts w:ascii="Arial" w:eastAsia="新細明體" w:hAnsi="Arial" w:cs="Arial"/>
+                <w:rFonts w:ascii="Arial" w:eastAsia="PMingLiU" w:hAnsi="Arial" w:cs="Arial"/>
                 <w:kern w:val="0"/>
                 <w:sz w:val="22"/>
                 <w:szCs w:val="24"/>
@@ -4848,7 +4698,6 @@
               <w:bottom w:val="single" w:sz="4" w:space="0" w:color="auto"/>
               <w:right w:val="single" w:sz="4" w:space="0" w:color="auto"/>
             </w:tcBorders>
-            <w:shd w:val="clear" w:color="auto" w:fill="auto"/>
             <w:vAlign w:val="center"/>
             <w:hideMark/>
           </w:tcPr>
@@ -4857,7 +4706,7 @@
               <w:widowControl/>
               <w:jc w:val="center"/>
               <w:rPr>
-                <w:rFonts w:ascii="Arial" w:eastAsia="新細明體" w:hAnsi="Arial" w:cs="Arial"/>
+                <w:rFonts w:ascii="Arial" w:eastAsia="PMingLiU" w:hAnsi="Arial" w:cs="Arial"/>
                 <w:kern w:val="0"/>
                 <w:sz w:val="22"/>
                 <w:szCs w:val="24"/>
@@ -4865,7 +4714,7 @@
             </w:pPr>
             <w:r>
               <w:rPr>
-                <w:rFonts w:ascii="Arial" w:eastAsia="新細明體" w:hAnsi="Arial" w:cs="Arial"/>
+                <w:rFonts w:ascii="Arial" w:eastAsia="PMingLiU" w:hAnsi="Arial" w:cs="Arial"/>
                 <w:kern w:val="0"/>
                 <w:sz w:val="22"/>
                 <w:szCs w:val="24"/>
@@ -4883,7 +4732,6 @@
               <w:bottom w:val="single" w:sz="4" w:space="0" w:color="auto"/>
               <w:right w:val="single" w:sz="4" w:space="0" w:color="auto"/>
             </w:tcBorders>
-            <w:shd w:val="clear" w:color="auto" w:fill="auto"/>
             <w:vAlign w:val="center"/>
             <w:hideMark/>
           </w:tcPr>
@@ -4892,23 +4740,21 @@
               <w:widowControl/>
               <w:jc w:val="center"/>
               <w:rPr>
-                <w:rFonts w:ascii="Arial" w:eastAsia="新細明體" w:hAnsi="Arial" w:cs="Arial"/>
+                <w:rFonts w:ascii="Arial" w:eastAsia="PMingLiU" w:hAnsi="Arial" w:cs="Arial"/>
                 <w:kern w:val="0"/>
                 <w:sz w:val="22"/>
                 <w:szCs w:val="24"/>
               </w:rPr>
             </w:pPr>
-            <w:proofErr w:type="spellStart"/>
-            <w:r>
-              <w:rPr>
-                <w:rFonts w:ascii="Arial" w:eastAsia="新細明體" w:hAnsi="Arial" w:cs="Arial"/>
+            <w:r>
+              <w:rPr>
+                <w:rFonts w:ascii="Arial" w:eastAsia="PMingLiU" w:hAnsi="Arial" w:cs="Arial"/>
                 <w:kern w:val="0"/>
                 <w:sz w:val="22"/>
                 <w:szCs w:val="24"/>
               </w:rPr>
               <w:t>cons.price.idx</w:t>
             </w:r>
-            <w:proofErr w:type="spellEnd"/>
           </w:p>
         </w:tc>
         <w:tc>
@@ -4920,7 +4766,6 @@
               <w:bottom w:val="single" w:sz="4" w:space="0" w:color="auto"/>
               <w:right w:val="single" w:sz="4" w:space="0" w:color="auto"/>
             </w:tcBorders>
-            <w:shd w:val="clear" w:color="auto" w:fill="auto"/>
             <w:vAlign w:val="center"/>
             <w:hideMark/>
           </w:tcPr>
@@ -4928,7 +4773,7 @@
             <w:pPr>
               <w:widowControl/>
               <w:rPr>
-                <w:rFonts w:ascii="Arial" w:eastAsia="新細明體" w:hAnsi="Arial" w:cs="Arial"/>
+                <w:rFonts w:ascii="Arial" w:eastAsia="PMingLiU" w:hAnsi="Arial" w:cs="Arial"/>
                 <w:kern w:val="0"/>
                 <w:sz w:val="22"/>
                 <w:szCs w:val="24"/>
@@ -4936,7 +4781,7 @@
             </w:pPr>
             <w:r>
               <w:rPr>
-                <w:rFonts w:ascii="Arial" w:eastAsia="新細明體" w:hAnsi="Arial" w:cs="Arial"/>
+                <w:rFonts w:ascii="Arial" w:eastAsia="PMingLiU" w:hAnsi="Arial" w:cs="Arial"/>
                 <w:kern w:val="0"/>
                 <w:sz w:val="22"/>
                 <w:szCs w:val="24"/>
@@ -4959,7 +4804,6 @@
               <w:bottom w:val="single" w:sz="4" w:space="0" w:color="auto"/>
               <w:right w:val="single" w:sz="4" w:space="0" w:color="auto"/>
             </w:tcBorders>
-            <w:shd w:val="clear" w:color="auto" w:fill="auto"/>
             <w:vAlign w:val="center"/>
             <w:hideMark/>
           </w:tcPr>
@@ -4968,7 +4812,7 @@
               <w:widowControl/>
               <w:jc w:val="center"/>
               <w:rPr>
-                <w:rFonts w:ascii="Arial" w:eastAsia="新細明體" w:hAnsi="Arial" w:cs="Arial"/>
+                <w:rFonts w:ascii="Arial" w:eastAsia="PMingLiU" w:hAnsi="Arial" w:cs="Arial"/>
                 <w:kern w:val="0"/>
                 <w:sz w:val="22"/>
                 <w:szCs w:val="24"/>
@@ -4976,7 +4820,7 @@
             </w:pPr>
             <w:r>
               <w:rPr>
-                <w:rFonts w:ascii="Arial" w:eastAsia="新細明體" w:hAnsi="Arial" w:cs="Arial"/>
+                <w:rFonts w:ascii="Arial" w:eastAsia="PMingLiU" w:hAnsi="Arial" w:cs="Arial"/>
                 <w:kern w:val="0"/>
                 <w:sz w:val="22"/>
                 <w:szCs w:val="24"/>
@@ -4994,7 +4838,6 @@
               <w:bottom w:val="single" w:sz="4" w:space="0" w:color="auto"/>
               <w:right w:val="single" w:sz="4" w:space="0" w:color="auto"/>
             </w:tcBorders>
-            <w:shd w:val="clear" w:color="auto" w:fill="auto"/>
             <w:vAlign w:val="center"/>
             <w:hideMark/>
           </w:tcPr>
@@ -5003,23 +4846,21 @@
               <w:widowControl/>
               <w:jc w:val="center"/>
               <w:rPr>
-                <w:rFonts w:ascii="Arial" w:eastAsia="新細明體" w:hAnsi="Arial" w:cs="Arial"/>
+                <w:rFonts w:ascii="Arial" w:eastAsia="PMingLiU" w:hAnsi="Arial" w:cs="Arial"/>
                 <w:kern w:val="0"/>
                 <w:sz w:val="22"/>
                 <w:szCs w:val="24"/>
               </w:rPr>
             </w:pPr>
-            <w:proofErr w:type="spellStart"/>
-            <w:r>
-              <w:rPr>
-                <w:rFonts w:ascii="Arial" w:eastAsia="新細明體" w:hAnsi="Arial" w:cs="Arial"/>
+            <w:r>
+              <w:rPr>
+                <w:rFonts w:ascii="Arial" w:eastAsia="PMingLiU" w:hAnsi="Arial" w:cs="Arial"/>
                 <w:kern w:val="0"/>
                 <w:sz w:val="22"/>
                 <w:szCs w:val="24"/>
               </w:rPr>
               <w:t>cons.conf.idx</w:t>
             </w:r>
-            <w:proofErr w:type="spellEnd"/>
           </w:p>
         </w:tc>
         <w:tc>
@@ -5031,7 +4872,6 @@
               <w:bottom w:val="single" w:sz="4" w:space="0" w:color="auto"/>
               <w:right w:val="single" w:sz="4" w:space="0" w:color="auto"/>
             </w:tcBorders>
-            <w:shd w:val="clear" w:color="auto" w:fill="auto"/>
             <w:vAlign w:val="center"/>
             <w:hideMark/>
           </w:tcPr>
@@ -5039,7 +4879,7 @@
             <w:pPr>
               <w:widowControl/>
               <w:rPr>
-                <w:rFonts w:ascii="Arial" w:eastAsia="新細明體" w:hAnsi="Arial" w:cs="Arial"/>
+                <w:rFonts w:ascii="Arial" w:eastAsia="PMingLiU" w:hAnsi="Arial" w:cs="Arial"/>
                 <w:kern w:val="0"/>
                 <w:sz w:val="22"/>
                 <w:szCs w:val="24"/>
@@ -5047,7 +4887,7 @@
             </w:pPr>
             <w:r>
               <w:rPr>
-                <w:rFonts w:ascii="Arial" w:eastAsia="新細明體" w:hAnsi="Arial" w:cs="Arial"/>
+                <w:rFonts w:ascii="Arial" w:eastAsia="PMingLiU" w:hAnsi="Arial" w:cs="Arial"/>
                 <w:kern w:val="0"/>
                 <w:sz w:val="22"/>
                 <w:szCs w:val="24"/>
@@ -5070,7 +4910,6 @@
               <w:bottom w:val="single" w:sz="4" w:space="0" w:color="auto"/>
               <w:right w:val="single" w:sz="4" w:space="0" w:color="auto"/>
             </w:tcBorders>
-            <w:shd w:val="clear" w:color="auto" w:fill="auto"/>
             <w:vAlign w:val="center"/>
             <w:hideMark/>
           </w:tcPr>
@@ -5079,7 +4918,7 @@
               <w:widowControl/>
               <w:jc w:val="center"/>
               <w:rPr>
-                <w:rFonts w:ascii="Arial" w:eastAsia="新細明體" w:hAnsi="Arial" w:cs="Arial"/>
+                <w:rFonts w:ascii="Arial" w:eastAsia="PMingLiU" w:hAnsi="Arial" w:cs="Arial"/>
                 <w:kern w:val="0"/>
                 <w:sz w:val="22"/>
                 <w:szCs w:val="24"/>
@@ -5087,7 +4926,7 @@
             </w:pPr>
             <w:r>
               <w:rPr>
-                <w:rFonts w:ascii="Arial" w:eastAsia="新細明體" w:hAnsi="Arial" w:cs="Arial"/>
+                <w:rFonts w:ascii="Arial" w:eastAsia="PMingLiU" w:hAnsi="Arial" w:cs="Arial"/>
                 <w:kern w:val="0"/>
                 <w:sz w:val="22"/>
                 <w:szCs w:val="24"/>
@@ -5105,7 +4944,6 @@
               <w:bottom w:val="single" w:sz="4" w:space="0" w:color="auto"/>
               <w:right w:val="single" w:sz="4" w:space="0" w:color="auto"/>
             </w:tcBorders>
-            <w:shd w:val="clear" w:color="auto" w:fill="auto"/>
             <w:vAlign w:val="center"/>
             <w:hideMark/>
           </w:tcPr>
@@ -5114,7 +4952,7 @@
               <w:widowControl/>
               <w:jc w:val="center"/>
               <w:rPr>
-                <w:rFonts w:ascii="Arial" w:eastAsia="新細明體" w:hAnsi="Arial" w:cs="Arial"/>
+                <w:rFonts w:ascii="Arial" w:eastAsia="PMingLiU" w:hAnsi="Arial" w:cs="Arial"/>
                 <w:kern w:val="0"/>
                 <w:sz w:val="22"/>
                 <w:szCs w:val="24"/>
@@ -5122,7 +4960,7 @@
             </w:pPr>
             <w:r>
               <w:rPr>
-                <w:rFonts w:ascii="Arial" w:eastAsia="新細明體" w:hAnsi="Arial" w:cs="Arial"/>
+                <w:rFonts w:ascii="Arial" w:eastAsia="PMingLiU" w:hAnsi="Arial" w:cs="Arial"/>
                 <w:kern w:val="0"/>
                 <w:sz w:val="22"/>
                 <w:szCs w:val="24"/>
@@ -5140,7 +4978,6 @@
               <w:bottom w:val="single" w:sz="4" w:space="0" w:color="auto"/>
               <w:right w:val="single" w:sz="4" w:space="0" w:color="auto"/>
             </w:tcBorders>
-            <w:shd w:val="clear" w:color="auto" w:fill="auto"/>
             <w:vAlign w:val="center"/>
             <w:hideMark/>
           </w:tcPr>
@@ -5148,7 +4985,7 @@
             <w:pPr>
               <w:widowControl/>
               <w:rPr>
-                <w:rFonts w:ascii="Arial" w:eastAsia="新細明體" w:hAnsi="Arial" w:cs="Arial"/>
+                <w:rFonts w:ascii="Arial" w:eastAsia="PMingLiU" w:hAnsi="Arial" w:cs="Arial"/>
                 <w:kern w:val="0"/>
                 <w:sz w:val="22"/>
                 <w:szCs w:val="24"/>
@@ -5156,32 +4993,12 @@
             </w:pPr>
             <w:r>
               <w:rPr>
-                <w:rFonts w:ascii="Arial" w:eastAsia="新細明體" w:hAnsi="Arial" w:cs="Arial"/>
+                <w:rFonts w:ascii="Arial" w:eastAsia="PMingLiU" w:hAnsi="Arial" w:cs="Arial"/>
                 <w:kern w:val="0"/>
                 <w:sz w:val="22"/>
                 <w:szCs w:val="24"/>
               </w:rPr>
-              <w:t xml:space="preserve">Numeric – </w:t>
-            </w:r>
-            <w:proofErr w:type="spellStart"/>
-            <w:r>
-              <w:rPr>
-                <w:rFonts w:ascii="Arial" w:eastAsia="新細明體" w:hAnsi="Arial" w:cs="Arial"/>
-                <w:kern w:val="0"/>
-                <w:sz w:val="22"/>
-                <w:szCs w:val="24"/>
-              </w:rPr>
-              <w:t>Euribor</w:t>
-            </w:r>
-            <w:proofErr w:type="spellEnd"/>
-            <w:r>
-              <w:rPr>
-                <w:rFonts w:ascii="Arial" w:eastAsia="新細明體" w:hAnsi="Arial" w:cs="Arial"/>
-                <w:kern w:val="0"/>
-                <w:sz w:val="22"/>
-                <w:szCs w:val="24"/>
-              </w:rPr>
-              <w:t xml:space="preserve"> 3-month Rate (Daily Indicator)</w:t>
+              <w:t>Numeric – Euribor 3-month Rate (Daily Indicator)</w:t>
             </w:r>
           </w:p>
         </w:tc>
@@ -5199,7 +5016,6 @@
               <w:bottom w:val="single" w:sz="4" w:space="0" w:color="auto"/>
               <w:right w:val="single" w:sz="4" w:space="0" w:color="auto"/>
             </w:tcBorders>
-            <w:shd w:val="clear" w:color="auto" w:fill="auto"/>
             <w:vAlign w:val="center"/>
             <w:hideMark/>
           </w:tcPr>
@@ -5208,7 +5024,7 @@
               <w:widowControl/>
               <w:jc w:val="center"/>
               <w:rPr>
-                <w:rFonts w:ascii="Arial" w:eastAsia="新細明體" w:hAnsi="Arial" w:cs="Arial"/>
+                <w:rFonts w:ascii="Arial" w:eastAsia="PMingLiU" w:hAnsi="Arial" w:cs="Arial"/>
                 <w:kern w:val="0"/>
                 <w:sz w:val="22"/>
                 <w:szCs w:val="24"/>
@@ -5216,7 +5032,7 @@
             </w:pPr>
             <w:r>
               <w:rPr>
-                <w:rFonts w:ascii="Arial" w:eastAsia="新細明體" w:hAnsi="Arial" w:cs="Arial"/>
+                <w:rFonts w:ascii="Arial" w:eastAsia="PMingLiU" w:hAnsi="Arial" w:cs="Arial"/>
                 <w:kern w:val="0"/>
                 <w:sz w:val="22"/>
                 <w:szCs w:val="24"/>
@@ -5234,7 +5050,6 @@
               <w:bottom w:val="single" w:sz="4" w:space="0" w:color="auto"/>
               <w:right w:val="single" w:sz="4" w:space="0" w:color="auto"/>
             </w:tcBorders>
-            <w:shd w:val="clear" w:color="auto" w:fill="auto"/>
             <w:vAlign w:val="center"/>
             <w:hideMark/>
           </w:tcPr>
@@ -5243,23 +5058,21 @@
               <w:widowControl/>
               <w:jc w:val="center"/>
               <w:rPr>
-                <w:rFonts w:ascii="Arial" w:eastAsia="新細明體" w:hAnsi="Arial" w:cs="Arial"/>
+                <w:rFonts w:ascii="Arial" w:eastAsia="PMingLiU" w:hAnsi="Arial" w:cs="Arial"/>
                 <w:kern w:val="0"/>
                 <w:sz w:val="22"/>
                 <w:szCs w:val="24"/>
               </w:rPr>
             </w:pPr>
-            <w:proofErr w:type="spellStart"/>
-            <w:r>
-              <w:rPr>
-                <w:rFonts w:ascii="Arial" w:eastAsia="新細明體" w:hAnsi="Arial" w:cs="Arial"/>
+            <w:r>
+              <w:rPr>
+                <w:rFonts w:ascii="Arial" w:eastAsia="PMingLiU" w:hAnsi="Arial" w:cs="Arial"/>
                 <w:kern w:val="0"/>
                 <w:sz w:val="22"/>
                 <w:szCs w:val="24"/>
               </w:rPr>
               <w:t>nr.employed</w:t>
             </w:r>
-            <w:proofErr w:type="spellEnd"/>
           </w:p>
         </w:tc>
         <w:tc>
@@ -5271,7 +5084,6 @@
               <w:bottom w:val="single" w:sz="4" w:space="0" w:color="auto"/>
               <w:right w:val="single" w:sz="4" w:space="0" w:color="auto"/>
             </w:tcBorders>
-            <w:shd w:val="clear" w:color="auto" w:fill="auto"/>
             <w:vAlign w:val="center"/>
             <w:hideMark/>
           </w:tcPr>
@@ -5279,7 +5091,7 @@
             <w:pPr>
               <w:widowControl/>
               <w:rPr>
-                <w:rFonts w:ascii="Arial" w:eastAsia="新細明體" w:hAnsi="Arial" w:cs="Arial"/>
+                <w:rFonts w:ascii="Arial" w:eastAsia="PMingLiU" w:hAnsi="Arial" w:cs="Arial"/>
                 <w:kern w:val="0"/>
                 <w:sz w:val="22"/>
                 <w:szCs w:val="24"/>
@@ -5287,7 +5099,7 @@
             </w:pPr>
             <w:r>
               <w:rPr>
-                <w:rFonts w:ascii="Arial" w:eastAsia="新細明體" w:hAnsi="Arial" w:cs="Arial"/>
+                <w:rFonts w:ascii="Arial" w:eastAsia="PMingLiU" w:hAnsi="Arial" w:cs="Arial"/>
                 <w:kern w:val="0"/>
                 <w:sz w:val="22"/>
                 <w:szCs w:val="24"/>
@@ -5296,7 +5108,7 @@
             </w:r>
             <w:r>
               <w:rPr>
-                <w:rFonts w:ascii="Arial" w:eastAsia="新細明體" w:hAnsi="Arial" w:cs="Arial"/>
+                <w:rFonts w:ascii="Arial" w:eastAsia="PMingLiU" w:hAnsi="Arial" w:cs="Arial"/>
                 <w:kern w:val="0"/>
                 <w:sz w:val="22"/>
                 <w:szCs w:val="24"/>
@@ -5328,7 +5140,7 @@
               <w:widowControl/>
               <w:jc w:val="center"/>
               <w:rPr>
-                <w:rFonts w:ascii="Arial" w:eastAsia="新細明體" w:hAnsi="Arial" w:cs="Arial"/>
+                <w:rFonts w:ascii="Arial" w:eastAsia="PMingLiU" w:hAnsi="Arial" w:cs="Arial"/>
                 <w:kern w:val="0"/>
                 <w:sz w:val="22"/>
                 <w:szCs w:val="24"/>
@@ -5336,7 +5148,7 @@
             </w:pPr>
             <w:r>
               <w:rPr>
-                <w:rFonts w:ascii="Arial" w:eastAsia="新細明體" w:hAnsi="Arial" w:cs="Arial"/>
+                <w:rFonts w:ascii="Arial" w:eastAsia="PMingLiU" w:hAnsi="Arial" w:cs="Arial"/>
                 <w:kern w:val="0"/>
                 <w:sz w:val="22"/>
                 <w:szCs w:val="24"/>
@@ -5363,7 +5175,7 @@
               <w:widowControl/>
               <w:jc w:val="center"/>
               <w:rPr>
-                <w:rFonts w:ascii="Arial" w:eastAsia="新細明體" w:hAnsi="Arial" w:cs="Arial"/>
+                <w:rFonts w:ascii="Arial" w:eastAsia="PMingLiU" w:hAnsi="Arial" w:cs="Arial"/>
                 <w:kern w:val="0"/>
                 <w:sz w:val="22"/>
                 <w:szCs w:val="24"/>
@@ -5371,7 +5183,7 @@
             </w:pPr>
             <w:r>
               <w:rPr>
-                <w:rFonts w:ascii="Arial" w:eastAsia="新細明體" w:hAnsi="Arial" w:cs="Arial"/>
+                <w:rFonts w:ascii="Arial" w:eastAsia="PMingLiU" w:hAnsi="Arial" w:cs="Arial"/>
                 <w:kern w:val="0"/>
                 <w:sz w:val="22"/>
                 <w:szCs w:val="24"/>
@@ -5397,7 +5209,7 @@
             <w:pPr>
               <w:widowControl/>
               <w:rPr>
-                <w:rFonts w:ascii="Arial" w:eastAsia="新細明體" w:hAnsi="Arial" w:cs="Arial"/>
+                <w:rFonts w:ascii="Arial" w:eastAsia="PMingLiU" w:hAnsi="Arial" w:cs="Arial"/>
                 <w:kern w:val="0"/>
                 <w:sz w:val="22"/>
                 <w:szCs w:val="24"/>
@@ -5405,7 +5217,7 @@
             </w:pPr>
             <w:r>
               <w:rPr>
-                <w:rFonts w:ascii="Arial" w:eastAsia="新細明體" w:hAnsi="Arial" w:cs="Arial"/>
+                <w:rFonts w:ascii="Arial" w:eastAsia="PMingLiU" w:hAnsi="Arial" w:cs="Arial"/>
                 <w:kern w:val="0"/>
                 <w:sz w:val="22"/>
                 <w:szCs w:val="24"/>
@@ -5417,7 +5229,7 @@
             <w:pPr>
               <w:widowControl/>
               <w:rPr>
-                <w:rFonts w:ascii="Arial" w:eastAsia="新細明體" w:hAnsi="Arial" w:cs="Arial"/>
+                <w:rFonts w:ascii="Arial" w:eastAsia="PMingLiU" w:hAnsi="Arial" w:cs="Arial"/>
                 <w:kern w:val="0"/>
                 <w:sz w:val="22"/>
                 <w:szCs w:val="24"/>
@@ -5425,7 +5237,7 @@
             </w:pPr>
             <w:r>
               <w:rPr>
-                <w:rFonts w:ascii="Arial" w:eastAsia="新細明體" w:hAnsi="Arial" w:cs="Arial"/>
+                <w:rFonts w:ascii="Arial" w:eastAsia="PMingLiU" w:hAnsi="Arial" w:cs="Arial"/>
                 <w:kern w:val="0"/>
                 <w:sz w:val="22"/>
                 <w:szCs w:val="24"/>
@@ -5434,7 +5246,7 @@
             </w:r>
             <w:r>
               <w:rPr>
-                <w:rFonts w:ascii="Arial" w:eastAsia="新細明體" w:hAnsi="Arial" w:cs="Arial"/>
+                <w:rFonts w:ascii="Arial" w:eastAsia="PMingLiU" w:hAnsi="Arial" w:cs="Arial"/>
                 <w:kern w:val="0"/>
                 <w:sz w:val="22"/>
                 <w:szCs w:val="24"/>
@@ -5446,7 +5258,7 @@
             <w:pPr>
               <w:widowControl/>
               <w:rPr>
-                <w:rFonts w:ascii="Arial" w:eastAsia="新細明體" w:hAnsi="Arial" w:cs="Arial"/>
+                <w:rFonts w:ascii="Arial" w:eastAsia="PMingLiU" w:hAnsi="Arial" w:cs="Arial"/>
                 <w:kern w:val="0"/>
                 <w:sz w:val="22"/>
                 <w:szCs w:val="24"/>
@@ -5454,7 +5266,7 @@
             </w:pPr>
             <w:r>
               <w:rPr>
-                <w:rFonts w:ascii="Arial" w:eastAsia="新細明體" w:hAnsi="Arial" w:cs="Arial"/>
+                <w:rFonts w:ascii="Arial" w:eastAsia="PMingLiU" w:hAnsi="Arial" w:cs="Arial"/>
                 <w:kern w:val="0"/>
                 <w:sz w:val="22"/>
                 <w:szCs w:val="24"/>
@@ -5463,7 +5275,7 @@
             </w:r>
             <w:r>
               <w:rPr>
-                <w:rFonts w:ascii="Arial" w:eastAsia="新細明體" w:hAnsi="Arial" w:cs="Arial"/>
+                <w:rFonts w:ascii="Arial" w:eastAsia="PMingLiU" w:hAnsi="Arial" w:cs="Arial"/>
                 <w:kern w:val="0"/>
                 <w:sz w:val="22"/>
                 <w:szCs w:val="24"/>
@@ -5472,7 +5284,7 @@
             </w:r>
             <w:r>
               <w:rPr>
-                <w:rFonts w:ascii="Arial" w:eastAsia="新細明體" w:hAnsi="Arial" w:cs="Arial"/>
+                <w:rFonts w:ascii="Arial" w:eastAsia="PMingLiU" w:hAnsi="Arial" w:cs="Arial"/>
                 <w:kern w:val="0"/>
                 <w:sz w:val="22"/>
                 <w:szCs w:val="24"/>
@@ -5481,7 +5293,7 @@
             </w:r>
             <w:r>
               <w:rPr>
-                <w:rFonts w:ascii="Arial" w:eastAsia="新細明體" w:hAnsi="Arial" w:cs="Arial"/>
+                <w:rFonts w:ascii="Arial" w:eastAsia="PMingLiU" w:hAnsi="Arial" w:cs="Arial"/>
                 <w:kern w:val="0"/>
                 <w:sz w:val="22"/>
                 <w:szCs w:val="24"/>
@@ -5636,25 +5448,7 @@
           <w:sz w:val="22"/>
           <w:szCs w:val="20"/>
         </w:rPr>
-        <w:t>We aim to (</w:t>
-      </w:r>
-      <w:proofErr w:type="spellStart"/>
-      <w:r>
-        <w:rPr>
-          <w:rFonts w:ascii="Arial" w:hAnsi="Arial" w:cs="Arial"/>
-          <w:sz w:val="22"/>
-          <w:szCs w:val="20"/>
-        </w:rPr>
-        <w:t>i</w:t>
-      </w:r>
-      <w:proofErr w:type="spellEnd"/>
-      <w:r>
-        <w:rPr>
-          <w:rFonts w:ascii="Arial" w:hAnsi="Arial" w:cs="Arial"/>
-          <w:sz w:val="22"/>
-          <w:szCs w:val="20"/>
-        </w:rPr>
-        <w:t xml:space="preserve">) find the relationship between y (i.e. whether the account is subscribed) and the 20 variables obtained and (ii) compare if the sample size matters much on the result. </w:t>
+        <w:t xml:space="preserve">We aim to (i) find the relationship between y (i.e. whether the account is subscribed) and the 20 variables obtained and (ii) compare if the sample size matters much on the result. </w:t>
       </w:r>
     </w:p>
     <w:p>
@@ -5683,25 +5477,7 @@
           <w:sz w:val="22"/>
           <w:szCs w:val="20"/>
         </w:rPr>
-        <w:t xml:space="preserve">Let π = </w:t>
-      </w:r>
-      <w:proofErr w:type="spellStart"/>
-      <w:r>
-        <w:rPr>
-          <w:rFonts w:ascii="Arial" w:hAnsi="Arial" w:cs="Arial"/>
-          <w:sz w:val="22"/>
-          <w:szCs w:val="20"/>
-        </w:rPr>
-        <w:t>Pr</w:t>
-      </w:r>
-      <w:proofErr w:type="spellEnd"/>
-      <w:r>
-        <w:rPr>
-          <w:rFonts w:ascii="Arial" w:hAnsi="Arial" w:cs="Arial"/>
-          <w:sz w:val="22"/>
-          <w:szCs w:val="20"/>
-        </w:rPr>
-        <w:t>{ y = 1| x} = Probability of the account is subscribed</w:t>
+        <w:t>Let π = Pr{ y = 1| x} = Probability of the account is subscribed</w:t>
       </w:r>
     </w:p>
     <w:p>
@@ -5816,7 +5592,6 @@
         </w:rPr>
         <w:t xml:space="preserve">n </w:t>
       </w:r>
-      <w:proofErr w:type="spellStart"/>
       <w:r>
         <w:rPr>
           <w:rFonts w:ascii="Arial" w:hAnsi="Arial" w:cs="Arial"/>
@@ -5827,31 +5602,21 @@
       </w:r>
       <w:r>
         <w:rPr>
-          <w:rFonts w:ascii="Arial" w:eastAsia="新細明體" w:hAnsi="Arial" w:cs="Arial"/>
+          <w:rFonts w:ascii="Arial" w:eastAsia="PMingLiU" w:hAnsi="Arial" w:cs="Arial"/>
           <w:sz w:val="22"/>
           <w:szCs w:val="20"/>
           <w:vertAlign w:val="subscript"/>
         </w:rPr>
-        <w:t>n</w:t>
-      </w:r>
-      <w:proofErr w:type="spellEnd"/>
-      <w:r>
-        <w:rPr>
-          <w:rFonts w:ascii="Arial" w:eastAsia="新細明體" w:hAnsi="Arial" w:cs="Arial"/>
-          <w:sz w:val="22"/>
-          <w:szCs w:val="20"/>
-          <w:vertAlign w:val="subscript"/>
+        <w:t xml:space="preserve">n </w:t>
+      </w:r>
+      <w:r>
+        <w:rPr>
+          <w:rFonts w:ascii="Arial" w:eastAsia="PMingLiU" w:hAnsi="Arial" w:cs="Arial"/>
+          <w:sz w:val="22"/>
+          <w:szCs w:val="20"/>
         </w:rPr>
         <w:t xml:space="preserve"> </w:t>
       </w:r>
-      <w:r>
-        <w:rPr>
-          <w:rFonts w:ascii="Arial" w:eastAsia="新細明體" w:hAnsi="Arial" w:cs="Arial"/>
-          <w:sz w:val="22"/>
-          <w:szCs w:val="20"/>
-        </w:rPr>
-        <w:t xml:space="preserve"> </w:t>
-      </w:r>
     </w:p>
     <w:p>
       <w:pPr>
@@ -5882,7 +5647,7 @@
       </w:r>
       <w:r>
         <w:rPr>
-          <w:rFonts w:ascii="Arial" w:eastAsia="新細明體" w:hAnsi="Arial" w:cs="Arial"/>
+          <w:rFonts w:ascii="Arial" w:eastAsia="PMingLiU" w:hAnsi="Arial" w:cs="Arial"/>
           <w:sz w:val="22"/>
           <w:szCs w:val="20"/>
         </w:rPr>
@@ -5950,43 +5715,7 @@
           <w:sz w:val="22"/>
           <w:szCs w:val="20"/>
         </w:rPr>
-        <w:t xml:space="preserve">In order to have a good estimate of β, the R built-in </w:t>
-      </w:r>
-      <w:proofErr w:type="spellStart"/>
-      <w:r>
-        <w:rPr>
-          <w:rFonts w:ascii="Arial" w:hAnsi="Arial" w:cs="Arial"/>
-          <w:sz w:val="22"/>
-          <w:szCs w:val="20"/>
-        </w:rPr>
-        <w:t>glm</w:t>
-      </w:r>
-      <w:proofErr w:type="spellEnd"/>
-      <w:r>
-        <w:rPr>
-          <w:rFonts w:ascii="Arial" w:hAnsi="Arial" w:cs="Arial"/>
-          <w:sz w:val="22"/>
-          <w:szCs w:val="20"/>
-        </w:rPr>
-        <w:t xml:space="preserve">() function is used whereas the last option “binomial” is the link function of logistic regression and the output is stored in </w:t>
-      </w:r>
-      <w:proofErr w:type="spellStart"/>
-      <w:r>
-        <w:rPr>
-          <w:rFonts w:ascii="Arial" w:hAnsi="Arial" w:cs="Arial"/>
-          <w:sz w:val="22"/>
-          <w:szCs w:val="20"/>
-        </w:rPr>
-        <w:t>Ireg</w:t>
-      </w:r>
-      <w:proofErr w:type="spellEnd"/>
-      <w:r>
-        <w:rPr>
-          <w:rFonts w:ascii="Arial" w:hAnsi="Arial" w:cs="Arial"/>
-          <w:sz w:val="22"/>
-          <w:szCs w:val="20"/>
-        </w:rPr>
-        <w:t xml:space="preserve">. By first run, the maximum likelihood estimation is large due to many outliers exist in the dataset. </w:t>
+        <w:t xml:space="preserve">In order to have a good estimate of β, the R built-in glm() function is used whereas the last option “binomial” is the link function of logistic regression and the output is stored in Ireg. By first run, the maximum likelihood estimation is large due to many outliers exist in the dataset. </w:t>
       </w:r>
     </w:p>
     <w:p>
@@ -6060,25 +5789,7 @@
           <w:sz w:val="22"/>
           <w:szCs w:val="20"/>
         </w:rPr>
-        <w:t xml:space="preserve">In addition, the above logistic regression will be implemented twice on both full set and 10% of the dataset. We would like to observe the difference in the significant variables and the machine time for running the </w:t>
-      </w:r>
-      <w:proofErr w:type="spellStart"/>
-      <w:r>
-        <w:rPr>
-          <w:rFonts w:ascii="Arial" w:hAnsi="Arial" w:cs="Arial"/>
-          <w:sz w:val="22"/>
-          <w:szCs w:val="20"/>
-        </w:rPr>
-        <w:t>programme</w:t>
-      </w:r>
-      <w:proofErr w:type="spellEnd"/>
-      <w:r>
-        <w:rPr>
-          <w:rFonts w:ascii="Arial" w:hAnsi="Arial" w:cs="Arial"/>
-          <w:sz w:val="22"/>
-          <w:szCs w:val="20"/>
-        </w:rPr>
-        <w:t>.</w:t>
+        <w:t>In addition, the above logistic regression will be implemented twice on both full set and 10% of the dataset. We would like to observe the difference in the significant variables and the machine time for running the programme.</w:t>
       </w:r>
     </w:p>
     <w:p>
@@ -6223,7 +5934,6 @@
               <w:bottom w:val="nil"/>
               <w:right w:val="single" w:sz="8" w:space="0" w:color="00B0F0"/>
             </w:tcBorders>
-            <w:shd w:val="clear" w:color="auto" w:fill="auto"/>
             <w:noWrap/>
             <w:vAlign w:val="bottom"/>
             <w:hideMark/>
@@ -6266,7 +5976,6 @@
               <w:bottom w:val="nil"/>
               <w:right w:val="nil"/>
             </w:tcBorders>
-            <w:shd w:val="clear" w:color="auto" w:fill="auto"/>
             <w:noWrap/>
             <w:vAlign w:val="bottom"/>
             <w:hideMark/>
@@ -6303,7 +6012,6 @@
               <w:bottom w:val="nil"/>
               <w:right w:val="nil"/>
             </w:tcBorders>
-            <w:shd w:val="clear" w:color="auto" w:fill="auto"/>
             <w:noWrap/>
             <w:vAlign w:val="bottom"/>
             <w:hideMark/>
@@ -6341,7 +6049,6 @@
               <w:bottom w:val="nil"/>
               <w:right w:val="single" w:sz="8" w:space="0" w:color="00B0F0"/>
             </w:tcBorders>
-            <w:shd w:val="clear" w:color="auto" w:fill="auto"/>
             <w:noWrap/>
             <w:vAlign w:val="bottom"/>
             <w:hideMark/>
@@ -6358,7 +6065,6 @@
                 <w:szCs w:val="20"/>
               </w:rPr>
             </w:pPr>
-            <w:proofErr w:type="spellStart"/>
             <w:r>
               <w:rPr>
                 <w:rFonts w:ascii="Arial" w:eastAsia="Times New Roman" w:hAnsi="Arial" w:cs="Arial"/>
@@ -6367,18 +6073,7 @@
                 <w:sz w:val="20"/>
                 <w:szCs w:val="20"/>
               </w:rPr>
-              <w:t>Pr</w:t>
-            </w:r>
-            <w:proofErr w:type="spellEnd"/>
-            <w:r>
-              <w:rPr>
-                <w:rFonts w:ascii="Arial" w:eastAsia="Times New Roman" w:hAnsi="Arial" w:cs="Arial"/>
-                <w:b/>
-                <w:bCs/>
-                <w:sz w:val="20"/>
-                <w:szCs w:val="20"/>
-              </w:rPr>
-              <w:t>(&gt;|z|)</w:t>
+              <w:t>Pr(&gt;|z|)</w:t>
             </w:r>
           </w:p>
         </w:tc>
@@ -6410,7 +6105,6 @@
                 <w:szCs w:val="20"/>
               </w:rPr>
             </w:pPr>
-            <w:proofErr w:type="spellStart"/>
             <w:r>
               <w:rPr>
                 <w:rFonts w:ascii="Arial" w:eastAsia="Times New Roman" w:hAnsi="Arial" w:cs="Arial"/>
@@ -6419,7 +6113,6 @@
               </w:rPr>
               <w:t>monthmar</w:t>
             </w:r>
-            <w:proofErr w:type="spellEnd"/>
           </w:p>
         </w:tc>
         <w:tc>
@@ -6431,7 +6124,6 @@
               <w:bottom w:val="nil"/>
               <w:right w:val="nil"/>
             </w:tcBorders>
-            <w:shd w:val="clear" w:color="auto" w:fill="auto"/>
             <w:noWrap/>
             <w:vAlign w:val="bottom"/>
             <w:hideMark/>
@@ -6465,7 +6157,6 @@
               <w:bottom w:val="nil"/>
               <w:right w:val="single" w:sz="8" w:space="0" w:color="00B0F0"/>
             </w:tcBorders>
-            <w:shd w:val="clear" w:color="auto" w:fill="auto"/>
             <w:noWrap/>
             <w:vAlign w:val="bottom"/>
             <w:hideMark/>
@@ -6518,7 +6209,6 @@
                 <w:szCs w:val="20"/>
               </w:rPr>
             </w:pPr>
-            <w:proofErr w:type="spellStart"/>
             <w:r>
               <w:rPr>
                 <w:rFonts w:ascii="Arial" w:eastAsia="Times New Roman" w:hAnsi="Arial" w:cs="Arial"/>
@@ -6527,7 +6217,6 @@
               </w:rPr>
               <w:t>cons.price.idx</w:t>
             </w:r>
-            <w:proofErr w:type="spellEnd"/>
           </w:p>
         </w:tc>
         <w:tc>
@@ -6539,7 +6228,6 @@
               <w:bottom w:val="nil"/>
               <w:right w:val="nil"/>
             </w:tcBorders>
-            <w:shd w:val="clear" w:color="auto" w:fill="auto"/>
             <w:noWrap/>
             <w:vAlign w:val="bottom"/>
             <w:hideMark/>
@@ -6573,7 +6261,6 @@
               <w:bottom w:val="nil"/>
               <w:right w:val="single" w:sz="8" w:space="0" w:color="00B0F0"/>
             </w:tcBorders>
-            <w:shd w:val="clear" w:color="auto" w:fill="auto"/>
             <w:noWrap/>
             <w:vAlign w:val="bottom"/>
             <w:hideMark/>
@@ -6626,7 +6313,6 @@
                 <w:szCs w:val="20"/>
               </w:rPr>
             </w:pPr>
-            <w:proofErr w:type="spellStart"/>
             <w:r>
               <w:rPr>
                 <w:rFonts w:ascii="Arial" w:eastAsia="Times New Roman" w:hAnsi="Arial" w:cs="Arial"/>
@@ -6635,7 +6321,6 @@
               </w:rPr>
               <w:t>poutcomenoexistent</w:t>
             </w:r>
-            <w:proofErr w:type="spellEnd"/>
           </w:p>
         </w:tc>
         <w:tc>
@@ -6647,7 +6332,6 @@
               <w:bottom w:val="nil"/>
               <w:right w:val="nil"/>
             </w:tcBorders>
-            <w:shd w:val="clear" w:color="auto" w:fill="auto"/>
             <w:noWrap/>
             <w:vAlign w:val="bottom"/>
             <w:hideMark/>
@@ -6681,7 +6365,6 @@
               <w:bottom w:val="nil"/>
               <w:right w:val="single" w:sz="8" w:space="0" w:color="00B0F0"/>
             </w:tcBorders>
-            <w:shd w:val="clear" w:color="auto" w:fill="auto"/>
             <w:noWrap/>
             <w:vAlign w:val="bottom"/>
             <w:hideMark/>
@@ -6734,7 +6417,6 @@
                 <w:szCs w:val="20"/>
               </w:rPr>
             </w:pPr>
-            <w:proofErr w:type="spellStart"/>
             <w:r>
               <w:rPr>
                 <w:rFonts w:ascii="Arial" w:eastAsia="Times New Roman" w:hAnsi="Arial" w:cs="Arial"/>
@@ -6743,7 +6425,6 @@
               </w:rPr>
               <w:t>cons.conf.idx</w:t>
             </w:r>
-            <w:proofErr w:type="spellEnd"/>
           </w:p>
         </w:tc>
         <w:tc>
@@ -6755,7 +6436,6 @@
               <w:bottom w:val="double" w:sz="6" w:space="0" w:color="00B0F0"/>
               <w:right w:val="nil"/>
             </w:tcBorders>
-            <w:shd w:val="clear" w:color="auto" w:fill="auto"/>
             <w:noWrap/>
             <w:vAlign w:val="bottom"/>
             <w:hideMark/>
@@ -6789,7 +6469,6 @@
               <w:bottom w:val="double" w:sz="6" w:space="0" w:color="00B0F0"/>
               <w:right w:val="single" w:sz="8" w:space="0" w:color="00B0F0"/>
             </w:tcBorders>
-            <w:shd w:val="clear" w:color="auto" w:fill="auto"/>
             <w:noWrap/>
             <w:vAlign w:val="bottom"/>
             <w:hideMark/>
@@ -6861,7 +6540,6 @@
               <w:bottom w:val="nil"/>
               <w:right w:val="nil"/>
             </w:tcBorders>
-            <w:shd w:val="clear" w:color="auto" w:fill="auto"/>
             <w:noWrap/>
             <w:vAlign w:val="bottom"/>
             <w:hideMark/>
@@ -6895,7 +6573,6 @@
               <w:bottom w:val="nil"/>
               <w:right w:val="single" w:sz="8" w:space="0" w:color="00B0F0"/>
             </w:tcBorders>
-            <w:shd w:val="clear" w:color="auto" w:fill="auto"/>
             <w:noWrap/>
             <w:vAlign w:val="bottom"/>
             <w:hideMark/>
@@ -6948,7 +6625,6 @@
                 <w:szCs w:val="20"/>
               </w:rPr>
             </w:pPr>
-            <w:proofErr w:type="spellStart"/>
             <w:r>
               <w:rPr>
                 <w:rFonts w:ascii="Arial" w:eastAsia="Times New Roman" w:hAnsi="Arial" w:cs="Arial"/>
@@ -6957,7 +6633,6 @@
               </w:rPr>
               <w:t>monthmay</w:t>
             </w:r>
-            <w:proofErr w:type="spellEnd"/>
           </w:p>
         </w:tc>
         <w:tc>
@@ -6969,7 +6644,6 @@
               <w:bottom w:val="nil"/>
               <w:right w:val="nil"/>
             </w:tcBorders>
-            <w:shd w:val="clear" w:color="auto" w:fill="auto"/>
             <w:noWrap/>
             <w:vAlign w:val="bottom"/>
             <w:hideMark/>
@@ -7003,7 +6677,6 @@
               <w:bottom w:val="nil"/>
               <w:right w:val="single" w:sz="8" w:space="0" w:color="00B0F0"/>
             </w:tcBorders>
-            <w:shd w:val="clear" w:color="auto" w:fill="auto"/>
             <w:noWrap/>
             <w:vAlign w:val="bottom"/>
             <w:hideMark/>
@@ -7056,7 +6729,6 @@
                 <w:szCs w:val="20"/>
               </w:rPr>
             </w:pPr>
-            <w:proofErr w:type="spellStart"/>
             <w:r>
               <w:rPr>
                 <w:rFonts w:ascii="Arial" w:eastAsia="Times New Roman" w:hAnsi="Arial" w:cs="Arial"/>
@@ -7065,7 +6737,6 @@
               </w:rPr>
               <w:t>emp.var.rate</w:t>
             </w:r>
-            <w:proofErr w:type="spellEnd"/>
           </w:p>
         </w:tc>
         <w:tc>
@@ -7077,7 +6748,6 @@
               <w:bottom w:val="nil"/>
               <w:right w:val="nil"/>
             </w:tcBorders>
-            <w:shd w:val="clear" w:color="auto" w:fill="auto"/>
             <w:noWrap/>
             <w:vAlign w:val="bottom"/>
             <w:hideMark/>
@@ -7111,7 +6781,6 @@
               <w:bottom w:val="nil"/>
               <w:right w:val="single" w:sz="8" w:space="0" w:color="00B0F0"/>
             </w:tcBorders>
-            <w:shd w:val="clear" w:color="auto" w:fill="auto"/>
             <w:noWrap/>
             <w:vAlign w:val="bottom"/>
             <w:hideMark/>
@@ -7164,7 +6833,6 @@
                 <w:szCs w:val="20"/>
               </w:rPr>
             </w:pPr>
-            <w:proofErr w:type="spellStart"/>
             <w:r>
               <w:rPr>
                 <w:rFonts w:ascii="Arial" w:eastAsia="Times New Roman" w:hAnsi="Arial" w:cs="Arial"/>
@@ -7173,7 +6841,6 @@
               </w:rPr>
               <w:t>contacttelephone</w:t>
             </w:r>
-            <w:proofErr w:type="spellEnd"/>
           </w:p>
         </w:tc>
         <w:tc>
@@ -7185,7 +6852,6 @@
               <w:bottom w:val="nil"/>
               <w:right w:val="nil"/>
             </w:tcBorders>
-            <w:shd w:val="clear" w:color="auto" w:fill="auto"/>
             <w:noWrap/>
             <w:vAlign w:val="bottom"/>
             <w:hideMark/>
@@ -7219,7 +6885,6 @@
               <w:bottom w:val="nil"/>
               <w:right w:val="single" w:sz="8" w:space="0" w:color="00B0F0"/>
             </w:tcBorders>
-            <w:shd w:val="clear" w:color="auto" w:fill="auto"/>
             <w:noWrap/>
             <w:vAlign w:val="bottom"/>
             <w:hideMark/>
@@ -7291,7 +6956,6 @@
               <w:bottom w:val="single" w:sz="8" w:space="0" w:color="00B0F0"/>
               <w:right w:val="nil"/>
             </w:tcBorders>
-            <w:shd w:val="clear" w:color="auto" w:fill="auto"/>
             <w:noWrap/>
             <w:vAlign w:val="bottom"/>
             <w:hideMark/>
@@ -7325,7 +6989,6 @@
               <w:bottom w:val="single" w:sz="8" w:space="0" w:color="00B0F0"/>
               <w:right w:val="single" w:sz="8" w:space="0" w:color="00B0F0"/>
             </w:tcBorders>
-            <w:shd w:val="clear" w:color="auto" w:fill="auto"/>
             <w:noWrap/>
             <w:vAlign w:val="bottom"/>
             <w:hideMark/>
@@ -7356,7 +7019,7 @@
       <w:pPr>
         <w:spacing w:line="240" w:lineRule="exact"/>
         <w:rPr>
-          <w:rFonts w:ascii="Arial" w:eastAsia="新細明體" w:hAnsi="Arial" w:cs="Arial"/>
+          <w:rFonts w:ascii="Arial" w:eastAsia="PMingLiU" w:hAnsi="Arial" w:cs="Arial"/>
           <w:b/>
           <w:sz w:val="22"/>
           <w:szCs w:val="20"/>
@@ -7365,7 +7028,7 @@
       </w:pPr>
       <w:r>
         <w:rPr>
-          <w:rFonts w:ascii="Arial" w:eastAsia="新細明體" w:hAnsi="Arial" w:cs="Arial"/>
+          <w:rFonts w:ascii="Arial" w:eastAsia="PMingLiU" w:hAnsi="Arial" w:cs="Arial"/>
           <w:b/>
           <w:sz w:val="22"/>
           <w:szCs w:val="20"/>
@@ -7375,7 +7038,7 @@
       </w:r>
       <w:r>
         <w:rPr>
-          <w:rFonts w:ascii="Arial" w:eastAsia="新細明體" w:hAnsi="Arial" w:cs="Arial"/>
+          <w:rFonts w:ascii="Arial" w:eastAsia="PMingLiU" w:hAnsi="Arial" w:cs="Arial"/>
           <w:b/>
           <w:sz w:val="22"/>
           <w:szCs w:val="20"/>
@@ -7388,7 +7051,7 @@
       <w:pPr>
         <w:spacing w:line="240" w:lineRule="exact"/>
         <w:rPr>
-          <w:rFonts w:ascii="Arial" w:eastAsia="新細明體" w:hAnsi="Arial" w:cs="Arial"/>
+          <w:rFonts w:ascii="Arial" w:eastAsia="PMingLiU" w:hAnsi="Arial" w:cs="Arial"/>
           <w:b/>
           <w:sz w:val="20"/>
           <w:szCs w:val="20"/>
@@ -7401,14 +7064,14 @@
         <w:spacing w:line="240" w:lineRule="exact"/>
         <w:jc w:val="both"/>
         <w:rPr>
-          <w:rFonts w:ascii="Arial" w:eastAsia="新細明體" w:hAnsi="Arial" w:cs="Arial"/>
-          <w:sz w:val="22"/>
-          <w:szCs w:val="20"/>
-        </w:rPr>
-      </w:pPr>
-      <w:r>
-        <w:rPr>
-          <w:rFonts w:ascii="Arial" w:eastAsia="新細明體" w:hAnsi="Arial" w:cs="Arial"/>
+          <w:rFonts w:ascii="Arial" w:eastAsia="PMingLiU" w:hAnsi="Arial" w:cs="Arial"/>
+          <w:sz w:val="22"/>
+          <w:szCs w:val="20"/>
+        </w:rPr>
+      </w:pPr>
+      <w:r>
+        <w:rPr>
+          <w:rFonts w:ascii="Arial" w:eastAsia="PMingLiU" w:hAnsi="Arial" w:cs="Arial"/>
           <w:sz w:val="22"/>
           <w:szCs w:val="20"/>
         </w:rPr>
@@ -7419,7 +7082,7 @@
       <w:pPr>
         <w:spacing w:line="240" w:lineRule="exact"/>
         <w:rPr>
-          <w:rFonts w:ascii="Arial" w:eastAsia="新細明體" w:hAnsi="Arial" w:cs="Arial"/>
+          <w:rFonts w:ascii="Arial" w:eastAsia="PMingLiU" w:hAnsi="Arial" w:cs="Arial"/>
           <w:sz w:val="20"/>
           <w:szCs w:val="20"/>
         </w:rPr>
@@ -7450,7 +7113,6 @@
               <w:bottom w:val="nil"/>
               <w:right w:val="single" w:sz="8" w:space="0" w:color="00B0F0"/>
             </w:tcBorders>
-            <w:shd w:val="clear" w:color="auto" w:fill="auto"/>
             <w:noWrap/>
             <w:vAlign w:val="bottom"/>
             <w:hideMark/>
@@ -7493,7 +7155,6 @@
               <w:bottom w:val="nil"/>
               <w:right w:val="nil"/>
             </w:tcBorders>
-            <w:shd w:val="clear" w:color="auto" w:fill="auto"/>
             <w:noWrap/>
             <w:vAlign w:val="bottom"/>
             <w:hideMark/>
@@ -7530,7 +7191,6 @@
               <w:bottom w:val="nil"/>
               <w:right w:val="nil"/>
             </w:tcBorders>
-            <w:shd w:val="clear" w:color="auto" w:fill="auto"/>
             <w:noWrap/>
             <w:vAlign w:val="bottom"/>
             <w:hideMark/>
@@ -7568,7 +7228,6 @@
               <w:bottom w:val="nil"/>
               <w:right w:val="single" w:sz="8" w:space="0" w:color="00B0F0"/>
             </w:tcBorders>
-            <w:shd w:val="clear" w:color="auto" w:fill="auto"/>
             <w:noWrap/>
             <w:vAlign w:val="bottom"/>
             <w:hideMark/>
@@ -7585,7 +7244,6 @@
                 <w:szCs w:val="20"/>
               </w:rPr>
             </w:pPr>
-            <w:proofErr w:type="spellStart"/>
             <w:r>
               <w:rPr>
                 <w:rFonts w:ascii="Arial" w:eastAsia="Times New Roman" w:hAnsi="Arial" w:cs="Arial"/>
@@ -7594,18 +7252,7 @@
                 <w:sz w:val="20"/>
                 <w:szCs w:val="20"/>
               </w:rPr>
-              <w:t>Pr</w:t>
-            </w:r>
-            <w:proofErr w:type="spellEnd"/>
-            <w:r>
-              <w:rPr>
-                <w:rFonts w:ascii="Arial" w:eastAsia="Times New Roman" w:hAnsi="Arial" w:cs="Arial"/>
-                <w:b/>
-                <w:bCs/>
-                <w:sz w:val="20"/>
-                <w:szCs w:val="20"/>
-              </w:rPr>
-              <w:t>(&gt;|z|)</w:t>
+              <w:t>Pr(&gt;|z|)</w:t>
             </w:r>
           </w:p>
         </w:tc>
@@ -7637,7 +7284,6 @@
                 <w:szCs w:val="20"/>
               </w:rPr>
             </w:pPr>
-            <w:proofErr w:type="spellStart"/>
             <w:r>
               <w:rPr>
                 <w:rFonts w:ascii="Arial" w:eastAsia="Times New Roman" w:hAnsi="Arial" w:cs="Arial"/>
@@ -7646,7 +7292,6 @@
               </w:rPr>
               <w:t>cons.price.idx</w:t>
             </w:r>
-            <w:proofErr w:type="spellEnd"/>
           </w:p>
         </w:tc>
         <w:tc>
@@ -7658,7 +7303,6 @@
               <w:bottom w:val="nil"/>
               <w:right w:val="nil"/>
             </w:tcBorders>
-            <w:shd w:val="clear" w:color="auto" w:fill="auto"/>
             <w:noWrap/>
             <w:vAlign w:val="bottom"/>
             <w:hideMark/>
@@ -7692,7 +7336,6 @@
               <w:bottom w:val="nil"/>
               <w:right w:val="single" w:sz="8" w:space="0" w:color="00B0F0"/>
             </w:tcBorders>
-            <w:shd w:val="clear" w:color="auto" w:fill="auto"/>
             <w:noWrap/>
             <w:vAlign w:val="bottom"/>
             <w:hideMark/>
@@ -7745,7 +7388,6 @@
                 <w:szCs w:val="20"/>
               </w:rPr>
             </w:pPr>
-            <w:proofErr w:type="spellStart"/>
             <w:r>
               <w:rPr>
                 <w:rFonts w:ascii="Arial" w:eastAsia="Times New Roman" w:hAnsi="Arial" w:cs="Arial"/>
@@ -7754,7 +7396,6 @@
               </w:rPr>
               <w:t>monthmar</w:t>
             </w:r>
-            <w:proofErr w:type="spellEnd"/>
           </w:p>
         </w:tc>
         <w:tc>
@@ -7766,7 +7407,6 @@
               <w:bottom w:val="nil"/>
               <w:right w:val="nil"/>
             </w:tcBorders>
-            <w:shd w:val="clear" w:color="auto" w:fill="auto"/>
             <w:noWrap/>
             <w:vAlign w:val="bottom"/>
             <w:hideMark/>
@@ -7800,7 +7440,6 @@
               <w:bottom w:val="nil"/>
               <w:right w:val="single" w:sz="8" w:space="0" w:color="00B0F0"/>
             </w:tcBorders>
-            <w:shd w:val="clear" w:color="auto" w:fill="auto"/>
             <w:noWrap/>
             <w:vAlign w:val="bottom"/>
             <w:hideMark/>
@@ -7839,7 +7478,6 @@
               <w:bottom w:val="nil"/>
               <w:right w:val="nil"/>
             </w:tcBorders>
-            <w:shd w:val="clear" w:color="auto" w:fill="auto"/>
             <w:noWrap/>
             <w:vAlign w:val="bottom"/>
             <w:hideMark/>
@@ -7853,7 +7491,6 @@
                 <w:szCs w:val="20"/>
               </w:rPr>
             </w:pPr>
-            <w:proofErr w:type="spellStart"/>
             <w:r>
               <w:rPr>
                 <w:rFonts w:ascii="Arial" w:eastAsia="Times New Roman" w:hAnsi="Arial" w:cs="Arial"/>
@@ -7862,7 +7499,6 @@
               </w:rPr>
               <w:t>poutcomesuccess</w:t>
             </w:r>
-            <w:proofErr w:type="spellEnd"/>
           </w:p>
         </w:tc>
         <w:tc>
@@ -7874,7 +7510,6 @@
               <w:bottom w:val="nil"/>
               <w:right w:val="nil"/>
             </w:tcBorders>
-            <w:shd w:val="clear" w:color="auto" w:fill="auto"/>
             <w:noWrap/>
             <w:vAlign w:val="bottom"/>
             <w:hideMark/>
@@ -7908,7 +7543,6 @@
               <w:bottom w:val="nil"/>
               <w:right w:val="single" w:sz="8" w:space="0" w:color="00B0F0"/>
             </w:tcBorders>
-            <w:shd w:val="clear" w:color="auto" w:fill="auto"/>
             <w:noWrap/>
             <w:vAlign w:val="bottom"/>
             <w:hideMark/>
@@ -7961,7 +7595,6 @@
                 <w:szCs w:val="20"/>
               </w:rPr>
             </w:pPr>
-            <w:proofErr w:type="spellStart"/>
             <w:r>
               <w:rPr>
                 <w:rFonts w:ascii="Arial" w:eastAsia="Times New Roman" w:hAnsi="Arial" w:cs="Arial"/>
@@ -7970,7 +7603,6 @@
               </w:rPr>
               <w:t>poutcomenonexistent</w:t>
             </w:r>
-            <w:proofErr w:type="spellEnd"/>
           </w:p>
         </w:tc>
         <w:tc>
@@ -7982,7 +7614,6 @@
               <w:bottom w:val="nil"/>
               <w:right w:val="nil"/>
             </w:tcBorders>
-            <w:shd w:val="clear" w:color="auto" w:fill="auto"/>
             <w:noWrap/>
             <w:vAlign w:val="bottom"/>
             <w:hideMark/>
@@ -8016,7 +7647,6 @@
               <w:bottom w:val="nil"/>
               <w:right w:val="single" w:sz="8" w:space="0" w:color="00B0F0"/>
             </w:tcBorders>
-            <w:shd w:val="clear" w:color="auto" w:fill="auto"/>
             <w:noWrap/>
             <w:vAlign w:val="bottom"/>
             <w:hideMark/>
@@ -8055,7 +7685,6 @@
               <w:bottom w:val="nil"/>
               <w:right w:val="nil"/>
             </w:tcBorders>
-            <w:shd w:val="clear" w:color="auto" w:fill="auto"/>
             <w:noWrap/>
             <w:vAlign w:val="bottom"/>
             <w:hideMark/>
@@ -8069,7 +7698,6 @@
                 <w:szCs w:val="20"/>
               </w:rPr>
             </w:pPr>
-            <w:proofErr w:type="spellStart"/>
             <w:r>
               <w:rPr>
                 <w:rFonts w:ascii="Arial" w:eastAsia="Times New Roman" w:hAnsi="Arial" w:cs="Arial"/>
@@ -8078,7 +7706,6 @@
               </w:rPr>
               <w:t>monthaug</w:t>
             </w:r>
-            <w:proofErr w:type="spellEnd"/>
           </w:p>
         </w:tc>
         <w:tc>
@@ -8090,7 +7717,6 @@
               <w:bottom w:val="nil"/>
               <w:right w:val="nil"/>
             </w:tcBorders>
-            <w:shd w:val="clear" w:color="auto" w:fill="auto"/>
             <w:noWrap/>
             <w:vAlign w:val="bottom"/>
             <w:hideMark/>
@@ -8124,7 +7750,6 @@
               <w:bottom w:val="nil"/>
               <w:right w:val="single" w:sz="8" w:space="0" w:color="00B0F0"/>
             </w:tcBorders>
-            <w:shd w:val="clear" w:color="auto" w:fill="auto"/>
             <w:noWrap/>
             <w:vAlign w:val="bottom"/>
             <w:hideMark/>
@@ -8163,7 +7788,6 @@
               <w:bottom w:val="nil"/>
               <w:right w:val="nil"/>
             </w:tcBorders>
-            <w:shd w:val="clear" w:color="auto" w:fill="auto"/>
             <w:noWrap/>
             <w:vAlign w:val="bottom"/>
             <w:hideMark/>
@@ -8196,7 +7820,6 @@
               <w:bottom w:val="nil"/>
               <w:right w:val="nil"/>
             </w:tcBorders>
-            <w:shd w:val="clear" w:color="auto" w:fill="auto"/>
             <w:noWrap/>
             <w:vAlign w:val="bottom"/>
             <w:hideMark/>
@@ -8230,7 +7853,6 @@
               <w:bottom w:val="nil"/>
               <w:right w:val="single" w:sz="8" w:space="0" w:color="00B0F0"/>
             </w:tcBorders>
-            <w:shd w:val="clear" w:color="auto" w:fill="auto"/>
             <w:noWrap/>
             <w:vAlign w:val="bottom"/>
             <w:hideMark/>
@@ -8269,7 +7891,6 @@
               <w:bottom w:val="nil"/>
               <w:right w:val="nil"/>
             </w:tcBorders>
-            <w:shd w:val="clear" w:color="auto" w:fill="auto"/>
             <w:noWrap/>
             <w:vAlign w:val="bottom"/>
             <w:hideMark/>
@@ -8283,7 +7904,6 @@
                 <w:szCs w:val="20"/>
               </w:rPr>
             </w:pPr>
-            <w:proofErr w:type="spellStart"/>
             <w:r>
               <w:rPr>
                 <w:rFonts w:ascii="Arial" w:eastAsia="Times New Roman" w:hAnsi="Arial" w:cs="Arial"/>
@@ -8292,7 +7912,6 @@
               </w:rPr>
               <w:t>jobstudent</w:t>
             </w:r>
-            <w:proofErr w:type="spellEnd"/>
           </w:p>
         </w:tc>
         <w:tc>
@@ -8304,7 +7923,6 @@
               <w:bottom w:val="nil"/>
               <w:right w:val="nil"/>
             </w:tcBorders>
-            <w:shd w:val="clear" w:color="auto" w:fill="auto"/>
             <w:noWrap/>
             <w:vAlign w:val="bottom"/>
             <w:hideMark/>
@@ -8338,7 +7956,6 @@
               <w:bottom w:val="nil"/>
               <w:right w:val="single" w:sz="8" w:space="0" w:color="00B0F0"/>
             </w:tcBorders>
-            <w:shd w:val="clear" w:color="auto" w:fill="auto"/>
             <w:noWrap/>
             <w:vAlign w:val="bottom"/>
             <w:hideMark/>
@@ -8377,7 +7994,6 @@
               <w:bottom w:val="nil"/>
               <w:right w:val="nil"/>
             </w:tcBorders>
-            <w:shd w:val="clear" w:color="auto" w:fill="auto"/>
             <w:noWrap/>
             <w:vAlign w:val="bottom"/>
             <w:hideMark/>
@@ -8391,7 +8007,6 @@
                 <w:szCs w:val="20"/>
               </w:rPr>
             </w:pPr>
-            <w:proofErr w:type="spellStart"/>
             <w:r>
               <w:rPr>
                 <w:rFonts w:ascii="Arial" w:eastAsia="Times New Roman" w:hAnsi="Arial" w:cs="Arial"/>
@@ -8400,7 +8015,6 @@
               </w:rPr>
               <w:t>jobretired</w:t>
             </w:r>
-            <w:proofErr w:type="spellEnd"/>
           </w:p>
         </w:tc>
         <w:tc>
@@ -8412,7 +8026,6 @@
               <w:bottom w:val="nil"/>
               <w:right w:val="nil"/>
             </w:tcBorders>
-            <w:shd w:val="clear" w:color="auto" w:fill="auto"/>
             <w:noWrap/>
             <w:vAlign w:val="bottom"/>
             <w:hideMark/>
@@ -8446,7 +8059,6 @@
               <w:bottom w:val="nil"/>
               <w:right w:val="single" w:sz="8" w:space="0" w:color="00B0F0"/>
             </w:tcBorders>
-            <w:shd w:val="clear" w:color="auto" w:fill="auto"/>
             <w:noWrap/>
             <w:vAlign w:val="bottom"/>
             <w:hideMark/>
@@ -8499,7 +8111,6 @@
                 <w:szCs w:val="20"/>
               </w:rPr>
             </w:pPr>
-            <w:proofErr w:type="spellStart"/>
             <w:r>
               <w:rPr>
                 <w:rFonts w:ascii="Arial" w:eastAsia="Times New Roman" w:hAnsi="Arial" w:cs="Arial"/>
@@ -8508,7 +8119,6 @@
               </w:rPr>
               <w:t>cons.conf.idx</w:t>
             </w:r>
-            <w:proofErr w:type="spellEnd"/>
           </w:p>
         </w:tc>
         <w:tc>
@@ -8520,7 +8130,6 @@
               <w:bottom w:val="double" w:sz="4" w:space="0" w:color="5B9BD5" w:themeColor="accent1"/>
               <w:right w:val="nil"/>
             </w:tcBorders>
-            <w:shd w:val="clear" w:color="auto" w:fill="auto"/>
             <w:noWrap/>
             <w:vAlign w:val="bottom"/>
             <w:hideMark/>
@@ -8554,7 +8163,6 @@
               <w:bottom w:val="double" w:sz="4" w:space="0" w:color="5B9BD5" w:themeColor="accent1"/>
               <w:right w:val="single" w:sz="8" w:space="0" w:color="00B0F0"/>
             </w:tcBorders>
-            <w:shd w:val="clear" w:color="auto" w:fill="auto"/>
             <w:noWrap/>
             <w:vAlign w:val="bottom"/>
             <w:hideMark/>
@@ -8593,7 +8201,6 @@
               <w:bottom w:val="nil"/>
               <w:right w:val="nil"/>
             </w:tcBorders>
-            <w:shd w:val="clear" w:color="auto" w:fill="auto"/>
             <w:noWrap/>
             <w:vAlign w:val="bottom"/>
             <w:hideMark/>
@@ -8607,7 +8214,6 @@
                 <w:szCs w:val="20"/>
               </w:rPr>
             </w:pPr>
-            <w:proofErr w:type="spellStart"/>
             <w:r>
               <w:rPr>
                 <w:rFonts w:ascii="Arial" w:eastAsia="Times New Roman" w:hAnsi="Arial" w:cs="Arial"/>
@@ -8616,7 +8222,6 @@
               </w:rPr>
               <w:t>pdays</w:t>
             </w:r>
-            <w:proofErr w:type="spellEnd"/>
           </w:p>
         </w:tc>
         <w:tc>
@@ -8628,7 +8233,6 @@
               <w:bottom w:val="nil"/>
               <w:right w:val="nil"/>
             </w:tcBorders>
-            <w:shd w:val="clear" w:color="auto" w:fill="auto"/>
             <w:noWrap/>
             <w:vAlign w:val="bottom"/>
             <w:hideMark/>
@@ -8662,7 +8266,6 @@
               <w:bottom w:val="nil"/>
               <w:right w:val="single" w:sz="8" w:space="0" w:color="00B0F0"/>
             </w:tcBorders>
-            <w:shd w:val="clear" w:color="auto" w:fill="auto"/>
             <w:noWrap/>
             <w:vAlign w:val="bottom"/>
             <w:hideMark/>
@@ -8734,7 +8337,6 @@
               <w:bottom w:val="nil"/>
               <w:right w:val="nil"/>
             </w:tcBorders>
-            <w:shd w:val="clear" w:color="auto" w:fill="auto"/>
             <w:noWrap/>
             <w:vAlign w:val="bottom"/>
             <w:hideMark/>
@@ -8768,7 +8370,6 @@
               <w:bottom w:val="nil"/>
               <w:right w:val="single" w:sz="8" w:space="0" w:color="00B0F0"/>
             </w:tcBorders>
-            <w:shd w:val="clear" w:color="auto" w:fill="auto"/>
             <w:noWrap/>
             <w:vAlign w:val="bottom"/>
             <w:hideMark/>
@@ -8807,7 +8408,6 @@
               <w:bottom w:val="nil"/>
               <w:right w:val="nil"/>
             </w:tcBorders>
-            <w:shd w:val="clear" w:color="auto" w:fill="auto"/>
             <w:noWrap/>
             <w:vAlign w:val="bottom"/>
             <w:hideMark/>
@@ -8821,7 +8421,6 @@
                 <w:szCs w:val="20"/>
               </w:rPr>
             </w:pPr>
-            <w:proofErr w:type="spellStart"/>
             <w:r>
               <w:rPr>
                 <w:rFonts w:ascii="Arial" w:eastAsia="Times New Roman" w:hAnsi="Arial" w:cs="Arial"/>
@@ -8830,7 +8429,6 @@
               </w:rPr>
               <w:t>jobservices</w:t>
             </w:r>
-            <w:proofErr w:type="spellEnd"/>
           </w:p>
         </w:tc>
         <w:tc>
@@ -8842,7 +8440,6 @@
               <w:bottom w:val="nil"/>
               <w:right w:val="nil"/>
             </w:tcBorders>
-            <w:shd w:val="clear" w:color="auto" w:fill="auto"/>
             <w:noWrap/>
             <w:vAlign w:val="bottom"/>
             <w:hideMark/>
@@ -8876,7 +8473,6 @@
               <w:bottom w:val="nil"/>
               <w:right w:val="single" w:sz="8" w:space="0" w:color="00B0F0"/>
             </w:tcBorders>
-            <w:shd w:val="clear" w:color="auto" w:fill="auto"/>
             <w:noWrap/>
             <w:vAlign w:val="bottom"/>
             <w:hideMark/>
@@ -8915,7 +8511,6 @@
               <w:bottom w:val="nil"/>
               <w:right w:val="nil"/>
             </w:tcBorders>
-            <w:shd w:val="clear" w:color="auto" w:fill="auto"/>
             <w:noWrap/>
             <w:vAlign w:val="bottom"/>
             <w:hideMark/>
@@ -8929,23 +8524,13 @@
                 <w:szCs w:val="20"/>
               </w:rPr>
             </w:pPr>
-            <w:proofErr w:type="spellStart"/>
-            <w:r>
-              <w:rPr>
-                <w:rFonts w:ascii="Arial" w:eastAsia="Times New Roman" w:hAnsi="Arial" w:cs="Arial"/>
-                <w:sz w:val="20"/>
-                <w:szCs w:val="20"/>
-              </w:rPr>
-              <w:t>jobblue</w:t>
-            </w:r>
-            <w:proofErr w:type="spellEnd"/>
-            <w:r>
-              <w:rPr>
-                <w:rFonts w:ascii="Arial" w:eastAsia="Times New Roman" w:hAnsi="Arial" w:cs="Arial"/>
-                <w:sz w:val="20"/>
-                <w:szCs w:val="20"/>
-              </w:rPr>
-              <w:t>-collar</w:t>
+            <w:r>
+              <w:rPr>
+                <w:rFonts w:ascii="Arial" w:eastAsia="Times New Roman" w:hAnsi="Arial" w:cs="Arial"/>
+                <w:sz w:val="20"/>
+                <w:szCs w:val="20"/>
+              </w:rPr>
+              <w:t>jobblue-collar</w:t>
             </w:r>
           </w:p>
         </w:tc>
@@ -8958,7 +8543,6 @@
               <w:bottom w:val="nil"/>
               <w:right w:val="nil"/>
             </w:tcBorders>
-            <w:shd w:val="clear" w:color="auto" w:fill="auto"/>
             <w:noWrap/>
             <w:vAlign w:val="bottom"/>
             <w:hideMark/>
@@ -8992,7 +8576,6 @@
               <w:bottom w:val="nil"/>
               <w:right w:val="single" w:sz="8" w:space="0" w:color="00B0F0"/>
             </w:tcBorders>
-            <w:shd w:val="clear" w:color="auto" w:fill="auto"/>
             <w:noWrap/>
             <w:vAlign w:val="bottom"/>
             <w:hideMark/>
@@ -9031,7 +8614,6 @@
               <w:bottom w:val="nil"/>
               <w:right w:val="nil"/>
             </w:tcBorders>
-            <w:shd w:val="clear" w:color="auto" w:fill="auto"/>
             <w:noWrap/>
             <w:vAlign w:val="bottom"/>
             <w:hideMark/>
@@ -9045,7 +8627,6 @@
                 <w:szCs w:val="20"/>
               </w:rPr>
             </w:pPr>
-            <w:proofErr w:type="spellStart"/>
             <w:r>
               <w:rPr>
                 <w:rFonts w:ascii="Arial" w:eastAsia="Times New Roman" w:hAnsi="Arial" w:cs="Arial"/>
@@ -9054,7 +8635,6 @@
               </w:rPr>
               <w:t>day_of_weekmon</w:t>
             </w:r>
-            <w:proofErr w:type="spellEnd"/>
           </w:p>
         </w:tc>
         <w:tc>
@@ -9066,7 +8646,6 @@
               <w:bottom w:val="nil"/>
               <w:right w:val="nil"/>
             </w:tcBorders>
-            <w:shd w:val="clear" w:color="auto" w:fill="auto"/>
             <w:noWrap/>
             <w:vAlign w:val="bottom"/>
             <w:hideMark/>
@@ -9100,7 +8679,6 @@
               <w:bottom w:val="nil"/>
               <w:right w:val="single" w:sz="8" w:space="0" w:color="00B0F0"/>
             </w:tcBorders>
-            <w:shd w:val="clear" w:color="auto" w:fill="auto"/>
             <w:noWrap/>
             <w:vAlign w:val="bottom"/>
             <w:hideMark/>
@@ -9139,7 +8717,6 @@
               <w:bottom w:val="nil"/>
               <w:right w:val="nil"/>
             </w:tcBorders>
-            <w:shd w:val="clear" w:color="auto" w:fill="auto"/>
             <w:noWrap/>
             <w:vAlign w:val="bottom"/>
             <w:hideMark/>
@@ -9153,7 +8730,6 @@
                 <w:szCs w:val="20"/>
               </w:rPr>
             </w:pPr>
-            <w:proofErr w:type="spellStart"/>
             <w:r>
               <w:rPr>
                 <w:rFonts w:ascii="Arial" w:eastAsia="Times New Roman" w:hAnsi="Arial" w:cs="Arial"/>
@@ -9162,7 +8738,6 @@
               </w:rPr>
               <w:t>defaultunknown</w:t>
             </w:r>
-            <w:proofErr w:type="spellEnd"/>
           </w:p>
         </w:tc>
         <w:tc>
@@ -9174,7 +8749,6 @@
               <w:bottom w:val="nil"/>
               <w:right w:val="nil"/>
             </w:tcBorders>
-            <w:shd w:val="clear" w:color="auto" w:fill="auto"/>
             <w:noWrap/>
             <w:vAlign w:val="bottom"/>
             <w:hideMark/>
@@ -9208,7 +8782,6 @@
               <w:bottom w:val="nil"/>
               <w:right w:val="single" w:sz="8" w:space="0" w:color="00B0F0"/>
             </w:tcBorders>
-            <w:shd w:val="clear" w:color="auto" w:fill="auto"/>
             <w:noWrap/>
             <w:vAlign w:val="bottom"/>
             <w:hideMark/>
@@ -9261,7 +8834,6 @@
                 <w:szCs w:val="20"/>
               </w:rPr>
             </w:pPr>
-            <w:proofErr w:type="spellStart"/>
             <w:r>
               <w:rPr>
                 <w:rFonts w:ascii="Arial" w:eastAsia="Times New Roman" w:hAnsi="Arial" w:cs="Arial"/>
@@ -9270,7 +8842,6 @@
               </w:rPr>
               <w:t>monthmay</w:t>
             </w:r>
-            <w:proofErr w:type="spellEnd"/>
           </w:p>
         </w:tc>
         <w:tc>
@@ -9282,7 +8853,6 @@
               <w:bottom w:val="nil"/>
               <w:right w:val="nil"/>
             </w:tcBorders>
-            <w:shd w:val="clear" w:color="auto" w:fill="auto"/>
             <w:noWrap/>
             <w:vAlign w:val="bottom"/>
             <w:hideMark/>
@@ -9316,7 +8886,6 @@
               <w:bottom w:val="nil"/>
               <w:right w:val="single" w:sz="8" w:space="0" w:color="00B0F0"/>
             </w:tcBorders>
-            <w:shd w:val="clear" w:color="auto" w:fill="auto"/>
             <w:noWrap/>
             <w:vAlign w:val="bottom"/>
             <w:hideMark/>
@@ -9369,7 +8938,6 @@
                 <w:szCs w:val="20"/>
               </w:rPr>
             </w:pPr>
-            <w:proofErr w:type="spellStart"/>
             <w:r>
               <w:rPr>
                 <w:rFonts w:ascii="Arial" w:eastAsia="Times New Roman" w:hAnsi="Arial" w:cs="Arial"/>
@@ -9378,7 +8946,6 @@
               </w:rPr>
               <w:t>monthnov</w:t>
             </w:r>
-            <w:proofErr w:type="spellEnd"/>
           </w:p>
         </w:tc>
         <w:tc>
@@ -9390,7 +8957,6 @@
               <w:bottom w:val="nil"/>
               <w:right w:val="nil"/>
             </w:tcBorders>
-            <w:shd w:val="clear" w:color="auto" w:fill="auto"/>
             <w:noWrap/>
             <w:vAlign w:val="bottom"/>
             <w:hideMark/>
@@ -9424,7 +8990,6 @@
               <w:bottom w:val="nil"/>
               <w:right w:val="single" w:sz="8" w:space="0" w:color="00B0F0"/>
             </w:tcBorders>
-            <w:shd w:val="clear" w:color="auto" w:fill="auto"/>
             <w:noWrap/>
             <w:vAlign w:val="bottom"/>
             <w:hideMark/>
@@ -9463,7 +9028,6 @@
               <w:bottom w:val="nil"/>
               <w:right w:val="nil"/>
             </w:tcBorders>
-            <w:shd w:val="clear" w:color="auto" w:fill="auto"/>
             <w:noWrap/>
             <w:vAlign w:val="bottom"/>
             <w:hideMark/>
@@ -9477,7 +9041,6 @@
                 <w:szCs w:val="20"/>
               </w:rPr>
             </w:pPr>
-            <w:proofErr w:type="spellStart"/>
             <w:r>
               <w:rPr>
                 <w:rFonts w:ascii="Arial" w:eastAsia="Times New Roman" w:hAnsi="Arial" w:cs="Arial"/>
@@ -9486,7 +9049,6 @@
               </w:rPr>
               <w:t>monthjun</w:t>
             </w:r>
-            <w:proofErr w:type="spellEnd"/>
           </w:p>
         </w:tc>
         <w:tc>
@@ -9498,7 +9060,6 @@
               <w:bottom w:val="nil"/>
               <w:right w:val="nil"/>
             </w:tcBorders>
-            <w:shd w:val="clear" w:color="auto" w:fill="auto"/>
             <w:noWrap/>
             <w:vAlign w:val="bottom"/>
             <w:hideMark/>
@@ -9532,7 +9093,6 @@
               <w:bottom w:val="nil"/>
               <w:right w:val="single" w:sz="8" w:space="0" w:color="00B0F0"/>
             </w:tcBorders>
-            <w:shd w:val="clear" w:color="auto" w:fill="auto"/>
             <w:noWrap/>
             <w:vAlign w:val="bottom"/>
             <w:hideMark/>
@@ -9585,7 +9145,6 @@
                 <w:szCs w:val="20"/>
               </w:rPr>
             </w:pPr>
-            <w:proofErr w:type="spellStart"/>
             <w:r>
               <w:rPr>
                 <w:rFonts w:ascii="Arial" w:eastAsia="Times New Roman" w:hAnsi="Arial" w:cs="Arial"/>
@@ -9594,7 +9153,6 @@
               </w:rPr>
               <w:t>contacttelephone</w:t>
             </w:r>
-            <w:proofErr w:type="spellEnd"/>
           </w:p>
         </w:tc>
         <w:tc>
@@ -9606,7 +9164,6 @@
               <w:bottom w:val="nil"/>
               <w:right w:val="nil"/>
             </w:tcBorders>
-            <w:shd w:val="clear" w:color="auto" w:fill="auto"/>
             <w:noWrap/>
             <w:vAlign w:val="bottom"/>
             <w:hideMark/>
@@ -9640,7 +9197,6 @@
               <w:bottom w:val="nil"/>
               <w:right w:val="single" w:sz="8" w:space="0" w:color="00B0F0"/>
             </w:tcBorders>
-            <w:shd w:val="clear" w:color="auto" w:fill="auto"/>
             <w:noWrap/>
             <w:vAlign w:val="bottom"/>
             <w:hideMark/>
@@ -9693,7 +9249,6 @@
                 <w:szCs w:val="20"/>
               </w:rPr>
             </w:pPr>
-            <w:proofErr w:type="spellStart"/>
             <w:r>
               <w:rPr>
                 <w:rFonts w:ascii="Arial" w:eastAsia="Times New Roman" w:hAnsi="Arial" w:cs="Arial"/>
@@ -9702,7 +9257,6 @@
               </w:rPr>
               <w:t>emp.var.rate</w:t>
             </w:r>
-            <w:proofErr w:type="spellEnd"/>
           </w:p>
         </w:tc>
         <w:tc>
@@ -9714,7 +9268,6 @@
               <w:bottom w:val="nil"/>
               <w:right w:val="nil"/>
             </w:tcBorders>
-            <w:shd w:val="clear" w:color="auto" w:fill="auto"/>
             <w:noWrap/>
             <w:vAlign w:val="bottom"/>
             <w:hideMark/>
@@ -9748,7 +9301,6 @@
               <w:bottom w:val="nil"/>
               <w:right w:val="single" w:sz="8" w:space="0" w:color="00B0F0"/>
             </w:tcBorders>
-            <w:shd w:val="clear" w:color="auto" w:fill="auto"/>
             <w:noWrap/>
             <w:vAlign w:val="bottom"/>
             <w:hideMark/>
@@ -9820,7 +9372,6 @@
               <w:bottom w:val="single" w:sz="8" w:space="0" w:color="00B0F0"/>
               <w:right w:val="nil"/>
             </w:tcBorders>
-            <w:shd w:val="clear" w:color="auto" w:fill="auto"/>
             <w:noWrap/>
             <w:vAlign w:val="bottom"/>
             <w:hideMark/>
@@ -9854,7 +9405,6 @@
               <w:bottom w:val="single" w:sz="8" w:space="0" w:color="00B0F0"/>
               <w:right w:val="single" w:sz="8" w:space="0" w:color="00B0F0"/>
             </w:tcBorders>
-            <w:shd w:val="clear" w:color="auto" w:fill="auto"/>
             <w:noWrap/>
             <w:vAlign w:val="bottom"/>
             <w:hideMark/>
@@ -10151,130 +9701,22 @@
         <w:spacing w:line="240" w:lineRule="exact"/>
         <w:jc w:val="both"/>
         <w:rPr>
-          <w:rFonts w:ascii="Arial" w:eastAsia="新細明體" w:hAnsi="Arial" w:cs="Arial"/>
-          <w:sz w:val="22"/>
-          <w:szCs w:val="20"/>
-        </w:rPr>
-      </w:pPr>
-      <w:r>
-        <w:rPr>
-          <w:rFonts w:ascii="Arial" w:hAnsi="Arial" w:cs="Arial"/>
-          <w:sz w:val="22"/>
-          <w:szCs w:val="20"/>
-        </w:rPr>
-        <w:t>“month”, “</w:t>
-      </w:r>
-      <w:proofErr w:type="spellStart"/>
-      <w:r>
-        <w:rPr>
-          <w:rFonts w:ascii="Arial" w:hAnsi="Arial" w:cs="Arial"/>
-          <w:sz w:val="22"/>
-          <w:szCs w:val="20"/>
-        </w:rPr>
-        <w:t>cons.price.idx</w:t>
-      </w:r>
-      <w:proofErr w:type="spellEnd"/>
-      <w:r>
-        <w:rPr>
-          <w:rFonts w:ascii="Arial" w:hAnsi="Arial" w:cs="Arial"/>
-          <w:sz w:val="22"/>
-          <w:szCs w:val="20"/>
-        </w:rPr>
-        <w:t>”, “</w:t>
-      </w:r>
-      <w:proofErr w:type="spellStart"/>
-      <w:r>
-        <w:rPr>
-          <w:rFonts w:ascii="Arial" w:hAnsi="Arial" w:cs="Arial"/>
-          <w:sz w:val="22"/>
-          <w:szCs w:val="20"/>
-        </w:rPr>
-        <w:t>poutcome</w:t>
-      </w:r>
-      <w:proofErr w:type="spellEnd"/>
-      <w:r>
-        <w:rPr>
-          <w:rFonts w:ascii="Arial" w:hAnsi="Arial" w:cs="Arial"/>
-          <w:sz w:val="22"/>
-          <w:szCs w:val="20"/>
-        </w:rPr>
-        <w:t>”, “</w:t>
-      </w:r>
-      <w:proofErr w:type="spellStart"/>
-      <w:r>
-        <w:rPr>
-          <w:rFonts w:ascii="Arial" w:hAnsi="Arial" w:cs="Arial"/>
-          <w:sz w:val="22"/>
-          <w:szCs w:val="20"/>
-        </w:rPr>
-        <w:t>cons.conf.idx</w:t>
-      </w:r>
-      <w:proofErr w:type="spellEnd"/>
-      <w:r>
-        <w:rPr>
-          <w:rFonts w:ascii="Arial" w:hAnsi="Arial" w:cs="Arial"/>
-          <w:sz w:val="22"/>
-          <w:szCs w:val="20"/>
-        </w:rPr>
-        <w:t xml:space="preserve">”, “campaign”, </w:t>
-      </w:r>
-      <w:proofErr w:type="spellStart"/>
-      <w:r>
-        <w:rPr>
-          <w:rFonts w:ascii="Arial" w:hAnsi="Arial" w:cs="Arial"/>
-          <w:sz w:val="22"/>
-          <w:szCs w:val="20"/>
-        </w:rPr>
-        <w:t>ëmp.var.rate</w:t>
-      </w:r>
-      <w:proofErr w:type="spellEnd"/>
-      <w:r>
-        <w:rPr>
-          <w:rFonts w:ascii="Arial" w:hAnsi="Arial" w:cs="Arial"/>
-          <w:sz w:val="22"/>
-          <w:szCs w:val="20"/>
-        </w:rPr>
-        <w:t>” and “contact” are highly related variables in both dataset. In the full dataset, “job”, “</w:t>
-      </w:r>
-      <w:proofErr w:type="spellStart"/>
-      <w:r>
-        <w:rPr>
-          <w:rFonts w:ascii="Arial" w:hAnsi="Arial" w:cs="Arial"/>
-          <w:sz w:val="22"/>
-          <w:szCs w:val="20"/>
-        </w:rPr>
-        <w:t>date_of_work</w:t>
-      </w:r>
-      <w:proofErr w:type="spellEnd"/>
-      <w:r>
-        <w:rPr>
-          <w:rFonts w:ascii="Arial" w:hAnsi="Arial" w:cs="Arial"/>
-          <w:sz w:val="22"/>
-          <w:szCs w:val="20"/>
-        </w:rPr>
-        <w:t>”, “</w:t>
-      </w:r>
-      <w:proofErr w:type="spellStart"/>
-      <w:r>
-        <w:rPr>
-          <w:rFonts w:ascii="Arial" w:hAnsi="Arial" w:cs="Arial"/>
-          <w:sz w:val="22"/>
-          <w:szCs w:val="20"/>
-        </w:rPr>
-        <w:t>pdays</w:t>
-      </w:r>
-      <w:proofErr w:type="spellEnd"/>
-      <w:r>
-        <w:rPr>
-          <w:rFonts w:ascii="Arial" w:hAnsi="Arial" w:cs="Arial"/>
-          <w:sz w:val="22"/>
-          <w:szCs w:val="20"/>
-        </w:rPr>
-        <w:t xml:space="preserve">”, “default” </w:t>
-      </w:r>
-      <w:r>
-        <w:rPr>
-          <w:rFonts w:ascii="Arial" w:eastAsia="新細明體" w:hAnsi="Arial" w:cs="Arial"/>
+          <w:rFonts w:ascii="Arial" w:eastAsia="PMingLiU" w:hAnsi="Arial" w:cs="Arial"/>
+          <w:sz w:val="22"/>
+          <w:szCs w:val="20"/>
+        </w:rPr>
+      </w:pPr>
+      <w:r>
+        <w:rPr>
+          <w:rFonts w:ascii="Arial" w:hAnsi="Arial" w:cs="Arial"/>
+          <w:sz w:val="22"/>
+          <w:szCs w:val="20"/>
+        </w:rPr>
+        <w:t xml:space="preserve">“month”, “cons.price.idx”, “poutcome”, “cons.conf.idx”, “campaign”, ëmp.var.rate” and “contact” are highly related variables in both dataset. In the full dataset, “job”, “date_of_work”, “pdays”, “default” </w:t>
+      </w:r>
+      <w:r>
+        <w:rPr>
+          <w:rFonts w:ascii="Arial" w:eastAsia="PMingLiU" w:hAnsi="Arial" w:cs="Arial"/>
           <w:sz w:val="22"/>
           <w:szCs w:val="20"/>
         </w:rPr>
@@ -10528,12 +9970,12 @@
                 <w:sz w:val="24"/>
                 <w:lang w:val="en-US" w:eastAsia="zh-TW"/>
               </w:rPr>
-              <w:object w:dxaOrig="2055" w:dyaOrig="765">
-                <v:shape id="_x0000_i1026" type="#_x0000_t75" style="width:103pt;height:38.5pt" o:ole="">
+              <w:object w:dxaOrig="2055" w:dyaOrig="765" w14:anchorId="7C4A792C">
+                <v:shape id="_x0000_i1026" type="#_x0000_t75" style="width:103.25pt;height:38.7pt" o:ole="">
                   <v:imagedata r:id="rId10" o:title=""/>
                   <v:shadow on="t" opacity=".5" offset="6pt,6pt"/>
                 </v:shape>
-                <o:OLEObject Type="Embed" ProgID="PBrush" ShapeID="_x0000_i1026" DrawAspect="Content" ObjectID="_1543602833" r:id="rId11"/>
+                <o:OLEObject Type="Embed" ProgID="PBrush" ShapeID="_x0000_i1026" DrawAspect="Content" ObjectID="_1853080597" r:id="rId11"/>
               </w:object>
             </w:r>
             <w:r>
@@ -10596,11 +10038,11 @@
                 <w:sz w:val="24"/>
                 <w:lang w:val="en-US" w:eastAsia="zh-TW"/>
               </w:rPr>
-              <w:object w:dxaOrig="1845" w:dyaOrig="720">
-                <v:shape id="_x0000_i1027" type="#_x0000_t75" style="width:92pt;height:37pt" o:ole="">
+              <w:object w:dxaOrig="1845" w:dyaOrig="720" w14:anchorId="50178E89">
+                <v:shape id="_x0000_i1027" type="#_x0000_t75" style="width:91.7pt;height:36.7pt" o:ole="">
                   <v:imagedata r:id="rId12" o:title=""/>
                 </v:shape>
-                <o:OLEObject Type="Embed" ProgID="PBrush" ShapeID="_x0000_i1027" DrawAspect="Content" ObjectID="_1543602834" r:id="rId13"/>
+                <o:OLEObject Type="Embed" ProgID="PBrush" ShapeID="_x0000_i1027" DrawAspect="Content" ObjectID="_1853080598" r:id="rId13"/>
               </w:object>
             </w:r>
           </w:p>
@@ -10695,11 +10137,11 @@
                 <w:sz w:val="24"/>
                 <w:lang w:val="en-US" w:eastAsia="zh-TW"/>
               </w:rPr>
-              <w:object w:dxaOrig="1875" w:dyaOrig="750">
-                <v:shape id="_x0000_i1028" type="#_x0000_t75" style="width:94pt;height:37.5pt" o:ole="">
+              <w:object w:dxaOrig="1875" w:dyaOrig="750" w14:anchorId="32C3F9DC">
+                <v:shape id="_x0000_i1028" type="#_x0000_t75" style="width:93.75pt;height:37.35pt" o:ole="">
                   <v:imagedata r:id="rId14" o:title=""/>
                 </v:shape>
-                <o:OLEObject Type="Embed" ProgID="PBrush" ShapeID="_x0000_i1028" DrawAspect="Content" ObjectID="_1543602835" r:id="rId15"/>
+                <o:OLEObject Type="Embed" ProgID="PBrush" ShapeID="_x0000_i1028" DrawAspect="Content" ObjectID="_1853080599" r:id="rId15"/>
               </w:object>
             </w:r>
           </w:p>
@@ -10755,11 +10197,11 @@
                 <w:sz w:val="24"/>
                 <w:lang w:val="en-US" w:eastAsia="zh-TW"/>
               </w:rPr>
-              <w:object w:dxaOrig="1620" w:dyaOrig="675">
-                <v:shape id="_x0000_i1029" type="#_x0000_t75" style="width:80.5pt;height:33.5pt" o:ole="">
+              <w:object w:dxaOrig="1620" w:dyaOrig="675" w14:anchorId="23552977">
+                <v:shape id="_x0000_i1029" type="#_x0000_t75" style="width:80.85pt;height:33.3pt" o:ole="">
                   <v:imagedata r:id="rId16" o:title=""/>
                 </v:shape>
-                <o:OLEObject Type="Embed" ProgID="PBrush" ShapeID="_x0000_i1029" DrawAspect="Content" ObjectID="_1543602836" r:id="rId17"/>
+                <o:OLEObject Type="Embed" ProgID="PBrush" ShapeID="_x0000_i1029" DrawAspect="Content" ObjectID="_1853080600" r:id="rId17"/>
               </w:object>
             </w:r>
           </w:p>
@@ -10822,7 +10264,7 @@
       </w:r>
       <w:r>
         <w:rPr>
-          <w:rFonts w:ascii="Arial" w:eastAsia="新細明體" w:hAnsi="Arial" w:cs="Arial"/>
+          <w:rFonts w:ascii="Arial" w:eastAsia="PMingLiU" w:hAnsi="Arial" w:cs="Arial"/>
           <w:sz w:val="22"/>
           <w:szCs w:val="20"/>
         </w:rPr>
@@ -10883,36 +10325,18 @@
         <w:spacing w:line="240" w:lineRule="exact"/>
         <w:jc w:val="both"/>
         <w:rPr>
-          <w:rFonts w:ascii="Arial" w:eastAsia="新細明體" w:hAnsi="Arial" w:cs="Arial"/>
-          <w:sz w:val="22"/>
-          <w:szCs w:val="20"/>
-        </w:rPr>
-      </w:pPr>
-      <w:r>
-        <w:rPr>
-          <w:rFonts w:ascii="Arial" w:hAnsi="Arial" w:cs="Arial"/>
-          <w:sz w:val="22"/>
-          <w:szCs w:val="20"/>
-        </w:rPr>
-        <w:t xml:space="preserve">Hence, both datasets show the performance of the model is good to </w:t>
-      </w:r>
-      <w:proofErr w:type="spellStart"/>
-      <w:r>
-        <w:rPr>
-          <w:rFonts w:ascii="Arial" w:hAnsi="Arial" w:cs="Arial"/>
-          <w:sz w:val="22"/>
-          <w:szCs w:val="20"/>
-        </w:rPr>
-        <w:t>analyse</w:t>
-      </w:r>
-      <w:proofErr w:type="spellEnd"/>
-      <w:r>
-        <w:rPr>
-          <w:rFonts w:ascii="Arial" w:hAnsi="Arial" w:cs="Arial"/>
-          <w:sz w:val="22"/>
-          <w:szCs w:val="20"/>
-        </w:rPr>
-        <w:t xml:space="preserve"> the relative variables in subscribing a term deposit account. </w:t>
+          <w:rFonts w:ascii="Arial" w:eastAsia="PMingLiU" w:hAnsi="Arial" w:cs="Arial"/>
+          <w:sz w:val="22"/>
+          <w:szCs w:val="20"/>
+        </w:rPr>
+      </w:pPr>
+      <w:r>
+        <w:rPr>
+          <w:rFonts w:ascii="Arial" w:hAnsi="Arial" w:cs="Arial"/>
+          <w:sz w:val="22"/>
+          <w:szCs w:val="20"/>
+        </w:rPr>
+        <w:t xml:space="preserve">Hence, both datasets show the performance of the model is good to analyse the relative variables in subscribing a term deposit account. </w:t>
       </w:r>
     </w:p>
     <w:p>
@@ -11226,25 +10650,7 @@
           <w:sz w:val="22"/>
           <w:szCs w:val="20"/>
         </w:rPr>
-        <w:t xml:space="preserve">Classification Tree based on the binary splitting of variables, one at a time. It is constructed such that each terminal node is as “pure” as possible. Therefore, in each terminal node, most of the observations are belongs to the same group. Based on the Classification Tree, a set of simple classification rules can be easily obtained. R has </w:t>
-      </w:r>
-      <w:proofErr w:type="spellStart"/>
-      <w:r>
-        <w:rPr>
-          <w:rFonts w:ascii="Arial" w:hAnsi="Arial" w:cs="Arial"/>
-          <w:sz w:val="22"/>
-          <w:szCs w:val="20"/>
-        </w:rPr>
-        <w:t>build</w:t>
-      </w:r>
-      <w:proofErr w:type="spellEnd"/>
-      <w:r>
-        <w:rPr>
-          <w:rFonts w:ascii="Arial" w:hAnsi="Arial" w:cs="Arial"/>
-          <w:sz w:val="22"/>
-          <w:szCs w:val="20"/>
-        </w:rPr>
-        <w:t>-in function to apply the Classification Tree.</w:t>
+        <w:t>Classification Tree based on the binary splitting of variables, one at a time. It is constructed such that each terminal node is as “pure” as possible. Therefore, in each terminal node, most of the observations are belongs to the same group. Based on the Classification Tree, a set of simple classification rules can be easily obtained. R has build-in function to apply the Classification Tree.</w:t>
       </w:r>
     </w:p>
     <w:p>
@@ -11383,7 +10789,7 @@
           <w:lang w:val="en-HK" w:eastAsia="zh-CN"/>
         </w:rPr>
         <w:drawing>
-          <wp:inline distT="0" distB="0" distL="0" distR="0" wp14:anchorId="156142F7" wp14:editId="4F52AEA8">
+          <wp:inline distT="0" distB="0" distL="0" distR="0" wp14:anchorId="15248B15" wp14:editId="35F857BB">
             <wp:extent cx="3619500" cy="2415540"/>
             <wp:effectExtent l="0" t="0" r="0" b="3810"/>
             <wp:docPr id="9" name="Picture 9"/>
@@ -11472,25 +10878,7 @@
           <w:sz w:val="22"/>
           <w:szCs w:val="20"/>
         </w:rPr>
-        <w:t xml:space="preserve">Node1: If </w:t>
-      </w:r>
-      <w:proofErr w:type="spellStart"/>
-      <w:r>
-        <w:rPr>
-          <w:rFonts w:ascii="Arial" w:hAnsi="Arial" w:cs="Arial"/>
-          <w:sz w:val="22"/>
-          <w:szCs w:val="20"/>
-        </w:rPr>
-        <w:t>nr_employed</w:t>
-      </w:r>
-      <w:proofErr w:type="spellEnd"/>
-      <w:r>
-        <w:rPr>
-          <w:rFonts w:ascii="Arial" w:hAnsi="Arial" w:cs="Arial"/>
-          <w:sz w:val="22"/>
-          <w:szCs w:val="20"/>
-        </w:rPr>
-        <w:t xml:space="preserve"> &gt;=5087.65 then Result = 0 (30397/2186)</w:t>
+        <w:t>Node1: If nr_employed &gt;=5087.65 then Result = 0 (30397/2186)</w:t>
       </w:r>
       <w:r>
         <w:rPr>
@@ -11499,43 +10887,7 @@
           <w:szCs w:val="20"/>
         </w:rPr>
         <w:br/>
-        <w:t>Node2: If (</w:t>
-      </w:r>
-      <w:proofErr w:type="spellStart"/>
-      <w:r>
-        <w:rPr>
-          <w:rFonts w:ascii="Arial" w:hAnsi="Arial" w:cs="Arial"/>
-          <w:sz w:val="22"/>
-          <w:szCs w:val="20"/>
-        </w:rPr>
-        <w:t>nr_employed</w:t>
-      </w:r>
-      <w:proofErr w:type="spellEnd"/>
-      <w:r>
-        <w:rPr>
-          <w:rFonts w:ascii="Arial" w:hAnsi="Arial" w:cs="Arial"/>
-          <w:sz w:val="22"/>
-          <w:szCs w:val="20"/>
-        </w:rPr>
-        <w:t xml:space="preserve"> &lt;5087.65) and (</w:t>
-      </w:r>
-      <w:proofErr w:type="spellStart"/>
-      <w:r>
-        <w:rPr>
-          <w:rFonts w:ascii="Arial" w:hAnsi="Arial" w:cs="Arial"/>
-          <w:sz w:val="22"/>
-          <w:szCs w:val="20"/>
-        </w:rPr>
-        <w:t>pdays</w:t>
-      </w:r>
-      <w:proofErr w:type="spellEnd"/>
-      <w:r>
-        <w:rPr>
-          <w:rFonts w:ascii="Arial" w:hAnsi="Arial" w:cs="Arial"/>
-          <w:sz w:val="22"/>
-          <w:szCs w:val="20"/>
-        </w:rPr>
-        <w:t xml:space="preserve"> &gt;= 15.5) then Result = 0 (2157/1234)</w:t>
+        <w:t>Node2: If (nr_employed &lt;5087.65) and (pdays &gt;= 15.5) then Result = 0 (2157/1234)</w:t>
       </w:r>
       <w:r>
         <w:rPr>
@@ -11544,43 +10896,7 @@
           <w:szCs w:val="20"/>
         </w:rPr>
         <w:br/>
-        <w:t>Node3: If (</w:t>
-      </w:r>
-      <w:proofErr w:type="spellStart"/>
-      <w:r>
-        <w:rPr>
-          <w:rFonts w:ascii="Arial" w:hAnsi="Arial" w:cs="Arial"/>
-          <w:sz w:val="22"/>
-          <w:szCs w:val="20"/>
-        </w:rPr>
-        <w:t>nr_employed</w:t>
-      </w:r>
-      <w:proofErr w:type="spellEnd"/>
-      <w:r>
-        <w:rPr>
-          <w:rFonts w:ascii="Arial" w:hAnsi="Arial" w:cs="Arial"/>
-          <w:sz w:val="22"/>
-          <w:szCs w:val="20"/>
-        </w:rPr>
-        <w:t xml:space="preserve"> &lt;5087.65) and (</w:t>
-      </w:r>
-      <w:proofErr w:type="spellStart"/>
-      <w:r>
-        <w:rPr>
-          <w:rFonts w:ascii="Arial" w:hAnsi="Arial" w:cs="Arial"/>
-          <w:sz w:val="22"/>
-          <w:szCs w:val="20"/>
-        </w:rPr>
-        <w:t>pdays</w:t>
-      </w:r>
-      <w:proofErr w:type="spellEnd"/>
-      <w:r>
-        <w:rPr>
-          <w:rFonts w:ascii="Arial" w:hAnsi="Arial" w:cs="Arial"/>
-          <w:sz w:val="22"/>
-          <w:szCs w:val="20"/>
-        </w:rPr>
-        <w:t xml:space="preserve"> &lt; 15.5) then Result = 1 (328/767)</w:t>
+        <w:t>Node3: If (nr_employed &lt;5087.65) and (pdays &lt; 15.5) then Result = 1 (328/767)</w:t>
       </w:r>
     </w:p>
     <w:p>
@@ -11608,43 +10924,7 @@
           <w:sz w:val="22"/>
           <w:szCs w:val="20"/>
         </w:rPr>
-        <w:t xml:space="preserve">The result shows that client subscribed a term deposit when </w:t>
-      </w:r>
-      <w:proofErr w:type="spellStart"/>
-      <w:r>
-        <w:rPr>
-          <w:rFonts w:ascii="Arial" w:hAnsi="Arial" w:cs="Arial"/>
-          <w:sz w:val="22"/>
-          <w:szCs w:val="20"/>
-        </w:rPr>
-        <w:t>nr_employed</w:t>
-      </w:r>
-      <w:proofErr w:type="spellEnd"/>
-      <w:r>
-        <w:rPr>
-          <w:rFonts w:ascii="Arial" w:hAnsi="Arial" w:cs="Arial"/>
-          <w:sz w:val="22"/>
-          <w:szCs w:val="20"/>
-        </w:rPr>
-        <w:t xml:space="preserve"> &lt; 5087.65 and </w:t>
-      </w:r>
-      <w:proofErr w:type="spellStart"/>
-      <w:r>
-        <w:rPr>
-          <w:rFonts w:ascii="Arial" w:hAnsi="Arial" w:cs="Arial"/>
-          <w:sz w:val="22"/>
-          <w:szCs w:val="20"/>
-        </w:rPr>
-        <w:t>pdays</w:t>
-      </w:r>
-      <w:proofErr w:type="spellEnd"/>
-      <w:r>
-        <w:rPr>
-          <w:rFonts w:ascii="Arial" w:hAnsi="Arial" w:cs="Arial"/>
-          <w:sz w:val="22"/>
-          <w:szCs w:val="20"/>
-        </w:rPr>
-        <w:t xml:space="preserve"> &lt; 15.5.</w:t>
+        <w:t>The result shows that client subscribed a term deposit when nr_employed &lt; 5087.65 and pdays &lt; 15.5.</w:t>
       </w:r>
     </w:p>
     <w:p>
@@ -11672,25 +10952,7 @@
           <w:sz w:val="22"/>
           <w:szCs w:val="20"/>
         </w:rPr>
-        <w:t xml:space="preserve">We noted that the support rate, confidence rate and capture rate of node 1 are 87.4%, 93.6% and 92.0% respectively. Therefore, we can be much sure that if </w:t>
-      </w:r>
-      <w:proofErr w:type="spellStart"/>
-      <w:r>
-        <w:rPr>
-          <w:rFonts w:ascii="Arial" w:hAnsi="Arial" w:cs="Arial"/>
-          <w:sz w:val="22"/>
-          <w:szCs w:val="20"/>
-        </w:rPr>
-        <w:t>nr.employed</w:t>
-      </w:r>
-      <w:proofErr w:type="spellEnd"/>
-      <w:r>
-        <w:rPr>
-          <w:rFonts w:ascii="Arial" w:hAnsi="Arial" w:cs="Arial"/>
-          <w:sz w:val="22"/>
-          <w:szCs w:val="20"/>
-        </w:rPr>
-        <w:t xml:space="preserve"> is larger than or equal to 5087.65, client did </w:t>
+        <w:t xml:space="preserve">We noted that the support rate, confidence rate and capture rate of node 1 are 87.4%, 93.6% and 92.0% respectively. Therefore, we can be much sure that if nr.employed is larger than or equal to 5087.65, client did </w:t>
       </w:r>
       <w:r>
         <w:rPr>
@@ -11820,7 +11082,7 @@
           <w:lang w:val="en-HK" w:eastAsia="zh-CN"/>
         </w:rPr>
         <w:drawing>
-          <wp:inline distT="0" distB="0" distL="0" distR="0" wp14:anchorId="507E0C40" wp14:editId="0EA8E12C">
+          <wp:inline distT="0" distB="0" distL="0" distR="0" wp14:anchorId="134A7621" wp14:editId="2AA2979F">
             <wp:extent cx="3508744" cy="2380625"/>
             <wp:effectExtent l="0" t="0" r="0" b="635"/>
             <wp:docPr id="1" name="Picture 1"/>
@@ -11904,25 +11166,7 @@
           <w:sz w:val="22"/>
           <w:szCs w:val="20"/>
         </w:rPr>
-        <w:t xml:space="preserve">Node1: If </w:t>
-      </w:r>
-      <w:proofErr w:type="spellStart"/>
-      <w:r>
-        <w:rPr>
-          <w:rFonts w:ascii="Arial" w:hAnsi="Arial" w:cs="Arial"/>
-          <w:sz w:val="22"/>
-          <w:szCs w:val="20"/>
-        </w:rPr>
-        <w:t>nr_employed</w:t>
-      </w:r>
-      <w:proofErr w:type="spellEnd"/>
-      <w:r>
-        <w:rPr>
-          <w:rFonts w:ascii="Arial" w:hAnsi="Arial" w:cs="Arial"/>
-          <w:sz w:val="22"/>
-          <w:szCs w:val="20"/>
-        </w:rPr>
-        <w:t xml:space="preserve"> &gt;=5087.65 then Result = 0 (3033/207)</w:t>
+        <w:t>Node1: If nr_employed &gt;=5087.65 then Result = 0 (3033/207)</w:t>
       </w:r>
       <w:r>
         <w:rPr>
@@ -11931,43 +11175,7 @@
           <w:szCs w:val="20"/>
         </w:rPr>
         <w:br/>
-        <w:t>Node2: If (</w:t>
-      </w:r>
-      <w:proofErr w:type="spellStart"/>
-      <w:r>
-        <w:rPr>
-          <w:rFonts w:ascii="Arial" w:hAnsi="Arial" w:cs="Arial"/>
-          <w:sz w:val="22"/>
-          <w:szCs w:val="20"/>
-        </w:rPr>
-        <w:t>nr_employed</w:t>
-      </w:r>
-      <w:proofErr w:type="spellEnd"/>
-      <w:r>
-        <w:rPr>
-          <w:rFonts w:ascii="Arial" w:hAnsi="Arial" w:cs="Arial"/>
-          <w:sz w:val="22"/>
-          <w:szCs w:val="20"/>
-        </w:rPr>
-        <w:t xml:space="preserve"> &lt;5087.65) and (</w:t>
-      </w:r>
-      <w:proofErr w:type="spellStart"/>
-      <w:r>
-        <w:rPr>
-          <w:rFonts w:ascii="Arial" w:hAnsi="Arial" w:cs="Arial"/>
-          <w:sz w:val="22"/>
-          <w:szCs w:val="20"/>
-        </w:rPr>
-        <w:t>pdays</w:t>
-      </w:r>
-      <w:proofErr w:type="spellEnd"/>
-      <w:r>
-        <w:rPr>
-          <w:rFonts w:ascii="Arial" w:hAnsi="Arial" w:cs="Arial"/>
-          <w:sz w:val="22"/>
-          <w:szCs w:val="20"/>
-        </w:rPr>
-        <w:t xml:space="preserve"> &gt;= 12.5) then Result = 0 (234/124)</w:t>
+        <w:t>Node2: If (nr_employed &lt;5087.65) and (pdays &gt;= 12.5) then Result = 0 (234/124)</w:t>
       </w:r>
       <w:r>
         <w:rPr>
@@ -11976,43 +11184,7 @@
           <w:szCs w:val="20"/>
         </w:rPr>
         <w:br/>
-        <w:t>Node3: If (</w:t>
-      </w:r>
-      <w:proofErr w:type="spellStart"/>
-      <w:r>
-        <w:rPr>
-          <w:rFonts w:ascii="Arial" w:hAnsi="Arial" w:cs="Arial"/>
-          <w:sz w:val="22"/>
-          <w:szCs w:val="20"/>
-        </w:rPr>
-        <w:t>nr_employed</w:t>
-      </w:r>
-      <w:proofErr w:type="spellEnd"/>
-      <w:r>
-        <w:rPr>
-          <w:rFonts w:ascii="Arial" w:hAnsi="Arial" w:cs="Arial"/>
-          <w:sz w:val="22"/>
-          <w:szCs w:val="20"/>
-        </w:rPr>
-        <w:t xml:space="preserve"> &lt;5087.65) and (</w:t>
-      </w:r>
-      <w:proofErr w:type="spellStart"/>
-      <w:r>
-        <w:rPr>
-          <w:rFonts w:ascii="Arial" w:hAnsi="Arial" w:cs="Arial"/>
-          <w:sz w:val="22"/>
-          <w:szCs w:val="20"/>
-        </w:rPr>
-        <w:t>pdays</w:t>
-      </w:r>
-      <w:proofErr w:type="spellEnd"/>
-      <w:r>
-        <w:rPr>
-          <w:rFonts w:ascii="Arial" w:hAnsi="Arial" w:cs="Arial"/>
-          <w:sz w:val="22"/>
-          <w:szCs w:val="20"/>
-        </w:rPr>
-        <w:t xml:space="preserve"> &lt; 12.5) then Result = 1 (30/79)</w:t>
+        <w:t>Node3: If (nr_employed &lt;5087.65) and (pdays &lt; 12.5) then Result = 1 (30/79)</w:t>
       </w:r>
     </w:p>
     <w:p>
@@ -12034,69 +11206,13 @@
           <w:szCs w:val="20"/>
         </w:rPr>
       </w:pPr>
-      <w:bookmarkStart w:id="13" w:name="_GoBack"/>
-      <w:bookmarkEnd w:id="13"/>
-      <w:r>
-        <w:rPr>
-          <w:rFonts w:ascii="Arial" w:hAnsi="Arial" w:cs="Arial"/>
-          <w:sz w:val="22"/>
-          <w:szCs w:val="20"/>
-        </w:rPr>
-        <w:t xml:space="preserve">We can see that client subscribed a term deposit when </w:t>
-      </w:r>
-      <w:proofErr w:type="spellStart"/>
-      <w:r>
-        <w:rPr>
-          <w:rFonts w:ascii="Arial" w:hAnsi="Arial" w:cs="Arial"/>
-          <w:sz w:val="22"/>
-          <w:szCs w:val="20"/>
-        </w:rPr>
-        <w:t>nr_employed</w:t>
-      </w:r>
-      <w:proofErr w:type="spellEnd"/>
-      <w:r>
-        <w:rPr>
-          <w:rFonts w:ascii="Arial" w:hAnsi="Arial" w:cs="Arial"/>
-          <w:sz w:val="22"/>
-          <w:szCs w:val="20"/>
-        </w:rPr>
-        <w:t xml:space="preserve"> &lt; 5087.65 and </w:t>
-      </w:r>
-      <w:proofErr w:type="spellStart"/>
-      <w:r>
-        <w:rPr>
-          <w:rFonts w:ascii="Arial" w:hAnsi="Arial" w:cs="Arial"/>
-          <w:sz w:val="22"/>
-          <w:szCs w:val="20"/>
-        </w:rPr>
-        <w:t>pdays</w:t>
-      </w:r>
-      <w:proofErr w:type="spellEnd"/>
-      <w:r>
-        <w:rPr>
-          <w:rFonts w:ascii="Arial" w:hAnsi="Arial" w:cs="Arial"/>
-          <w:sz w:val="22"/>
-          <w:szCs w:val="20"/>
-        </w:rPr>
-        <w:t xml:space="preserve"> &lt; 12.5. The parameters are the same as using the whole dataset. The only difference is the threshold of </w:t>
-      </w:r>
-      <w:proofErr w:type="spellStart"/>
-      <w:r>
-        <w:rPr>
-          <w:rFonts w:ascii="Arial" w:hAnsi="Arial" w:cs="Arial"/>
-          <w:sz w:val="22"/>
-          <w:szCs w:val="20"/>
-        </w:rPr>
-        <w:t>pdays</w:t>
-      </w:r>
-      <w:proofErr w:type="spellEnd"/>
-      <w:r>
-        <w:rPr>
-          <w:rFonts w:ascii="Arial" w:hAnsi="Arial" w:cs="Arial"/>
-          <w:sz w:val="22"/>
-          <w:szCs w:val="20"/>
-        </w:rPr>
-        <w:t xml:space="preserve"> changes from 15.5 (whole dataset) to 12.5 (10% dataset).</w:t>
+      <w:r>
+        <w:rPr>
+          <w:rFonts w:ascii="Arial" w:hAnsi="Arial" w:cs="Arial"/>
+          <w:sz w:val="22"/>
+          <w:szCs w:val="20"/>
+        </w:rPr>
+        <w:t>We can see that client subscribed a term deposit when nr_employed &lt; 5087.65 and pdays &lt; 12.5. The parameters are the same as using the whole dataset. The only difference is the threshold of pdays changes from 15.5 (whole dataset) to 12.5 (10% dataset).</w:t>
       </w:r>
     </w:p>
     <w:p>
@@ -12363,7 +11479,7 @@
                 <w:lang w:val="en-HK" w:eastAsia="zh-CN"/>
               </w:rPr>
               <w:drawing>
-                <wp:anchor distT="0" distB="0" distL="114300" distR="114300" simplePos="0" relativeHeight="251668480" behindDoc="1" locked="0" layoutInCell="1" allowOverlap="1" wp14:anchorId="6D9D7B7F" wp14:editId="4D979E2A">
+                <wp:anchor distT="0" distB="0" distL="114300" distR="114300" simplePos="0" relativeHeight="251668480" behindDoc="1" locked="0" layoutInCell="1" allowOverlap="1" wp14:anchorId="3A9F7B1D" wp14:editId="1342E4E6">
                   <wp:simplePos x="0" y="0"/>
                   <wp:positionH relativeFrom="column">
                     <wp:posOffset>932180</wp:posOffset>
@@ -12511,7 +11627,7 @@
                 <w:lang w:val="en-HK" w:eastAsia="zh-CN"/>
               </w:rPr>
               <w:drawing>
-                <wp:inline distT="0" distB="0" distL="0" distR="0" wp14:anchorId="4C9B81CE" wp14:editId="04CF9FCB">
+                <wp:inline distT="0" distB="0" distL="0" distR="0" wp14:anchorId="08540B79" wp14:editId="1B48D21D">
                   <wp:extent cx="1036320" cy="480060"/>
                   <wp:effectExtent l="76200" t="76200" r="68580" b="72390"/>
                   <wp:docPr id="24" name="Picture 24"/>
@@ -12656,7 +11772,7 @@
                 <w:lang w:val="en-HK" w:eastAsia="zh-CN"/>
               </w:rPr>
               <w:drawing>
-                <wp:anchor distT="0" distB="0" distL="114300" distR="114300" simplePos="0" relativeHeight="251669504" behindDoc="1" locked="0" layoutInCell="1" allowOverlap="1" wp14:anchorId="2C31EE10" wp14:editId="1286A1F3">
+                <wp:anchor distT="0" distB="0" distL="114300" distR="114300" simplePos="0" relativeHeight="251669504" behindDoc="1" locked="0" layoutInCell="1" allowOverlap="1" wp14:anchorId="53B15C01" wp14:editId="5623786A">
                   <wp:simplePos x="0" y="0"/>
                   <wp:positionH relativeFrom="column">
                     <wp:posOffset>963930</wp:posOffset>
@@ -12804,7 +11920,7 @@
                 <w:lang w:val="en-HK" w:eastAsia="zh-CN"/>
               </w:rPr>
               <w:drawing>
-                <wp:inline distT="0" distB="0" distL="0" distR="0" wp14:anchorId="51FF9B5A" wp14:editId="55F7AEC0">
+                <wp:inline distT="0" distB="0" distL="0" distR="0" wp14:anchorId="29CF637C" wp14:editId="142851E2">
                   <wp:extent cx="1097280" cy="533400"/>
                   <wp:effectExtent l="76200" t="76200" r="83820" b="76200"/>
                   <wp:docPr id="22" name="Picture 22"/>
@@ -12912,25 +12028,7 @@
           <w:sz w:val="22"/>
           <w:szCs w:val="20"/>
         </w:rPr>
-        <w:t xml:space="preserve">There is an interesting finding that the threshold of </w:t>
-      </w:r>
-      <w:proofErr w:type="spellStart"/>
-      <w:r>
-        <w:rPr>
-          <w:rFonts w:ascii="Arial" w:hAnsi="Arial" w:cs="Arial"/>
-          <w:sz w:val="22"/>
-          <w:szCs w:val="20"/>
-        </w:rPr>
-        <w:t>nr_employed</w:t>
-      </w:r>
-      <w:proofErr w:type="spellEnd"/>
-      <w:r>
-        <w:rPr>
-          <w:rFonts w:ascii="Arial" w:hAnsi="Arial" w:cs="Arial"/>
-          <w:sz w:val="22"/>
-          <w:szCs w:val="20"/>
-        </w:rPr>
-        <w:t xml:space="preserve"> is 5087.65 under the model of using full data set or just 10% of the dataset and the predictive power (in terms of misclassification rate) of 10% dataset is better.</w:t>
+        <w:t>There is an interesting finding that the threshold of nr_employed is 5087.65 under the model of using full data set or just 10% of the dataset and the predictive power (in terms of misclassification rate) of 10% dataset is better.</w:t>
       </w:r>
     </w:p>
     <w:p>
@@ -13192,7 +12290,7 @@
         </w:rPr>
         <w:br w:type="column"/>
       </w:r>
-      <w:bookmarkStart w:id="14" w:name="_Toc469847245"/>
+      <w:bookmarkStart w:id="13" w:name="_Toc469847245"/>
       <w:r>
         <w:rPr>
           <w:rFonts w:ascii="Arial" w:hAnsi="Arial" w:cs="Arial"/>
@@ -13210,7 +12308,7 @@
         </w:rPr>
         <w:t>Artificial Neural Network</w:t>
       </w:r>
-      <w:bookmarkEnd w:id="14"/>
+      <w:bookmarkEnd w:id="13"/>
     </w:p>
     <w:p>
       <w:pPr>
@@ -13221,7 +12319,7 @@
           <w:color w:val="auto"/>
         </w:rPr>
       </w:pPr>
-      <w:bookmarkStart w:id="15" w:name="_Toc469847246"/>
+      <w:bookmarkStart w:id="14" w:name="_Toc469847246"/>
       <w:r>
         <w:rPr>
           <w:rFonts w:ascii="Arial" w:hAnsi="Arial" w:cs="Arial"/>
@@ -13238,7 +12336,7 @@
         </w:rPr>
         <w:t>Methodology</w:t>
       </w:r>
-      <w:bookmarkEnd w:id="15"/>
+      <w:bookmarkEnd w:id="14"/>
     </w:p>
     <w:p>
       <w:pPr>
@@ -13311,25 +12409,7 @@
           <w:sz w:val="22"/>
           <w:szCs w:val="20"/>
         </w:rPr>
-        <w:t xml:space="preserve">The optimal hidden layer size for the Artificial Neural Network has to be found out by doing a number of trials. Therefore, we design a new ANN function by forming a loop to determine the best hidden layer size and then save the best training result among different hidden layer size. We choose hidden layer </w:t>
-      </w:r>
-      <w:proofErr w:type="spellStart"/>
-      <w:r>
-        <w:rPr>
-          <w:rFonts w:ascii="Arial" w:hAnsi="Arial" w:cs="Arial"/>
-          <w:sz w:val="22"/>
-          <w:szCs w:val="20"/>
-        </w:rPr>
-        <w:t>maxize</w:t>
-      </w:r>
-      <w:proofErr w:type="spellEnd"/>
-      <w:r>
-        <w:rPr>
-          <w:rFonts w:ascii="Arial" w:hAnsi="Arial" w:cs="Arial"/>
-          <w:sz w:val="22"/>
-          <w:szCs w:val="20"/>
-        </w:rPr>
-        <w:t xml:space="preserve"> = 18 because the number of weights exceed the default limit of 1024. It is possible to exceed the default limit but this is undesirable because doing so only increases complexity.</w:t>
+        <w:t>The optimal hidden layer size for the Artificial Neural Network has to be found out by doing a number of trials. Therefore, we design a new ANN function by forming a loop to determine the best hidden layer size and then save the best training result among different hidden layer size. We choose hidden layer maxize = 18 because the number of weights exceed the default limit of 1024. It is possible to exceed the default limit but this is undesirable because doing so only increases complexity.</w:t>
       </w:r>
     </w:p>
     <w:p>
@@ -13379,7 +12459,7 @@
           <w:color w:val="auto"/>
         </w:rPr>
       </w:pPr>
-      <w:bookmarkStart w:id="16" w:name="_Toc469847247"/>
+      <w:bookmarkStart w:id="15" w:name="_Toc469847247"/>
       <w:r>
         <w:rPr>
           <w:rFonts w:ascii="Arial" w:hAnsi="Arial" w:cs="Arial"/>
@@ -13396,7 +12476,7 @@
         </w:rPr>
         <w:t>Results &amp; Findings</w:t>
       </w:r>
-      <w:bookmarkEnd w:id="16"/>
+      <w:bookmarkEnd w:id="15"/>
     </w:p>
     <w:p>
       <w:pPr>
@@ -13723,7 +12803,7 @@
                 <w:lang w:val="en-HK" w:eastAsia="zh-CN"/>
               </w:rPr>
               <w:drawing>
-                <wp:anchor distT="0" distB="0" distL="114300" distR="114300" simplePos="0" relativeHeight="251671552" behindDoc="1" locked="0" layoutInCell="1" allowOverlap="1" wp14:anchorId="57A86AE5" wp14:editId="7319C95A">
+                <wp:anchor distT="0" distB="0" distL="114300" distR="114300" simplePos="0" relativeHeight="251671552" behindDoc="1" locked="0" layoutInCell="1" allowOverlap="1" wp14:anchorId="69DA09AA" wp14:editId="6CB1B24B">
                   <wp:simplePos x="0" y="0"/>
                   <wp:positionH relativeFrom="column">
                     <wp:posOffset>835660</wp:posOffset>
@@ -13870,7 +12950,7 @@
                 <w:lang w:val="en-HK" w:eastAsia="zh-CN"/>
               </w:rPr>
               <w:drawing>
-                <wp:inline distT="0" distB="0" distL="0" distR="0" wp14:anchorId="3F4E6CB1" wp14:editId="3EACAAD3">
+                <wp:inline distT="0" distB="0" distL="0" distR="0" wp14:anchorId="7811EAE4" wp14:editId="626D3293">
                   <wp:extent cx="1386840" cy="640080"/>
                   <wp:effectExtent l="0" t="0" r="3810" b="7620"/>
                   <wp:docPr id="20" name="Picture 20"/>
@@ -14011,7 +13091,7 @@
                 <w:lang w:val="en-HK" w:eastAsia="zh-CN"/>
               </w:rPr>
               <w:drawing>
-                <wp:anchor distT="0" distB="0" distL="114300" distR="114300" simplePos="0" relativeHeight="251672576" behindDoc="1" locked="0" layoutInCell="1" allowOverlap="1" wp14:anchorId="01224968" wp14:editId="1B66CBB6">
+                <wp:anchor distT="0" distB="0" distL="114300" distR="114300" simplePos="0" relativeHeight="251672576" behindDoc="1" locked="0" layoutInCell="1" allowOverlap="1" wp14:anchorId="123A1416" wp14:editId="59214BEF">
                   <wp:simplePos x="0" y="0"/>
                   <wp:positionH relativeFrom="column">
                     <wp:posOffset>888365</wp:posOffset>
@@ -14161,7 +13241,7 @@
                 <w:lang w:val="en-HK" w:eastAsia="zh-CN"/>
               </w:rPr>
               <w:drawing>
-                <wp:inline distT="0" distB="0" distL="0" distR="0" wp14:anchorId="51A1D00C" wp14:editId="47B733EA">
+                <wp:inline distT="0" distB="0" distL="0" distR="0" wp14:anchorId="6D6AF5A6" wp14:editId="3B5EDBBD">
                   <wp:extent cx="1158240" cy="510540"/>
                   <wp:effectExtent l="76200" t="76200" r="80010" b="80010"/>
                   <wp:docPr id="16" name="Picture 16"/>
@@ -14592,7 +13672,7 @@
         </w:rPr>
         <w:br w:type="column"/>
       </w:r>
-      <w:bookmarkStart w:id="17" w:name="_Toc469847248"/>
+      <w:bookmarkStart w:id="16" w:name="_Toc469847248"/>
       <w:r>
         <w:rPr>
           <w:rFonts w:ascii="Arial" w:hAnsi="Arial" w:cs="Arial"/>
@@ -14610,7 +13690,7 @@
         </w:rPr>
         <w:t>Conclusion</w:t>
       </w:r>
-      <w:bookmarkEnd w:id="17"/>
+      <w:bookmarkEnd w:id="16"/>
     </w:p>
     <w:p>
       <w:pPr>
@@ -14778,7 +13858,7 @@
       </w:pPr>
       <w:r>
         <w:rPr>
-          <w:rFonts w:ascii="Arial" w:eastAsia="新細明體" w:hAnsi="Arial" w:cs="Arial"/>
+          <w:rFonts w:ascii="Arial" w:eastAsia="PMingLiU" w:hAnsi="Arial" w:cs="Arial"/>
           <w:kern w:val="0"/>
           <w:sz w:val="22"/>
           <w:szCs w:val="20"/>
@@ -14968,7 +14048,7 @@
           <w:color w:val="auto"/>
         </w:rPr>
       </w:pPr>
-      <w:bookmarkStart w:id="18" w:name="_Toc469847249"/>
+      <w:bookmarkStart w:id="17" w:name="_Toc469847249"/>
       <w:r>
         <w:rPr>
           <w:rFonts w:ascii="Arial" w:hAnsi="Arial" w:cs="Arial"/>
@@ -14977,7 +14057,7 @@
         </w:rPr>
         <w:t>8. Appendix</w:t>
       </w:r>
-      <w:bookmarkEnd w:id="18"/>
+      <w:bookmarkEnd w:id="17"/>
     </w:p>
     <w:p>
       <w:pPr>
@@ -15011,7 +14091,7 @@
 </file>
 
 <file path=word/endnotes.xml><?xml version="1.0" encoding="utf-8"?>
-<w:endnotes xmlns:wpc="http://schemas.microsoft.com/office/word/2010/wordprocessingCanvas" xmlns:cx="http://schemas.microsoft.com/office/drawing/2014/chartex" xmlns:cx1="http://schemas.microsoft.com/office/drawing/2015/9/8/chartex" xmlns:cx2="http://schemas.microsoft.com/office/drawing/2015/10/21/chartex" xmlns:cx3="http://schemas.microsoft.com/office/drawing/2016/5/9/chartex" xmlns:cx4="http://schemas.microsoft.com/office/drawing/2016/5/10/chartex" xmlns:cx5="http://schemas.microsoft.com/office/drawing/2016/5/11/chartex" xmlns:mc="http://schemas.openxmlformats.org/markup-compatibility/2006" xmlns:o="urn:schemas-microsoft-com:office:office" xmlns:r="http://schemas.openxmlformats.org/officeDocument/2006/relationships" xmlns:m="http://schemas.openxmlformats.org/officeDocument/2006/math" xmlns:v="urn:schemas-microsoft-com:vml" xmlns:wp14="http://schemas.microsoft.com/office/word/2010/wordprocessingDrawing" xmlns:wp="http://schemas.openxmlformats.org/drawingml/2006/wordprocessingDrawing" xmlns:w10="urn:schemas-microsoft-com:office:word" xmlns:w="http://schemas.openxmlformats.org/wordprocessingml/2006/main" xmlns:w14="http://schemas.microsoft.com/office/word/2010/wordml" xmlns:w15="http://schemas.microsoft.com/office/word/2012/wordml" xmlns:w16se="http://schemas.microsoft.com/office/word/2015/wordml/symex" xmlns:wpg="http://schemas.microsoft.com/office/word/2010/wordprocessingGroup" xmlns:wpi="http://schemas.microsoft.com/office/word/2010/wordprocessingInk" xmlns:wne="http://schemas.microsoft.com/office/word/2006/wordml" xmlns:wps="http://schemas.microsoft.com/office/word/2010/wordprocessingShape" mc:Ignorable="w14 w15 w16se wp14">
+<w:endnotes xmlns:wpc="http://schemas.microsoft.com/office/word/2010/wordprocessingCanvas" xmlns:cx="http://schemas.microsoft.com/office/drawing/2014/chartex" xmlns:cx1="http://schemas.microsoft.com/office/drawing/2015/9/8/chartex" xmlns:cx2="http://schemas.microsoft.com/office/drawing/2015/10/21/chartex" xmlns:cx3="http://schemas.microsoft.com/office/drawing/2016/5/9/chartex" xmlns:cx4="http://schemas.microsoft.com/office/drawing/2016/5/10/chartex" xmlns:cx5="http://schemas.microsoft.com/office/drawing/2016/5/11/chartex" xmlns:cx6="http://schemas.microsoft.com/office/drawing/2016/5/12/chartex" xmlns:cx7="http://schemas.microsoft.com/office/drawing/2016/5/13/chartex" xmlns:cx8="http://schemas.microsoft.com/office/drawing/2016/5/14/chartex" xmlns:mc="http://schemas.openxmlformats.org/markup-compatibility/2006" xmlns:aink="http://schemas.microsoft.com/office/drawing/2016/ink" xmlns:am3d="http://schemas.microsoft.com/office/drawing/2017/model3d" xmlns:o="urn:schemas-microsoft-com:office:office" xmlns:oel="http://schemas.microsoft.com/office/2019/extlst" xmlns:r="http://schemas.openxmlformats.org/officeDocument/2006/relationships" xmlns:m="http://schemas.openxmlformats.org/officeDocument/2006/math" xmlns:v="urn:schemas-microsoft-com:vml" xmlns:wp14="http://schemas.microsoft.com/office/word/2010/wordprocessingDrawing" xmlns:wp="http://schemas.openxmlformats.org/drawingml/2006/wordprocessingDrawing" xmlns:w10="urn:schemas-microsoft-com:office:word" xmlns:w="http://schemas.openxmlformats.org/wordprocessingml/2006/main" xmlns:w14="http://schemas.microsoft.com/office/word/2010/wordml" xmlns:w15="http://schemas.microsoft.com/office/word/2012/wordml" xmlns:w16cex="http://schemas.microsoft.com/office/word/2018/wordml/cex" xmlns:w16cid="http://schemas.microsoft.com/office/word/2016/wordml/cid" xmlns:w16="http://schemas.microsoft.com/office/word/2018/wordml" xmlns:w16du="http://schemas.microsoft.com/office/word/2023/wordml/word16du" xmlns:w16sdtdh="http://schemas.microsoft.com/office/word/2020/wordml/sdtdatahash" xmlns:w16sdtfl="http://schemas.microsoft.com/office/word/2024/wordml/sdtformatlock" xmlns:w16se="http://schemas.microsoft.com/office/word/2015/wordml/symex" xmlns:wpg="http://schemas.microsoft.com/office/word/2010/wordprocessingGroup" xmlns:wpi="http://schemas.microsoft.com/office/word/2010/wordprocessingInk" xmlns:wne="http://schemas.microsoft.com/office/word/2006/wordml" xmlns:wps="http://schemas.microsoft.com/office/word/2010/wordprocessingShape" mc:Ignorable="w14 w15 w16se w16cid w16 w16cex w16sdtdh w16sdtfl w16du wp14">
   <w:endnote w:type="separator" w:id="-1">
     <w:p>
       <w:r>
@@ -15030,7 +14110,7 @@
 </file>
 
 <file path=word/footer1.xml><?xml version="1.0" encoding="utf-8"?>
-<w:ftr xmlns:wpc="http://schemas.microsoft.com/office/word/2010/wordprocessingCanvas" xmlns:cx="http://schemas.microsoft.com/office/drawing/2014/chartex" xmlns:cx1="http://schemas.microsoft.com/office/drawing/2015/9/8/chartex" xmlns:cx2="http://schemas.microsoft.com/office/drawing/2015/10/21/chartex" xmlns:cx3="http://schemas.microsoft.com/office/drawing/2016/5/9/chartex" xmlns:cx4="http://schemas.microsoft.com/office/drawing/2016/5/10/chartex" xmlns:cx5="http://schemas.microsoft.com/office/drawing/2016/5/11/chartex" xmlns:mc="http://schemas.openxmlformats.org/markup-compatibility/2006" xmlns:o="urn:schemas-microsoft-com:office:office" xmlns:r="http://schemas.openxmlformats.org/officeDocument/2006/relationships" xmlns:m="http://schemas.openxmlformats.org/officeDocument/2006/math" xmlns:v="urn:schemas-microsoft-com:vml" xmlns:wp14="http://schemas.microsoft.com/office/word/2010/wordprocessingDrawing" xmlns:wp="http://schemas.openxmlformats.org/drawingml/2006/wordprocessingDrawing" xmlns:w10="urn:schemas-microsoft-com:office:word" xmlns:w="http://schemas.openxmlformats.org/wordprocessingml/2006/main" xmlns:w14="http://schemas.microsoft.com/office/word/2010/wordml" xmlns:w15="http://schemas.microsoft.com/office/word/2012/wordml" xmlns:w16se="http://schemas.microsoft.com/office/word/2015/wordml/symex" xmlns:wpg="http://schemas.microsoft.com/office/word/2010/wordprocessingGroup" xmlns:wpi="http://schemas.microsoft.com/office/word/2010/wordprocessingInk" xmlns:wne="http://schemas.microsoft.com/office/word/2006/wordml" xmlns:wps="http://schemas.microsoft.com/office/word/2010/wordprocessingShape" mc:Ignorable="w14 w15 w16se wp14">
+<w:ftr xmlns:wpc="http://schemas.microsoft.com/office/word/2010/wordprocessingCanvas" xmlns:cx="http://schemas.microsoft.com/office/drawing/2014/chartex" xmlns:cx1="http://schemas.microsoft.com/office/drawing/2015/9/8/chartex" xmlns:cx2="http://schemas.microsoft.com/office/drawing/2015/10/21/chartex" xmlns:cx3="http://schemas.microsoft.com/office/drawing/2016/5/9/chartex" xmlns:cx4="http://schemas.microsoft.com/office/drawing/2016/5/10/chartex" xmlns:cx5="http://schemas.microsoft.com/office/drawing/2016/5/11/chartex" xmlns:cx6="http://schemas.microsoft.com/office/drawing/2016/5/12/chartex" xmlns:cx7="http://schemas.microsoft.com/office/drawing/2016/5/13/chartex" xmlns:cx8="http://schemas.microsoft.com/office/drawing/2016/5/14/chartex" xmlns:mc="http://schemas.openxmlformats.org/markup-compatibility/2006" xmlns:aink="http://schemas.microsoft.com/office/drawing/2016/ink" xmlns:am3d="http://schemas.microsoft.com/office/drawing/2017/model3d" xmlns:o="urn:schemas-microsoft-com:office:office" xmlns:oel="http://schemas.microsoft.com/office/2019/extlst" xmlns:r="http://schemas.openxmlformats.org/officeDocument/2006/relationships" xmlns:m="http://schemas.openxmlformats.org/officeDocument/2006/math" xmlns:v="urn:schemas-microsoft-com:vml" xmlns:wp14="http://schemas.microsoft.com/office/word/2010/wordprocessingDrawing" xmlns:wp="http://schemas.openxmlformats.org/drawingml/2006/wordprocessingDrawing" xmlns:w10="urn:schemas-microsoft-com:office:word" xmlns:w="http://schemas.openxmlformats.org/wordprocessingml/2006/main" xmlns:w14="http://schemas.microsoft.com/office/word/2010/wordml" xmlns:w15="http://schemas.microsoft.com/office/word/2012/wordml" xmlns:w16cex="http://schemas.microsoft.com/office/word/2018/wordml/cex" xmlns:w16cid="http://schemas.microsoft.com/office/word/2016/wordml/cid" xmlns:w16="http://schemas.microsoft.com/office/word/2018/wordml" xmlns:w16du="http://schemas.microsoft.com/office/word/2023/wordml/word16du" xmlns:w16sdtdh="http://schemas.microsoft.com/office/word/2020/wordml/sdtdatahash" xmlns:w16sdtfl="http://schemas.microsoft.com/office/word/2024/wordml/sdtformatlock" xmlns:w16se="http://schemas.microsoft.com/office/word/2015/wordml/symex" xmlns:wpg="http://schemas.microsoft.com/office/word/2010/wordprocessingGroup" xmlns:wpi="http://schemas.microsoft.com/office/word/2010/wordprocessingInk" xmlns:wne="http://schemas.microsoft.com/office/word/2006/wordml" xmlns:wps="http://schemas.microsoft.com/office/word/2010/wordprocessingShape" mc:Ignorable="w14 w15 w16se w16cid w16 w16cex w16sdtdh w16sdtfl w16du wp14">
   <w:p>
     <w:pPr>
       <w:pStyle w:val="Header"/>
@@ -15083,7 +14163,7 @@
 </file>
 
 <file path=word/footnotes.xml><?xml version="1.0" encoding="utf-8"?>
-<w:footnotes xmlns:wpc="http://schemas.microsoft.com/office/word/2010/wordprocessingCanvas" xmlns:cx="http://schemas.microsoft.com/office/drawing/2014/chartex" xmlns:cx1="http://schemas.microsoft.com/office/drawing/2015/9/8/chartex" xmlns:cx2="http://schemas.microsoft.com/office/drawing/2015/10/21/chartex" xmlns:cx3="http://schemas.microsoft.com/office/drawing/2016/5/9/chartex" xmlns:cx4="http://schemas.microsoft.com/office/drawing/2016/5/10/chartex" xmlns:cx5="http://schemas.microsoft.com/office/drawing/2016/5/11/chartex" xmlns:mc="http://schemas.openxmlformats.org/markup-compatibility/2006" xmlns:o="urn:schemas-microsoft-com:office:office" xmlns:r="http://schemas.openxmlformats.org/officeDocument/2006/relationships" xmlns:m="http://schemas.openxmlformats.org/officeDocument/2006/math" xmlns:v="urn:schemas-microsoft-com:vml" xmlns:wp14="http://schemas.microsoft.com/office/word/2010/wordprocessingDrawing" xmlns:wp="http://schemas.openxmlformats.org/drawingml/2006/wordprocessingDrawing" xmlns:w10="urn:schemas-microsoft-com:office:word" xmlns:w="http://schemas.openxmlformats.org/wordprocessingml/2006/main" xmlns:w14="http://schemas.microsoft.com/office/word/2010/wordml" xmlns:w15="http://schemas.microsoft.com/office/word/2012/wordml" xmlns:w16se="http://schemas.microsoft.com/office/word/2015/wordml/symex" xmlns:wpg="http://schemas.microsoft.com/office/word/2010/wordprocessingGroup" xmlns:wpi="http://schemas.microsoft.com/office/word/2010/wordprocessingInk" xmlns:wne="http://schemas.microsoft.com/office/word/2006/wordml" xmlns:wps="http://schemas.microsoft.com/office/word/2010/wordprocessingShape" mc:Ignorable="w14 w15 w16se wp14">
+<w:footnotes xmlns:wpc="http://schemas.microsoft.com/office/word/2010/wordprocessingCanvas" xmlns:cx="http://schemas.microsoft.com/office/drawing/2014/chartex" xmlns:cx1="http://schemas.microsoft.com/office/drawing/2015/9/8/chartex" xmlns:cx2="http://schemas.microsoft.com/office/drawing/2015/10/21/chartex" xmlns:cx3="http://schemas.microsoft.com/office/drawing/2016/5/9/chartex" xmlns:cx4="http://schemas.microsoft.com/office/drawing/2016/5/10/chartex" xmlns:cx5="http://schemas.microsoft.com/office/drawing/2016/5/11/chartex" xmlns:cx6="http://schemas.microsoft.com/office/drawing/2016/5/12/chartex" xmlns:cx7="http://schemas.microsoft.com/office/drawing/2016/5/13/chartex" xmlns:cx8="http://schemas.microsoft.com/office/drawing/2016/5/14/chartex" xmlns:mc="http://schemas.openxmlformats.org/markup-compatibility/2006" xmlns:aink="http://schemas.microsoft.com/office/drawing/2016/ink" xmlns:am3d="http://schemas.microsoft.com/office/drawing/2017/model3d" xmlns:o="urn:schemas-microsoft-com:office:office" xmlns:oel="http://schemas.microsoft.com/office/2019/extlst" xmlns:r="http://schemas.openxmlformats.org/officeDocument/2006/relationships" xmlns:m="http://schemas.openxmlformats.org/officeDocument/2006/math" xmlns:v="urn:schemas-microsoft-com:vml" xmlns:wp14="http://schemas.microsoft.com/office/word/2010/wordprocessingDrawing" xmlns:wp="http://schemas.openxmlformats.org/drawingml/2006/wordprocessingDrawing" xmlns:w10="urn:schemas-microsoft-com:office:word" xmlns:w="http://schemas.openxmlformats.org/wordprocessingml/2006/main" xmlns:w14="http://schemas.microsoft.com/office/word/2010/wordml" xmlns:w15="http://schemas.microsoft.com/office/word/2012/wordml" xmlns:w16cex="http://schemas.microsoft.com/office/word/2018/wordml/cex" xmlns:w16cid="http://schemas.microsoft.com/office/word/2016/wordml/cid" xmlns:w16="http://schemas.microsoft.com/office/word/2018/wordml" xmlns:w16du="http://schemas.microsoft.com/office/word/2023/wordml/word16du" xmlns:w16sdtdh="http://schemas.microsoft.com/office/word/2020/wordml/sdtdatahash" xmlns:w16sdtfl="http://schemas.microsoft.com/office/word/2024/wordml/sdtformatlock" xmlns:w16se="http://schemas.microsoft.com/office/word/2015/wordml/symex" xmlns:wpg="http://schemas.microsoft.com/office/word/2010/wordprocessingGroup" xmlns:wpi="http://schemas.microsoft.com/office/word/2010/wordprocessingInk" xmlns:wne="http://schemas.microsoft.com/office/word/2006/wordml" xmlns:wps="http://schemas.microsoft.com/office/word/2010/wordprocessingShape" mc:Ignorable="w14 w15 w16se w16cid w16 w16cex w16sdtdh w16sdtfl w16du wp14">
   <w:footnote w:type="separator" w:id="-1">
     <w:p>
       <w:r>
@@ -15102,7 +14182,7 @@
 </file>
 
 <file path=word/header1.xml><?xml version="1.0" encoding="utf-8"?>
-<w:hdr xmlns:wpc="http://schemas.microsoft.com/office/word/2010/wordprocessingCanvas" xmlns:cx="http://schemas.microsoft.com/office/drawing/2014/chartex" xmlns:cx1="http://schemas.microsoft.com/office/drawing/2015/9/8/chartex" xmlns:cx2="http://schemas.microsoft.com/office/drawing/2015/10/21/chartex" xmlns:cx3="http://schemas.microsoft.com/office/drawing/2016/5/9/chartex" xmlns:cx4="http://schemas.microsoft.com/office/drawing/2016/5/10/chartex" xmlns:cx5="http://schemas.microsoft.com/office/drawing/2016/5/11/chartex" xmlns:mc="http://schemas.openxmlformats.org/markup-compatibility/2006" xmlns:o="urn:schemas-microsoft-com:office:office" xmlns:r="http://schemas.openxmlformats.org/officeDocument/2006/relationships" xmlns:m="http://schemas.openxmlformats.org/officeDocument/2006/math" xmlns:v="urn:schemas-microsoft-com:vml" xmlns:wp14="http://schemas.microsoft.com/office/word/2010/wordprocessingDrawing" xmlns:wp="http://schemas.openxmlformats.org/drawingml/2006/wordprocessingDrawing" xmlns:w10="urn:schemas-microsoft-com:office:word" xmlns:w="http://schemas.openxmlformats.org/wordprocessingml/2006/main" xmlns:w14="http://schemas.microsoft.com/office/word/2010/wordml" xmlns:w15="http://schemas.microsoft.com/office/word/2012/wordml" xmlns:w16se="http://schemas.microsoft.com/office/word/2015/wordml/symex" xmlns:wpg="http://schemas.microsoft.com/office/word/2010/wordprocessingGroup" xmlns:wpi="http://schemas.microsoft.com/office/word/2010/wordprocessingInk" xmlns:wne="http://schemas.microsoft.com/office/word/2006/wordml" xmlns:wps="http://schemas.microsoft.com/office/word/2010/wordprocessingShape" mc:Ignorable="w14 w15 w16se wp14">
+<w:hdr xmlns:wpc="http://schemas.microsoft.com/office/word/2010/wordprocessingCanvas" xmlns:cx="http://schemas.microsoft.com/office/drawing/2014/chartex" xmlns:cx1="http://schemas.microsoft.com/office/drawing/2015/9/8/chartex" xmlns:cx2="http://schemas.microsoft.com/office/drawing/2015/10/21/chartex" xmlns:cx3="http://schemas.microsoft.com/office/drawing/2016/5/9/chartex" xmlns:cx4="http://schemas.microsoft.com/office/drawing/2016/5/10/chartex" xmlns:cx5="http://schemas.microsoft.com/office/drawing/2016/5/11/chartex" xmlns:cx6="http://schemas.microsoft.com/office/drawing/2016/5/12/chartex" xmlns:cx7="http://schemas.microsoft.com/office/drawing/2016/5/13/chartex" xmlns:cx8="http://schemas.microsoft.com/office/drawing/2016/5/14/chartex" xmlns:mc="http://schemas.openxmlformats.org/markup-compatibility/2006" xmlns:aink="http://schemas.microsoft.com/office/drawing/2016/ink" xmlns:am3d="http://schemas.microsoft.com/office/drawing/2017/model3d" xmlns:o="urn:schemas-microsoft-com:office:office" xmlns:oel="http://schemas.microsoft.com/office/2019/extlst" xmlns:r="http://schemas.openxmlformats.org/officeDocument/2006/relationships" xmlns:m="http://schemas.openxmlformats.org/officeDocument/2006/math" xmlns:v="urn:schemas-microsoft-com:vml" xmlns:wp14="http://schemas.microsoft.com/office/word/2010/wordprocessingDrawing" xmlns:wp="http://schemas.openxmlformats.org/drawingml/2006/wordprocessingDrawing" xmlns:w10="urn:schemas-microsoft-com:office:word" xmlns:w="http://schemas.openxmlformats.org/wordprocessingml/2006/main" xmlns:w14="http://schemas.microsoft.com/office/word/2010/wordml" xmlns:w15="http://schemas.microsoft.com/office/word/2012/wordml" xmlns:w16cex="http://schemas.microsoft.com/office/word/2018/wordml/cex" xmlns:w16cid="http://schemas.microsoft.com/office/word/2016/wordml/cid" xmlns:w16="http://schemas.microsoft.com/office/word/2018/wordml" xmlns:w16du="http://schemas.microsoft.com/office/word/2023/wordml/word16du" xmlns:w16sdtdh="http://schemas.microsoft.com/office/word/2020/wordml/sdtdatahash" xmlns:w16sdtfl="http://schemas.microsoft.com/office/word/2024/wordml/sdtformatlock" xmlns:w16se="http://schemas.microsoft.com/office/word/2015/wordml/symex" xmlns:wpg="http://schemas.microsoft.com/office/word/2010/wordprocessingGroup" xmlns:wpi="http://schemas.microsoft.com/office/word/2010/wordprocessingInk" xmlns:wne="http://schemas.microsoft.com/office/word/2006/wordml" xmlns:wps="http://schemas.microsoft.com/office/word/2010/wordprocessingShape" mc:Ignorable="w14 w15 w16se w16cid w16 w16cex w16sdtdh w16sdtfl w16du wp14">
   <w:p>
     <w:pPr>
       <w:pStyle w:val="Header"/>
@@ -15173,7 +14253,7 @@
 </file>
 
 <file path=word/numbering.xml><?xml version="1.0" encoding="utf-8"?>
-<w:numbering xmlns:wpc="http://schemas.microsoft.com/office/word/2010/wordprocessingCanvas" xmlns:cx="http://schemas.microsoft.com/office/drawing/2014/chartex" xmlns:cx1="http://schemas.microsoft.com/office/drawing/2015/9/8/chartex" xmlns:cx2="http://schemas.microsoft.com/office/drawing/2015/10/21/chartex" xmlns:cx3="http://schemas.microsoft.com/office/drawing/2016/5/9/chartex" xmlns:cx4="http://schemas.microsoft.com/office/drawing/2016/5/10/chartex" xmlns:cx5="http://schemas.microsoft.com/office/drawing/2016/5/11/chartex" xmlns:mc="http://schemas.openxmlformats.org/markup-compatibility/2006" xmlns:o="urn:schemas-microsoft-com:office:office" xmlns:r="http://schemas.openxmlformats.org/officeDocument/2006/relationships" xmlns:m="http://schemas.openxmlformats.org/officeDocument/2006/math" xmlns:v="urn:schemas-microsoft-com:vml" xmlns:wp14="http://schemas.microsoft.com/office/word/2010/wordprocessingDrawing" xmlns:wp="http://schemas.openxmlformats.org/drawingml/2006/wordprocessingDrawing" xmlns:w10="urn:schemas-microsoft-com:office:word" xmlns:w="http://schemas.openxmlformats.org/wordprocessingml/2006/main" xmlns:w14="http://schemas.microsoft.com/office/word/2010/wordml" xmlns:w15="http://schemas.microsoft.com/office/word/2012/wordml" xmlns:w16se="http://schemas.microsoft.com/office/word/2015/wordml/symex" xmlns:wpg="http://schemas.microsoft.com/office/word/2010/wordprocessingGroup" xmlns:wpi="http://schemas.microsoft.com/office/word/2010/wordprocessingInk" xmlns:wne="http://schemas.microsoft.com/office/word/2006/wordml" xmlns:wps="http://schemas.microsoft.com/office/word/2010/wordprocessingShape" mc:Ignorable="w14 w15 w16se wp14">
+<w:numbering xmlns:wpc="http://schemas.microsoft.com/office/word/2010/wordprocessingCanvas" xmlns:cx="http://schemas.microsoft.com/office/drawing/2014/chartex" xmlns:cx1="http://schemas.microsoft.com/office/drawing/2015/9/8/chartex" xmlns:cx2="http://schemas.microsoft.com/office/drawing/2015/10/21/chartex" xmlns:cx3="http://schemas.microsoft.com/office/drawing/2016/5/9/chartex" xmlns:cx4="http://schemas.microsoft.com/office/drawing/2016/5/10/chartex" xmlns:cx5="http://schemas.microsoft.com/office/drawing/2016/5/11/chartex" xmlns:cx6="http://schemas.microsoft.com/office/drawing/2016/5/12/chartex" xmlns:cx7="http://schemas.microsoft.com/office/drawing/2016/5/13/chartex" xmlns:cx8="http://schemas.microsoft.com/office/drawing/2016/5/14/chartex" xmlns:mc="http://schemas.openxmlformats.org/markup-compatibility/2006" xmlns:aink="http://schemas.microsoft.com/office/drawing/2016/ink" xmlns:am3d="http://schemas.microsoft.com/office/drawing/2017/model3d" xmlns:o="urn:schemas-microsoft-com:office:office" xmlns:oel="http://schemas.microsoft.com/office/2019/extlst" xmlns:r="http://schemas.openxmlformats.org/officeDocument/2006/relationships" xmlns:m="http://schemas.openxmlformats.org/officeDocument/2006/math" xmlns:v="urn:schemas-microsoft-com:vml" xmlns:wp14="http://schemas.microsoft.com/office/word/2010/wordprocessingDrawing" xmlns:wp="http://schemas.openxmlformats.org/drawingml/2006/wordprocessingDrawing" xmlns:w10="urn:schemas-microsoft-com:office:word" xmlns:w="http://schemas.openxmlformats.org/wordprocessingml/2006/main" xmlns:w14="http://schemas.microsoft.com/office/word/2010/wordml" xmlns:w15="http://schemas.microsoft.com/office/word/2012/wordml" xmlns:w16cex="http://schemas.microsoft.com/office/word/2018/wordml/cex" xmlns:w16cid="http://schemas.microsoft.com/office/word/2016/wordml/cid" xmlns:w16="http://schemas.microsoft.com/office/word/2018/wordml" xmlns:w16du="http://schemas.microsoft.com/office/word/2023/wordml/word16du" xmlns:w16sdtdh="http://schemas.microsoft.com/office/word/2020/wordml/sdtdatahash" xmlns:w16sdtfl="http://schemas.microsoft.com/office/word/2024/wordml/sdtformatlock" xmlns:w16se="http://schemas.microsoft.com/office/word/2015/wordml/symex" xmlns:wpg="http://schemas.microsoft.com/office/word/2010/wordprocessingGroup" xmlns:wpi="http://schemas.microsoft.com/office/word/2010/wordprocessingInk" xmlns:wne="http://schemas.microsoft.com/office/word/2006/wordml" xmlns:wps="http://schemas.microsoft.com/office/word/2010/wordprocessingShape" mc:Ignorable="w14 w15 w16se w16cid w16 w16cex w16sdtdh w16sdtfl w16du wp14">
   <w:abstractNum w:abstractNumId="0" w15:restartNumberingAfterBreak="0">
     <w:nsid w:val="12B25C57"/>
     <w:multiLevelType w:val="hybridMultilevel"/>
@@ -16481,50 +15561,50 @@
       </w:pPr>
     </w:lvl>
   </w:abstractNum>
-  <w:num w:numId="1">
+  <w:num w:numId="1" w16cid:durableId="1718432576">
     <w:abstractNumId w:val="12"/>
   </w:num>
-  <w:num w:numId="2">
+  <w:num w:numId="2" w16cid:durableId="2108382494">
     <w:abstractNumId w:val="0"/>
   </w:num>
-  <w:num w:numId="3">
+  <w:num w:numId="3" w16cid:durableId="1532454159">
     <w:abstractNumId w:val="9"/>
   </w:num>
-  <w:num w:numId="4">
+  <w:num w:numId="4" w16cid:durableId="1510217552">
     <w:abstractNumId w:val="3"/>
   </w:num>
-  <w:num w:numId="5">
+  <w:num w:numId="5" w16cid:durableId="2072341905">
     <w:abstractNumId w:val="8"/>
   </w:num>
-  <w:num w:numId="6">
+  <w:num w:numId="6" w16cid:durableId="808135278">
     <w:abstractNumId w:val="2"/>
   </w:num>
-  <w:num w:numId="7">
+  <w:num w:numId="7" w16cid:durableId="2074814725">
     <w:abstractNumId w:val="10"/>
   </w:num>
-  <w:num w:numId="8">
+  <w:num w:numId="8" w16cid:durableId="1601991284">
     <w:abstractNumId w:val="4"/>
   </w:num>
-  <w:num w:numId="9">
+  <w:num w:numId="9" w16cid:durableId="2063207352">
     <w:abstractNumId w:val="6"/>
   </w:num>
-  <w:num w:numId="10">
+  <w:num w:numId="10" w16cid:durableId="2069375505">
     <w:abstractNumId w:val="11"/>
   </w:num>
-  <w:num w:numId="11">
+  <w:num w:numId="11" w16cid:durableId="1614242208">
     <w:abstractNumId w:val="7"/>
   </w:num>
-  <w:num w:numId="12">
+  <w:num w:numId="12" w16cid:durableId="1964531748">
     <w:abstractNumId w:val="5"/>
   </w:num>
-  <w:num w:numId="13">
+  <w:num w:numId="13" w16cid:durableId="1227036253">
     <w:abstractNumId w:val="1"/>
   </w:num>
 </w:numbering>
 </file>
 
 <file path=word/styles.xml><?xml version="1.0" encoding="utf-8"?>
-<w:styles xmlns:mc="http://schemas.openxmlformats.org/markup-compatibility/2006" xmlns:r="http://schemas.openxmlformats.org/officeDocument/2006/relationships" xmlns:w="http://schemas.openxmlformats.org/wordprocessingml/2006/main" xmlns:w14="http://schemas.microsoft.com/office/word/2010/wordml" xmlns:w15="http://schemas.microsoft.com/office/word/2012/wordml" xmlns:w16se="http://schemas.microsoft.com/office/word/2015/wordml/symex" mc:Ignorable="w14 w15 w16se">
+<w:styles xmlns:mc="http://schemas.openxmlformats.org/markup-compatibility/2006" xmlns:r="http://schemas.openxmlformats.org/officeDocument/2006/relationships" xmlns:w="http://schemas.openxmlformats.org/wordprocessingml/2006/main" xmlns:w14="http://schemas.microsoft.com/office/word/2010/wordml" xmlns:w15="http://schemas.microsoft.com/office/word/2012/wordml" xmlns:w16cex="http://schemas.microsoft.com/office/word/2018/wordml/cex" xmlns:w16cid="http://schemas.microsoft.com/office/word/2016/wordml/cid" xmlns:w16="http://schemas.microsoft.com/office/word/2018/wordml" xmlns:w16du="http://schemas.microsoft.com/office/word/2023/wordml/word16du" xmlns:w16sdtdh="http://schemas.microsoft.com/office/word/2020/wordml/sdtdatahash" xmlns:w16sdtfl="http://schemas.microsoft.com/office/word/2024/wordml/sdtformatlock" xmlns:w16se="http://schemas.microsoft.com/office/word/2015/wordml/symex" mc:Ignorable="w14 w15 w16se w16cid w16 w16cex w16sdtdh w16sdtfl w16du">
   <w:docDefaults>
     <w:rPrDefault>
       <w:rPr>
@@ -16537,7 +15617,7 @@
     </w:rPrDefault>
     <w:pPrDefault/>
   </w:docDefaults>
-  <w:latentStyles w:defLockedState="0" w:defUIPriority="99" w:defSemiHidden="0" w:defUnhideWhenUsed="0" w:defQFormat="0" w:count="374">
+  <w:latentStyles w:defLockedState="0" w:defUIPriority="99" w:defSemiHidden="0" w:defUnhideWhenUsed="0" w:defQFormat="0" w:count="376">
     <w:lsdException w:name="Normal" w:uiPriority="0" w:qFormat="1"/>
     <w:lsdException w:name="heading 1" w:uiPriority="9" w:qFormat="1"/>
     <w:lsdException w:name="heading 2" w:semiHidden="1" w:uiPriority="9" w:unhideWhenUsed="1" w:qFormat="1"/>
@@ -16643,6 +15723,7 @@
     <w:lsdException w:name="HTML Sample" w:semiHidden="1" w:unhideWhenUsed="1"/>
     <w:lsdException w:name="HTML Typewriter" w:semiHidden="1" w:unhideWhenUsed="1"/>
     <w:lsdException w:name="HTML Variable" w:semiHidden="1" w:unhideWhenUsed="1"/>
+    <w:lsdException w:name="Normal Table" w:semiHidden="1" w:unhideWhenUsed="1"/>
     <w:lsdException w:name="annotation subject" w:semiHidden="1" w:unhideWhenUsed="1"/>
     <w:lsdException w:name="No List" w:semiHidden="1" w:unhideWhenUsed="1"/>
     <w:lsdException w:name="Outline List 1" w:semiHidden="1" w:unhideWhenUsed="1"/>
@@ -16687,6 +15768,7 @@
     <w:lsdException w:name="Table Professional" w:semiHidden="1" w:unhideWhenUsed="1"/>
     <w:lsdException w:name="Table Subtle 1" w:semiHidden="1" w:unhideWhenUsed="1"/>
     <w:lsdException w:name="Table Subtle 2" w:semiHidden="1" w:unhideWhenUsed="1"/>
+    <w:lsdException w:name="Table Web 1" w:semiHidden="1" w:unhideWhenUsed="1"/>
     <w:lsdException w:name="Table Web 2" w:semiHidden="1" w:unhideWhenUsed="1"/>
     <w:lsdException w:name="Table Web 3" w:semiHidden="1" w:unhideWhenUsed="1"/>
     <w:lsdException w:name="Balloon Text" w:semiHidden="1" w:unhideWhenUsed="1"/>
@@ -16910,6 +15992,8 @@
     <w:lsdException w:name="Mention" w:semiHidden="1" w:unhideWhenUsed="1"/>
     <w:lsdException w:name="Smart Hyperlink" w:semiHidden="1" w:unhideWhenUsed="1"/>
     <w:lsdException w:name="Hashtag" w:semiHidden="1" w:unhideWhenUsed="1"/>
+    <w:lsdException w:name="Unresolved Mention" w:semiHidden="1" w:unhideWhenUsed="1"/>
+    <w:lsdException w:name="Smart Link" w:semiHidden="1" w:unhideWhenUsed="1"/>
   </w:latentStyles>
   <w:style w:type="paragraph" w:default="1" w:styleId="Normal">
     <w:name w:val="Normal"/>

</xml_diff>